<commit_message>
CA2 Word report: black-and-white figures, HALAH workflow figure, table fixes
- Redraw Figures 1, 2, 3, 5-12 in black and white (300 dpi), content unchanged;
  Figure 3 as three readable columns; Australian spelling inside Figures 2 and 6
- Add Figure 18 (HALAH prototype workflow) to Section 7.10
- Tables: grey repeating header rows, rows kept on one page, Table 2
  citations in ascending order, Table 9 column widths
- Standalone PNGs in review/word/figures_bw; change log updated

Co-Authored-By: Claude Opus 5.5 <noreply@anthropic.com>
Claude-Session: https://claude.ai/code/session_017h1Gwx95j2svhJWPEddHRu
</commit_message>
<xml_diff>
--- a/review/word/Yasir_CA2_Report_CLEAN.docx
+++ b/review/word/Yasir_CA2_Report_CLEAN.docx
@@ -486,10 +486,17 @@
       </w:tblGrid>
       <w:tr>
         <w:trPr>
+          <w:cantSplit/>
           <w:tblHeader w:val="on"/>
         </w:trPr>
         <w:tc>
-          <w:tcPr/>
+          <w:tcPr>
+            <w:tcBorders>
+              <w:bottom w:val="single" w:sz="8" w:space="0" w:color="000000"/>
+            </w:tcBorders>
+            <w:shd w:val="clear" w:color="auto" w:fill="E7E6E6"/>
+            <w:vAlign w:val="center"/>
+          </w:tcPr>
           <w:p>
             <w:pPr>
               <w:pStyle w:val="Compact"/>
@@ -505,7 +512,13 @@
           </w:p>
         </w:tc>
         <w:tc>
-          <w:tcPr/>
+          <w:tcPr>
+            <w:tcBorders>
+              <w:bottom w:val="single" w:sz="8" w:space="0" w:color="000000"/>
+            </w:tcBorders>
+            <w:shd w:val="clear" w:color="auto" w:fill="E7E6E6"/>
+            <w:vAlign w:val="center"/>
+          </w:tcPr>
           <w:p>
             <w:pPr>
               <w:pStyle w:val="Compact"/>
@@ -521,7 +534,13 @@
           </w:p>
         </w:tc>
         <w:tc>
-          <w:tcPr/>
+          <w:tcPr>
+            <w:tcBorders>
+              <w:bottom w:val="single" w:sz="8" w:space="0" w:color="000000"/>
+            </w:tcBorders>
+            <w:shd w:val="clear" w:color="auto" w:fill="E7E6E6"/>
+            <w:vAlign w:val="center"/>
+          </w:tcPr>
           <w:p>
             <w:pPr>
               <w:pStyle w:val="Compact"/>
@@ -538,6 +557,9 @@
         </w:tc>
       </w:tr>
       <w:tr>
+        <w:trPr>
+          <w:cantSplit/>
+        </w:trPr>
         <w:tc>
           <w:tcPr/>
           <w:p>
@@ -576,6 +598,9 @@
         </w:tc>
       </w:tr>
       <w:tr>
+        <w:trPr>
+          <w:cantSplit/>
+        </w:trPr>
         <w:tc>
           <w:tcPr/>
           <w:p>
@@ -614,6 +639,9 @@
         </w:tc>
       </w:tr>
       <w:tr>
+        <w:trPr>
+          <w:cantSplit/>
+        </w:trPr>
         <w:tc>
           <w:tcPr/>
           <w:p>
@@ -652,6 +680,9 @@
         </w:tc>
       </w:tr>
       <w:tr>
+        <w:trPr>
+          <w:cantSplit/>
+        </w:trPr>
         <w:tc>
           <w:tcPr/>
           <w:p>
@@ -690,6 +721,9 @@
         </w:tc>
       </w:tr>
       <w:tr>
+        <w:trPr>
+          <w:cantSplit/>
+        </w:trPr>
         <w:tc>
           <w:tcPr/>
           <w:p>
@@ -728,6 +762,9 @@
         </w:tc>
       </w:tr>
       <w:tr>
+        <w:trPr>
+          <w:cantSplit/>
+        </w:trPr>
         <w:tc>
           <w:tcPr/>
           <w:p>
@@ -975,14 +1012,14 @@
       <w:r>
         <w:drawing>
           <wp:inline>
-            <wp:extent cx="5465445" cy="3370858"/>
+            <wp:extent cx="5753100" cy="2741910"/>
             <wp:effectExtent b="0" l="0" r="0" t="0"/>
             <wp:docPr descr="Figure 1: SLR Search String Definition" title="" id="17" name="Picture"/>
             <a:graphic>
               <a:graphicData uri="http://schemas.openxmlformats.org/drawingml/2006/picture">
                 <pic:pic>
                   <pic:nvPicPr>
-                    <pic:cNvPr descr="media/fig01.png" id="18" name="Picture"/>
+                    <pic:cNvPr descr="media_bw/fig01.png" id="18" name="Picture"/>
                     <pic:cNvPicPr>
                       <a:picLocks noChangeArrowheads="1" noChangeAspect="1"/>
                     </pic:cNvPicPr>
@@ -996,7 +1033,7 @@
                   <pic:spPr bwMode="auto">
                     <a:xfrm>
                       <a:off x="0" y="0"/>
-                      <a:ext cx="5465445" cy="3370858"/>
+                      <a:ext cx="5753100" cy="2741910"/>
                     </a:xfrm>
                     <a:prstGeom prst="rect">
                       <a:avLst/>
@@ -1314,14 +1351,14 @@
       <w:r>
         <w:drawing>
           <wp:inline>
-            <wp:extent cx="5465445" cy="2819058"/>
+            <wp:extent cx="5753100" cy="3499976"/>
             <wp:effectExtent b="0" l="0" r="0" t="0"/>
             <wp:docPr descr="Figure 2: PRISMA Study Selection Summary" title="" id="23" name="Picture"/>
             <a:graphic>
               <a:graphicData uri="http://schemas.openxmlformats.org/drawingml/2006/picture">
                 <pic:pic>
                   <pic:nvPicPr>
-                    <pic:cNvPr descr="media/fig02.png" id="24" name="Picture"/>
+                    <pic:cNvPr descr="media_bw/fig02.png" id="24" name="Picture"/>
                     <pic:cNvPicPr>
                       <a:picLocks noChangeArrowheads="1" noChangeAspect="1"/>
                     </pic:cNvPicPr>
@@ -1335,7 +1372,7 @@
                   <pic:spPr bwMode="auto">
                     <a:xfrm>
                       <a:off x="0" y="0"/>
-                      <a:ext cx="5465445" cy="2819058"/>
+                      <a:ext cx="5753100" cy="3499976"/>
                     </a:xfrm>
                     <a:prstGeom prst="rect">
                       <a:avLst/>
@@ -2489,10 +2526,17 @@
       </w:tblGrid>
       <w:tr>
         <w:trPr>
+          <w:cantSplit/>
           <w:tblHeader w:val="on"/>
         </w:trPr>
         <w:tc>
-          <w:tcPr/>
+          <w:tcPr>
+            <w:tcBorders>
+              <w:bottom w:val="single" w:sz="8" w:space="0" w:color="000000"/>
+            </w:tcBorders>
+            <w:shd w:val="clear" w:color="auto" w:fill="E7E6E6"/>
+            <w:vAlign w:val="center"/>
+          </w:tcPr>
           <w:p>
             <w:pPr>
               <w:pStyle w:val="Compact"/>
@@ -2508,7 +2552,13 @@
           </w:p>
         </w:tc>
         <w:tc>
-          <w:tcPr/>
+          <w:tcPr>
+            <w:tcBorders>
+              <w:bottom w:val="single" w:sz="8" w:space="0" w:color="000000"/>
+            </w:tcBorders>
+            <w:shd w:val="clear" w:color="auto" w:fill="E7E6E6"/>
+            <w:vAlign w:val="center"/>
+          </w:tcPr>
           <w:p>
             <w:pPr>
               <w:pStyle w:val="Compact"/>
@@ -2524,7 +2574,13 @@
           </w:p>
         </w:tc>
         <w:tc>
-          <w:tcPr/>
+          <w:tcPr>
+            <w:tcBorders>
+              <w:bottom w:val="single" w:sz="8" w:space="0" w:color="000000"/>
+            </w:tcBorders>
+            <w:shd w:val="clear" w:color="auto" w:fill="E7E6E6"/>
+            <w:vAlign w:val="center"/>
+          </w:tcPr>
           <w:p>
             <w:pPr>
               <w:pStyle w:val="Compact"/>
@@ -2540,7 +2596,13 @@
           </w:p>
         </w:tc>
         <w:tc>
-          <w:tcPr/>
+          <w:tcPr>
+            <w:tcBorders>
+              <w:bottom w:val="single" w:sz="8" w:space="0" w:color="000000"/>
+            </w:tcBorders>
+            <w:shd w:val="clear" w:color="auto" w:fill="E7E6E6"/>
+            <w:vAlign w:val="center"/>
+          </w:tcPr>
           <w:p>
             <w:pPr>
               <w:pStyle w:val="Compact"/>
@@ -2557,6 +2619,9 @@
         </w:tc>
       </w:tr>
       <w:tr>
+        <w:trPr>
+          <w:cantSplit/>
+        </w:trPr>
         <w:tc>
           <w:tcPr/>
           <w:p>
@@ -2601,12 +2666,15 @@
               <w:jc w:val="left"/>
             </w:pPr>
             <w:r>
-              <w:t xml:space="preserve">[31, 22, 14, 24, 12, 13, 10]</w:t>
+              <w:t xml:space="preserve">[10, 12, 13, 14, 22, 24, 31]</w:t>
             </w:r>
           </w:p>
         </w:tc>
       </w:tr>
       <w:tr>
+        <w:trPr>
+          <w:cantSplit/>
+        </w:trPr>
         <w:tc>
           <w:tcPr/>
           <w:p>
@@ -2651,12 +2719,15 @@
               <w:jc w:val="left"/>
             </w:pPr>
             <w:r>
-              <w:t xml:space="preserve">[1, 2, 7, 3, 30, 26, 8, 29]</w:t>
+              <w:t xml:space="preserve">[1, 2, 3, 7, 8, 26, 29, 30]</w:t>
             </w:r>
           </w:p>
         </w:tc>
       </w:tr>
       <w:tr>
+        <w:trPr>
+          <w:cantSplit/>
+        </w:trPr>
         <w:tc>
           <w:tcPr/>
           <w:p>
@@ -2701,12 +2772,15 @@
               <w:jc w:val="left"/>
             </w:pPr>
             <w:r>
-              <w:t xml:space="preserve">[20, 33, 4, 16, 27, 5]</w:t>
+              <w:t xml:space="preserve">[4, 5, 16, 20, 27, 33]</w:t>
             </w:r>
           </w:p>
         </w:tc>
       </w:tr>
       <w:tr>
+        <w:trPr>
+          <w:cantSplit/>
+        </w:trPr>
         <w:tc>
           <w:tcPr/>
           <w:p>
@@ -2751,12 +2825,15 @@
               <w:jc w:val="left"/>
             </w:pPr>
             <w:r>
-              <w:t xml:space="preserve">[19, 4, 21, 9]</w:t>
+              <w:t xml:space="preserve">[4, 9, 19, 21]</w:t>
             </w:r>
           </w:p>
         </w:tc>
       </w:tr>
       <w:tr>
+        <w:trPr>
+          <w:cantSplit/>
+        </w:trPr>
         <w:tc>
           <w:tcPr/>
           <w:p>
@@ -2801,12 +2878,15 @@
               <w:jc w:val="left"/>
             </w:pPr>
             <w:r>
-              <w:t xml:space="preserve">[32, 11, 28, 25]</w:t>
+              <w:t xml:space="preserve">[11, 25, 28, 32]</w:t>
             </w:r>
           </w:p>
         </w:tc>
       </w:tr>
       <w:tr>
+        <w:trPr>
+          <w:cantSplit/>
+        </w:trPr>
         <w:tc>
           <w:tcPr/>
           <w:p>
@@ -2851,12 +2931,15 @@
               <w:jc w:val="left"/>
             </w:pPr>
             <w:r>
-              <w:t xml:space="preserve">[23, 17, 18]</w:t>
+              <w:t xml:space="preserve">[17, 18, 23]</w:t>
             </w:r>
           </w:p>
         </w:tc>
       </w:tr>
       <w:tr>
+        <w:trPr>
+          <w:cantSplit/>
+        </w:trPr>
         <w:tc>
           <w:tcPr/>
           <w:p>
@@ -7834,10 +7917,17 @@
       </w:tblGrid>
       <w:tr>
         <w:trPr>
+          <w:cantSplit/>
           <w:tblHeader w:val="on"/>
         </w:trPr>
         <w:tc>
-          <w:tcPr/>
+          <w:tcPr>
+            <w:tcBorders>
+              <w:bottom w:val="single" w:sz="8" w:space="0" w:color="000000"/>
+            </w:tcBorders>
+            <w:shd w:val="clear" w:color="auto" w:fill="E7E6E6"/>
+            <w:vAlign w:val="center"/>
+          </w:tcPr>
           <w:p>
             <w:pPr>
               <w:pStyle w:val="Compact"/>
@@ -7853,7 +7943,13 @@
           </w:p>
         </w:tc>
         <w:tc>
-          <w:tcPr/>
+          <w:tcPr>
+            <w:tcBorders>
+              <w:bottom w:val="single" w:sz="8" w:space="0" w:color="000000"/>
+            </w:tcBorders>
+            <w:shd w:val="clear" w:color="auto" w:fill="E7E6E6"/>
+            <w:vAlign w:val="center"/>
+          </w:tcPr>
           <w:p>
             <w:pPr>
               <w:pStyle w:val="Compact"/>
@@ -7869,7 +7965,13 @@
           </w:p>
         </w:tc>
         <w:tc>
-          <w:tcPr/>
+          <w:tcPr>
+            <w:tcBorders>
+              <w:bottom w:val="single" w:sz="8" w:space="0" w:color="000000"/>
+            </w:tcBorders>
+            <w:shd w:val="clear" w:color="auto" w:fill="E7E6E6"/>
+            <w:vAlign w:val="center"/>
+          </w:tcPr>
           <w:p>
             <w:pPr>
               <w:pStyle w:val="Compact"/>
@@ -7885,7 +7987,13 @@
           </w:p>
         </w:tc>
         <w:tc>
-          <w:tcPr/>
+          <w:tcPr>
+            <w:tcBorders>
+              <w:bottom w:val="single" w:sz="8" w:space="0" w:color="000000"/>
+            </w:tcBorders>
+            <w:shd w:val="clear" w:color="auto" w:fill="E7E6E6"/>
+            <w:vAlign w:val="center"/>
+          </w:tcPr>
           <w:p>
             <w:pPr>
               <w:pStyle w:val="Compact"/>
@@ -7902,6 +8010,9 @@
         </w:tc>
       </w:tr>
       <w:tr>
+        <w:trPr>
+          <w:cantSplit/>
+        </w:trPr>
         <w:tc>
           <w:tcPr/>
           <w:p>
@@ -7966,6 +8077,9 @@
         </w:tc>
       </w:tr>
       <w:tr>
+        <w:trPr>
+          <w:cantSplit/>
+        </w:trPr>
         <w:tc>
           <w:tcPr/>
           <w:p>
@@ -8030,6 +8144,9 @@
         </w:tc>
       </w:tr>
       <w:tr>
+        <w:trPr>
+          <w:cantSplit/>
+        </w:trPr>
         <w:tc>
           <w:tcPr/>
           <w:p>
@@ -8119,10 +8236,17 @@
       </w:tblGrid>
       <w:tr>
         <w:trPr>
+          <w:cantSplit/>
           <w:tblHeader w:val="on"/>
         </w:trPr>
         <w:tc>
-          <w:tcPr/>
+          <w:tcPr>
+            <w:tcBorders>
+              <w:bottom w:val="single" w:sz="8" w:space="0" w:color="000000"/>
+            </w:tcBorders>
+            <w:shd w:val="clear" w:color="auto" w:fill="E7E6E6"/>
+            <w:vAlign w:val="center"/>
+          </w:tcPr>
           <w:p>
             <w:pPr>
               <w:pStyle w:val="Compact"/>
@@ -8138,7 +8262,13 @@
           </w:p>
         </w:tc>
         <w:tc>
-          <w:tcPr/>
+          <w:tcPr>
+            <w:tcBorders>
+              <w:bottom w:val="single" w:sz="8" w:space="0" w:color="000000"/>
+            </w:tcBorders>
+            <w:shd w:val="clear" w:color="auto" w:fill="E7E6E6"/>
+            <w:vAlign w:val="center"/>
+          </w:tcPr>
           <w:p>
             <w:pPr>
               <w:pStyle w:val="Compact"/>
@@ -8154,7 +8284,13 @@
           </w:p>
         </w:tc>
         <w:tc>
-          <w:tcPr/>
+          <w:tcPr>
+            <w:tcBorders>
+              <w:bottom w:val="single" w:sz="8" w:space="0" w:color="000000"/>
+            </w:tcBorders>
+            <w:shd w:val="clear" w:color="auto" w:fill="E7E6E6"/>
+            <w:vAlign w:val="center"/>
+          </w:tcPr>
           <w:p>
             <w:pPr>
               <w:pStyle w:val="Compact"/>
@@ -8170,7 +8306,13 @@
           </w:p>
         </w:tc>
         <w:tc>
-          <w:tcPr/>
+          <w:tcPr>
+            <w:tcBorders>
+              <w:bottom w:val="single" w:sz="8" w:space="0" w:color="000000"/>
+            </w:tcBorders>
+            <w:shd w:val="clear" w:color="auto" w:fill="E7E6E6"/>
+            <w:vAlign w:val="center"/>
+          </w:tcPr>
           <w:p>
             <w:pPr>
               <w:pStyle w:val="Compact"/>
@@ -8187,6 +8329,9 @@
         </w:tc>
       </w:tr>
       <w:tr>
+        <w:trPr>
+          <w:cantSplit/>
+        </w:trPr>
         <w:tc>
           <w:tcPr/>
           <w:p>
@@ -8251,6 +8396,9 @@
         </w:tc>
       </w:tr>
       <w:tr>
+        <w:trPr>
+          <w:cantSplit/>
+        </w:trPr>
         <w:tc>
           <w:tcPr/>
           <w:p>
@@ -8315,6 +8463,9 @@
         </w:tc>
       </w:tr>
       <w:tr>
+        <w:trPr>
+          <w:cantSplit/>
+        </w:trPr>
         <w:tc>
           <w:tcPr/>
           <w:p>
@@ -8825,14 +8976,14 @@
       <w:r>
         <w:drawing>
           <wp:inline>
-            <wp:extent cx="5465445" cy="3378365"/>
+            <wp:extent cx="5753100" cy="5261416"/>
             <wp:effectExtent b="0" l="0" r="0" t="0"/>
             <wp:docPr descr="Figure 3: Layered MVC Architecture and Component Decomposition of the HALAH Framework" title="" id="59" name="Picture"/>
             <a:graphic>
               <a:graphicData uri="http://schemas.openxmlformats.org/drawingml/2006/picture">
                 <pic:pic>
                   <pic:nvPicPr>
-                    <pic:cNvPr descr="media/fig03.png" id="60" name="Picture"/>
+                    <pic:cNvPr descr="media_bw/fig03.png" id="60" name="Picture"/>
                     <pic:cNvPicPr>
                       <a:picLocks noChangeArrowheads="1" noChangeAspect="1"/>
                     </pic:cNvPicPr>
@@ -8846,7 +8997,7 @@
                   <pic:spPr bwMode="auto">
                     <a:xfrm>
                       <a:off x="0" y="0"/>
-                      <a:ext cx="5465445" cy="3378365"/>
+                      <a:ext cx="5753100" cy="5261416"/>
                     </a:xfrm>
                     <a:prstGeom prst="rect">
                       <a:avLst/>
@@ -9321,14 +9472,14 @@
       <w:r>
         <w:drawing>
           <wp:inline>
-            <wp:extent cx="3043824" cy="7519791"/>
+            <wp:extent cx="3300984" cy="7074844"/>
             <wp:effectExtent b="0" l="0" r="0" t="0"/>
             <wp:docPr descr="Figure 4: Trust Predicate Evaluation and Authorisation Decision Flow" title="" id="63" name="Picture"/>
             <a:graphic>
               <a:graphicData uri="http://schemas.openxmlformats.org/drawingml/2006/picture">
                 <pic:pic>
                   <pic:nvPicPr>
-                    <pic:cNvPr descr="media/fig05.png" id="64" name="Picture"/>
+                    <pic:cNvPr descr="media_bw/fig05.png" id="64" name="Picture"/>
                     <pic:cNvPicPr>
                       <a:picLocks noChangeArrowheads="1" noChangeAspect="1"/>
                     </pic:cNvPicPr>
@@ -9342,7 +9493,7 @@
                   <pic:spPr bwMode="auto">
                     <a:xfrm>
                       <a:off x="0" y="0"/>
-                      <a:ext cx="3043824" cy="7519791"/>
+                      <a:ext cx="3300984" cy="7074844"/>
                     </a:xfrm>
                     <a:prstGeom prst="rect">
                       <a:avLst/>
@@ -10068,14 +10219,14 @@
       <w:r>
         <w:drawing>
           <wp:inline>
-            <wp:extent cx="2434224" cy="7686805"/>
+            <wp:extent cx="2505456" cy="7676543"/>
             <wp:effectExtent b="0" l="0" r="0" t="0"/>
             <wp:docPr descr="Figure 5: End-to-End Workflow of Trust-Oriented Consent Authorisation Framework" title="" id="70" name="Picture"/>
             <a:graphic>
               <a:graphicData uri="http://schemas.openxmlformats.org/drawingml/2006/picture">
                 <pic:pic>
                   <pic:nvPicPr>
-                    <pic:cNvPr descr="media/fig06.png" id="71" name="Picture"/>
+                    <pic:cNvPr descr="media_bw/fig06.png" id="71" name="Picture"/>
                     <pic:cNvPicPr>
                       <a:picLocks noChangeArrowheads="1" noChangeAspect="1"/>
                     </pic:cNvPicPr>
@@ -10089,7 +10240,7 @@
                   <pic:spPr bwMode="auto">
                     <a:xfrm>
                       <a:off x="0" y="0"/>
-                      <a:ext cx="2434224" cy="7686805"/>
+                      <a:ext cx="2505456" cy="7676543"/>
                     </a:xfrm>
                     <a:prstGeom prst="rect">
                       <a:avLst/>
@@ -12217,10 +12368,17 @@
       </w:tblGrid>
       <w:tr>
         <w:trPr>
+          <w:cantSplit/>
           <w:tblHeader w:val="on"/>
         </w:trPr>
         <w:tc>
-          <w:tcPr/>
+          <w:tcPr>
+            <w:tcBorders>
+              <w:bottom w:val="single" w:sz="8" w:space="0" w:color="000000"/>
+            </w:tcBorders>
+            <w:shd w:val="clear" w:color="auto" w:fill="E7E6E6"/>
+            <w:vAlign w:val="center"/>
+          </w:tcPr>
           <w:p>
             <w:pPr>
               <w:pStyle w:val="Compact"/>
@@ -12236,7 +12394,13 @@
           </w:p>
         </w:tc>
         <w:tc>
-          <w:tcPr/>
+          <w:tcPr>
+            <w:tcBorders>
+              <w:bottom w:val="single" w:sz="8" w:space="0" w:color="000000"/>
+            </w:tcBorders>
+            <w:shd w:val="clear" w:color="auto" w:fill="E7E6E6"/>
+            <w:vAlign w:val="center"/>
+          </w:tcPr>
           <w:p>
             <w:pPr>
               <w:pStyle w:val="Compact"/>
@@ -12252,7 +12416,13 @@
           </w:p>
         </w:tc>
         <w:tc>
-          <w:tcPr/>
+          <w:tcPr>
+            <w:tcBorders>
+              <w:bottom w:val="single" w:sz="8" w:space="0" w:color="000000"/>
+            </w:tcBorders>
+            <w:shd w:val="clear" w:color="auto" w:fill="E7E6E6"/>
+            <w:vAlign w:val="center"/>
+          </w:tcPr>
           <w:p>
             <w:pPr>
               <w:pStyle w:val="Compact"/>
@@ -12269,6 +12439,9 @@
         </w:tc>
       </w:tr>
       <w:tr>
+        <w:trPr>
+          <w:cantSplit/>
+        </w:trPr>
         <w:tc>
           <w:tcPr/>
           <w:p>
@@ -12307,6 +12480,9 @@
         </w:tc>
       </w:tr>
       <w:tr>
+        <w:trPr>
+          <w:cantSplit/>
+        </w:trPr>
         <w:tc>
           <w:tcPr/>
           <w:p>
@@ -12345,6 +12521,9 @@
         </w:tc>
       </w:tr>
       <w:tr>
+        <w:trPr>
+          <w:cantSplit/>
+        </w:trPr>
         <w:tc>
           <w:tcPr/>
           <w:p>
@@ -12383,6 +12562,9 @@
         </w:tc>
       </w:tr>
       <w:tr>
+        <w:trPr>
+          <w:cantSplit/>
+        </w:trPr>
         <w:tc>
           <w:tcPr/>
           <w:p>
@@ -12421,6 +12603,9 @@
         </w:tc>
       </w:tr>
       <w:tr>
+        <w:trPr>
+          <w:cantSplit/>
+        </w:trPr>
         <w:tc>
           <w:tcPr/>
           <w:p>
@@ -12459,6 +12644,9 @@
         </w:tc>
       </w:tr>
       <w:tr>
+        <w:trPr>
+          <w:cantSplit/>
+        </w:trPr>
         <w:tc>
           <w:tcPr/>
           <w:p>
@@ -12522,10 +12710,17 @@
       </w:tblGrid>
       <w:tr>
         <w:trPr>
+          <w:cantSplit/>
           <w:tblHeader w:val="on"/>
         </w:trPr>
         <w:tc>
-          <w:tcPr/>
+          <w:tcPr>
+            <w:tcBorders>
+              <w:bottom w:val="single" w:sz="8" w:space="0" w:color="000000"/>
+            </w:tcBorders>
+            <w:shd w:val="clear" w:color="auto" w:fill="E7E6E6"/>
+            <w:vAlign w:val="center"/>
+          </w:tcPr>
           <w:p>
             <w:pPr>
               <w:pStyle w:val="Compact"/>
@@ -12541,7 +12736,13 @@
           </w:p>
         </w:tc>
         <w:tc>
-          <w:tcPr/>
+          <w:tcPr>
+            <w:tcBorders>
+              <w:bottom w:val="single" w:sz="8" w:space="0" w:color="000000"/>
+            </w:tcBorders>
+            <w:shd w:val="clear" w:color="auto" w:fill="E7E6E6"/>
+            <w:vAlign w:val="center"/>
+          </w:tcPr>
           <w:p>
             <w:pPr>
               <w:pStyle w:val="Compact"/>
@@ -12557,7 +12758,13 @@
           </w:p>
         </w:tc>
         <w:tc>
-          <w:tcPr/>
+          <w:tcPr>
+            <w:tcBorders>
+              <w:bottom w:val="single" w:sz="8" w:space="0" w:color="000000"/>
+            </w:tcBorders>
+            <w:shd w:val="clear" w:color="auto" w:fill="E7E6E6"/>
+            <w:vAlign w:val="center"/>
+          </w:tcPr>
           <w:p>
             <w:pPr>
               <w:pStyle w:val="Compact"/>
@@ -12573,7 +12780,13 @@
           </w:p>
         </w:tc>
         <w:tc>
-          <w:tcPr/>
+          <w:tcPr>
+            <w:tcBorders>
+              <w:bottom w:val="single" w:sz="8" w:space="0" w:color="000000"/>
+            </w:tcBorders>
+            <w:shd w:val="clear" w:color="auto" w:fill="E7E6E6"/>
+            <w:vAlign w:val="center"/>
+          </w:tcPr>
           <w:p>
             <w:pPr>
               <w:pStyle w:val="Compact"/>
@@ -12590,6 +12803,9 @@
         </w:tc>
       </w:tr>
       <w:tr>
+        <w:trPr>
+          <w:cantSplit/>
+        </w:trPr>
         <w:tc>
           <w:tcPr/>
           <w:p>
@@ -12640,6 +12856,9 @@
         </w:tc>
       </w:tr>
       <w:tr>
+        <w:trPr>
+          <w:cantSplit/>
+        </w:trPr>
         <w:tc>
           <w:tcPr/>
           <w:p>
@@ -12690,6 +12909,9 @@
         </w:tc>
       </w:tr>
       <w:tr>
+        <w:trPr>
+          <w:cantSplit/>
+        </w:trPr>
         <w:tc>
           <w:tcPr/>
           <w:p>
@@ -12740,6 +12962,9 @@
         </w:tc>
       </w:tr>
       <w:tr>
+        <w:trPr>
+          <w:cantSplit/>
+        </w:trPr>
         <w:tc>
           <w:tcPr/>
           <w:p>
@@ -12790,6 +13015,9 @@
         </w:tc>
       </w:tr>
       <w:tr>
+        <w:trPr>
+          <w:cantSplit/>
+        </w:trPr>
         <w:tc>
           <w:tcPr/>
           <w:p>
@@ -12840,6 +13068,9 @@
         </w:tc>
       </w:tr>
       <w:tr>
+        <w:trPr>
+          <w:cantSplit/>
+        </w:trPr>
         <w:tc>
           <w:tcPr/>
           <w:p>
@@ -13112,14 +13343,14 @@
       <w:r>
         <w:drawing>
           <wp:inline>
-            <wp:extent cx="3451860" cy="7452700"/>
+            <wp:extent cx="4288536" cy="7675254"/>
             <wp:effectExtent b="0" l="0" r="0" t="0"/>
             <wp:docPr descr="Figure 6: RO1 workflow for trust-centric consent creation" title="" id="84" name="Picture"/>
             <a:graphic>
               <a:graphicData uri="http://schemas.openxmlformats.org/drawingml/2006/picture">
                 <pic:pic>
                   <pic:nvPicPr>
-                    <pic:cNvPr descr="media/fig07.png" id="85" name="Picture"/>
+                    <pic:cNvPr descr="media_bw/fig07.png" id="85" name="Picture"/>
                     <pic:cNvPicPr>
                       <a:picLocks noChangeArrowheads="1" noChangeAspect="1"/>
                     </pic:cNvPicPr>
@@ -13133,7 +13364,7 @@
                   <pic:spPr bwMode="auto">
                     <a:xfrm>
                       <a:off x="0" y="0"/>
-                      <a:ext cx="3451860" cy="7452700"/>
+                      <a:ext cx="4288536" cy="7675254"/>
                     </a:xfrm>
                     <a:prstGeom prst="rect">
                       <a:avLst/>
@@ -15140,14 +15371,14 @@
       <w:r>
         <w:drawing>
           <wp:inline>
-            <wp:extent cx="3451860" cy="6500607"/>
+            <wp:extent cx="4416552" cy="7572102"/>
             <wp:effectExtent b="0" l="0" r="0" t="0"/>
             <wp:docPr descr="Figure 7: RO2 workflow for decentralised identity and authority verification" title="" id="92" name="Picture"/>
             <a:graphic>
               <a:graphicData uri="http://schemas.openxmlformats.org/drawingml/2006/picture">
                 <pic:pic>
                   <pic:nvPicPr>
-                    <pic:cNvPr descr="media/fig08.png" id="93" name="Picture"/>
+                    <pic:cNvPr descr="media_bw/fig08.png" id="93" name="Picture"/>
                     <pic:cNvPicPr>
                       <a:picLocks noChangeArrowheads="1" noChangeAspect="1"/>
                     </pic:cNvPicPr>
@@ -15161,7 +15392,7 @@
                   <pic:spPr bwMode="auto">
                     <a:xfrm>
                       <a:off x="0" y="0"/>
-                      <a:ext cx="3451860" cy="6500607"/>
+                      <a:ext cx="4416552" cy="7572102"/>
                     </a:xfrm>
                     <a:prstGeom prst="rect">
                       <a:avLst/>
@@ -17514,14 +17745,14 @@
       <w:r>
         <w:drawing>
           <wp:inline>
-            <wp:extent cx="3451860" cy="5978933"/>
+            <wp:extent cx="4690872" cy="7676810"/>
             <wp:effectExtent b="0" l="0" r="0" t="0"/>
             <wp:docPr descr="Figure 8: RO3 workflow for threshold-based multi-party authorisation" title="" id="99" name="Picture"/>
             <a:graphic>
               <a:graphicData uri="http://schemas.openxmlformats.org/drawingml/2006/picture">
                 <pic:pic>
                   <pic:nvPicPr>
-                    <pic:cNvPr descr="media/fig09.png" id="100" name="Picture"/>
+                    <pic:cNvPr descr="media_bw/fig09.png" id="100" name="Picture"/>
                     <pic:cNvPicPr>
                       <a:picLocks noChangeArrowheads="1" noChangeAspect="1"/>
                     </pic:cNvPicPr>
@@ -17535,7 +17766,7 @@
                   <pic:spPr bwMode="auto">
                     <a:xfrm>
                       <a:off x="0" y="0"/>
-                      <a:ext cx="3451860" cy="5978933"/>
+                      <a:ext cx="4690872" cy="7676810"/>
                     </a:xfrm>
                     <a:prstGeom prst="rect">
                       <a:avLst/>
@@ -21135,14 +21366,14 @@
       <w:r>
         <w:drawing>
           <wp:inline>
-            <wp:extent cx="3451860" cy="7239043"/>
+            <wp:extent cx="2788920" cy="7689425"/>
             <wp:effectExtent b="0" l="0" r="0" t="0"/>
             <wp:docPr descr="Figure 9: RO4 workflow for policy- and context-aware access control" title="" id="105" name="Picture"/>
             <a:graphic>
               <a:graphicData uri="http://schemas.openxmlformats.org/drawingml/2006/picture">
                 <pic:pic>
                   <pic:nvPicPr>
-                    <pic:cNvPr descr="media/fig10.png" id="106" name="Picture"/>
+                    <pic:cNvPr descr="media_bw/fig10.png" id="106" name="Picture"/>
                     <pic:cNvPicPr>
                       <a:picLocks noChangeArrowheads="1" noChangeAspect="1"/>
                     </pic:cNvPicPr>
@@ -21156,7 +21387,7 @@
                   <pic:spPr bwMode="auto">
                     <a:xfrm>
                       <a:off x="0" y="0"/>
-                      <a:ext cx="3451860" cy="7239043"/>
+                      <a:ext cx="2788920" cy="7689425"/>
                     </a:xfrm>
                     <a:prstGeom prst="rect">
                       <a:avLst/>
@@ -28334,14 +28565,14 @@
       <w:r>
         <w:drawing>
           <wp:inline>
-            <wp:extent cx="3451860" cy="6065199"/>
+            <wp:extent cx="4142232" cy="7687826"/>
             <wp:effectExtent b="0" l="0" r="0" t="0"/>
             <wp:docPr descr="Figure 10: RO5 planned workflow for temporal and consent lifecycle trust" title="" id="114" name="Picture"/>
             <a:graphic>
               <a:graphicData uri="http://schemas.openxmlformats.org/drawingml/2006/picture">
                 <pic:pic>
                   <pic:nvPicPr>
-                    <pic:cNvPr descr="media/fig11.png" id="115" name="Picture"/>
+                    <pic:cNvPr descr="media_bw/fig11.png" id="115" name="Picture"/>
                     <pic:cNvPicPr>
                       <a:picLocks noChangeArrowheads="1" noChangeAspect="1"/>
                     </pic:cNvPicPr>
@@ -28355,7 +28586,7 @@
                   <pic:spPr bwMode="auto">
                     <a:xfrm>
                       <a:off x="0" y="0"/>
-                      <a:ext cx="3451860" cy="6065199"/>
+                      <a:ext cx="4142232" cy="7687826"/>
                     </a:xfrm>
                     <a:prstGeom prst="rect">
                       <a:avLst/>
@@ -28970,14 +29201,14 @@
       <w:r>
         <w:drawing>
           <wp:inline>
-            <wp:extent cx="3451860" cy="4212881"/>
+            <wp:extent cx="5753100" cy="6601216"/>
             <wp:effectExtent b="0" l="0" r="0" t="0"/>
             <wp:docPr descr="Figure 11: RO6 planned workflow for formal security assurance and empirical validation" title="" id="120" name="Picture"/>
             <a:graphic>
               <a:graphicData uri="http://schemas.openxmlformats.org/drawingml/2006/picture">
                 <pic:pic>
                   <pic:nvPicPr>
-                    <pic:cNvPr descr="media/fig12.png" id="121" name="Picture"/>
+                    <pic:cNvPr descr="media_bw/fig12.png" id="121" name="Picture"/>
                     <pic:cNvPicPr>
                       <a:picLocks noChangeArrowheads="1" noChangeAspect="1"/>
                     </pic:cNvPicPr>
@@ -28991,7 +29222,7 @@
                   <pic:spPr bwMode="auto">
                     <a:xfrm>
                       <a:off x="0" y="0"/>
-                      <a:ext cx="3451860" cy="4212881"/>
+                      <a:ext cx="5753100" cy="6601216"/>
                     </a:xfrm>
                     <a:prstGeom prst="rect">
                       <a:avLst/>
@@ -33731,7 +33962,7 @@
     </w:p>
     <w:bookmarkEnd w:id="125"/>
     <w:bookmarkEnd w:id="126"/>
-    <w:bookmarkStart w:id="155" w:name="halah-system-and-workflow"/>
+    <w:bookmarkStart w:id="158" w:name="halah-system-and-workflow"/>
     <w:p>
       <w:pPr>
         <w:pStyle w:val="Heading1"/>
@@ -36440,10 +36671,17 @@
       </w:tblGrid>
       <w:tr>
         <w:trPr>
+          <w:cantSplit/>
           <w:tblHeader w:val="on"/>
         </w:trPr>
         <w:tc>
-          <w:tcPr/>
+          <w:tcPr>
+            <w:tcBorders>
+              <w:bottom w:val="single" w:sz="8" w:space="0" w:color="000000"/>
+            </w:tcBorders>
+            <w:shd w:val="clear" w:color="auto" w:fill="E7E6E6"/>
+            <w:vAlign w:val="center"/>
+          </w:tcPr>
           <w:p>
             <w:pPr>
               <w:pStyle w:val="Compact"/>
@@ -36459,7 +36697,13 @@
           </w:p>
         </w:tc>
         <w:tc>
-          <w:tcPr/>
+          <w:tcPr>
+            <w:tcBorders>
+              <w:bottom w:val="single" w:sz="8" w:space="0" w:color="000000"/>
+            </w:tcBorders>
+            <w:shd w:val="clear" w:color="auto" w:fill="E7E6E6"/>
+            <w:vAlign w:val="center"/>
+          </w:tcPr>
           <w:p>
             <w:pPr>
               <w:pStyle w:val="Compact"/>
@@ -36475,7 +36719,13 @@
           </w:p>
         </w:tc>
         <w:tc>
-          <w:tcPr/>
+          <w:tcPr>
+            <w:tcBorders>
+              <w:bottom w:val="single" w:sz="8" w:space="0" w:color="000000"/>
+            </w:tcBorders>
+            <w:shd w:val="clear" w:color="auto" w:fill="E7E6E6"/>
+            <w:vAlign w:val="center"/>
+          </w:tcPr>
           <w:p>
             <w:pPr>
               <w:pStyle w:val="Compact"/>
@@ -36492,6 +36742,9 @@
         </w:tc>
       </w:tr>
       <w:tr>
+        <w:trPr>
+          <w:cantSplit/>
+        </w:trPr>
         <w:tc>
           <w:tcPr/>
           <w:p>
@@ -36534,6 +36787,9 @@
         </w:tc>
       </w:tr>
       <w:tr>
+        <w:trPr>
+          <w:cantSplit/>
+        </w:trPr>
         <w:tc>
           <w:tcPr/>
           <w:p>
@@ -36576,6 +36832,9 @@
         </w:tc>
       </w:tr>
       <w:tr>
+        <w:trPr>
+          <w:cantSplit/>
+        </w:trPr>
         <w:tc>
           <w:tcPr/>
           <w:p>
@@ -36618,6 +36877,9 @@
         </w:tc>
       </w:tr>
       <w:tr>
+        <w:trPr>
+          <w:cantSplit/>
+        </w:trPr>
         <w:tc>
           <w:tcPr/>
           <w:p>
@@ -36660,6 +36922,9 @@
         </w:tc>
       </w:tr>
       <w:tr>
+        <w:trPr>
+          <w:cantSplit/>
+        </w:trPr>
         <w:tc>
           <w:tcPr/>
           <w:p>
@@ -36702,6 +36967,9 @@
         </w:tc>
       </w:tr>
       <w:tr>
+        <w:trPr>
+          <w:cantSplit/>
+        </w:trPr>
         <w:tc>
           <w:tcPr/>
           <w:p>
@@ -36744,6 +37012,9 @@
         </w:tc>
       </w:tr>
       <w:tr>
+        <w:trPr>
+          <w:cantSplit/>
+        </w:trPr>
         <w:tc>
           <w:tcPr/>
           <w:p>
@@ -36786,6 +37057,9 @@
         </w:tc>
       </w:tr>
       <w:tr>
+        <w:trPr>
+          <w:cantSplit/>
+        </w:trPr>
         <w:tc>
           <w:tcPr/>
           <w:p>
@@ -36828,6 +37102,9 @@
         </w:tc>
       </w:tr>
       <w:tr>
+        <w:trPr>
+          <w:cantSplit/>
+        </w:trPr>
         <w:tc>
           <w:tcPr/>
           <w:p>
@@ -36870,6 +37147,9 @@
         </w:tc>
       </w:tr>
       <w:tr>
+        <w:trPr>
+          <w:cantSplit/>
+        </w:trPr>
         <w:tc>
           <w:tcPr/>
           <w:p>
@@ -36912,6 +37192,9 @@
         </w:tc>
       </w:tr>
       <w:tr>
+        <w:trPr>
+          <w:cantSplit/>
+        </w:trPr>
         <w:tc>
           <w:tcPr/>
           <w:p>
@@ -37201,7 +37484,7 @@
       </w:r>
     </w:p>
     <w:bookmarkEnd w:id="150"/>
-    <w:bookmarkStart w:id="151" w:name="X88b3d53607b792a9f4430f1be3c348b9a46cb27"/>
+    <w:bookmarkStart w:id="154" w:name="X88b3d53607b792a9f4430f1be3c348b9a46cb27"/>
     <w:p>
       <w:pPr>
         <w:pStyle w:val="Heading2"/>
@@ -37241,10 +37524,17 @@
       </w:tblGrid>
       <w:tr>
         <w:trPr>
+          <w:cantSplit/>
           <w:tblHeader w:val="on"/>
         </w:trPr>
         <w:tc>
-          <w:tcPr/>
+          <w:tcPr>
+            <w:tcBorders>
+              <w:bottom w:val="single" w:sz="8" w:space="0" w:color="000000"/>
+            </w:tcBorders>
+            <w:shd w:val="clear" w:color="auto" w:fill="E7E6E6"/>
+            <w:vAlign w:val="center"/>
+          </w:tcPr>
           <w:p>
             <w:pPr>
               <w:pStyle w:val="Compact"/>
@@ -37260,7 +37550,13 @@
           </w:p>
         </w:tc>
         <w:tc>
-          <w:tcPr/>
+          <w:tcPr>
+            <w:tcBorders>
+              <w:bottom w:val="single" w:sz="8" w:space="0" w:color="000000"/>
+            </w:tcBorders>
+            <w:shd w:val="clear" w:color="auto" w:fill="E7E6E6"/>
+            <w:vAlign w:val="center"/>
+          </w:tcPr>
           <w:p>
             <w:pPr>
               <w:pStyle w:val="Compact"/>
@@ -37276,7 +37572,13 @@
           </w:p>
         </w:tc>
         <w:tc>
-          <w:tcPr/>
+          <w:tcPr>
+            <w:tcBorders>
+              <w:bottom w:val="single" w:sz="8" w:space="0" w:color="000000"/>
+            </w:tcBorders>
+            <w:shd w:val="clear" w:color="auto" w:fill="E7E6E6"/>
+            <w:vAlign w:val="center"/>
+          </w:tcPr>
           <w:p>
             <w:pPr>
               <w:pStyle w:val="Compact"/>
@@ -37293,6 +37595,9 @@
         </w:tc>
       </w:tr>
       <w:tr>
+        <w:trPr>
+          <w:cantSplit/>
+        </w:trPr>
         <w:tc>
           <w:tcPr/>
           <w:p>
@@ -37331,6 +37636,9 @@
         </w:tc>
       </w:tr>
       <w:tr>
+        <w:trPr>
+          <w:cantSplit/>
+        </w:trPr>
         <w:tc>
           <w:tcPr/>
           <w:p>
@@ -37369,6 +37677,9 @@
         </w:tc>
       </w:tr>
       <w:tr>
+        <w:trPr>
+          <w:cantSplit/>
+        </w:trPr>
         <w:tc>
           <w:tcPr/>
           <w:p>
@@ -37427,6 +37738,9 @@
         </w:tc>
       </w:tr>
       <w:tr>
+        <w:trPr>
+          <w:cantSplit/>
+        </w:trPr>
         <w:tc>
           <w:tcPr/>
           <w:p>
@@ -37502,6 +37816,9 @@
         </w:tc>
       </w:tr>
       <w:tr>
+        <w:trPr>
+          <w:cantSplit/>
+        </w:trPr>
         <w:tc>
           <w:tcPr/>
           <w:p>
@@ -37560,6 +37877,9 @@
         </w:tc>
       </w:tr>
       <w:tr>
+        <w:trPr>
+          <w:cantSplit/>
+        </w:trPr>
         <w:tc>
           <w:tcPr/>
           <w:p>
@@ -37609,6 +37929,9 @@
         </w:tc>
       </w:tr>
       <w:tr>
+        <w:trPr>
+          <w:cantSplit/>
+        </w:trPr>
         <w:tc>
           <w:tcPr/>
           <w:p>
@@ -37735,6 +38058,9 @@
         </w:tc>
       </w:tr>
       <w:tr>
+        <w:trPr>
+          <w:cantSplit/>
+        </w:trPr>
         <w:tc>
           <w:tcPr/>
           <w:p>
@@ -37773,6 +38099,9 @@
         </w:tc>
       </w:tr>
       <w:tr>
+        <w:trPr>
+          <w:cantSplit/>
+        </w:trPr>
         <w:tc>
           <w:tcPr/>
           <w:p>
@@ -37811,6 +38140,9 @@
         </w:tc>
       </w:tr>
       <w:tr>
+        <w:trPr>
+          <w:cantSplit/>
+        </w:trPr>
         <w:tc>
           <w:tcPr/>
           <w:p>
@@ -37849,8 +38181,71 @@
         </w:tc>
       </w:tr>
     </w:tbl>
-    <w:bookmarkEnd w:id="151"/>
-    <w:bookmarkStart w:id="152" w:name="automated-test-evidence"/>
+    <w:p>
+      <w:pPr>
+        <w:pStyle w:val="BodyText"/>
+      </w:pPr>
+      <w:r>
+        <w:t xml:space="preserve">Figure 17 traces one consent through the four subsystems of the prototype and shows where each check is enforced and which events are written to the audit log.</w:t>
+      </w:r>
+    </w:p>
+    <w:p>
+      <w:pPr>
+        <w:pStyle w:val="CaptionedFigure"/>
+      </w:pPr>
+      <w:r>
+        <w:drawing>
+          <wp:inline>
+            <wp:extent cx="3886200" cy="7632356"/>
+            <wp:effectExtent b="0" l="0" r="0" t="0"/>
+            <wp:docPr descr="Figure 17: HALAH prototype workflow from consent creation to audited access decision" title="" id="152" name="Picture"/>
+            <a:graphic>
+              <a:graphicData uri="http://schemas.openxmlformats.org/drawingml/2006/picture">
+                <pic:pic>
+                  <pic:nvPicPr>
+                    <pic:cNvPr descr="media_bw/fig_halah.png" id="153" name="Picture"/>
+                    <pic:cNvPicPr>
+                      <a:picLocks noChangeArrowheads="1" noChangeAspect="1"/>
+                    </pic:cNvPicPr>
+                  </pic:nvPicPr>
+                  <pic:blipFill>
+                    <a:blip r:embed="rId151"/>
+                    <a:stretch>
+                      <a:fillRect/>
+                    </a:stretch>
+                  </pic:blipFill>
+                  <pic:spPr bwMode="auto">
+                    <a:xfrm>
+                      <a:off x="0" y="0"/>
+                      <a:ext cx="3886200" cy="7632356"/>
+                    </a:xfrm>
+                    <a:prstGeom prst="rect">
+                      <a:avLst/>
+                    </a:prstGeom>
+                    <a:noFill/>
+                    <a:ln w="9525">
+                      <a:noFill/>
+                      <a:headEnd/>
+                      <a:tailEnd/>
+                    </a:ln>
+                  </pic:spPr>
+                </pic:pic>
+              </a:graphicData>
+            </a:graphic>
+          </wp:inline>
+        </w:drawing>
+      </w:r>
+    </w:p>
+    <w:p>
+      <w:pPr>
+        <w:pStyle w:val="ImageCaption"/>
+      </w:pPr>
+      <w:r>
+        <w:t xml:space="preserve">Figure 17: HALAH prototype workflow from consent creation to audited access decision</w:t>
+      </w:r>
+    </w:p>
+    <w:bookmarkEnd w:id="154"/>
+    <w:bookmarkStart w:id="155" w:name="automated-test-evidence"/>
     <w:p>
       <w:pPr>
         <w:pStyle w:val="Heading2"/>
@@ -37884,18 +38279,25 @@
         <w:tblCaption w:val="Table 9: Automated test results of the HALAH prototype"/>
       </w:tblPr>
       <w:tblGrid>
-        <w:gridCol w:w="803"/>
-        <w:gridCol w:w="1377"/>
-        <w:gridCol w:w="3328"/>
-        <w:gridCol w:w="1147"/>
-        <w:gridCol w:w="1262"/>
+        <w:gridCol w:w="446"/>
+        <w:gridCol w:w="1338"/>
+        <w:gridCol w:w="4127"/>
+        <w:gridCol w:w="892"/>
+        <w:gridCol w:w="1115"/>
       </w:tblGrid>
       <w:tr>
         <w:trPr>
+          <w:cantSplit/>
           <w:tblHeader w:val="on"/>
         </w:trPr>
         <w:tc>
-          <w:tcPr/>
+          <w:tcPr>
+            <w:tcBorders>
+              <w:bottom w:val="single" w:sz="8" w:space="0" w:color="000000"/>
+            </w:tcBorders>
+            <w:shd w:val="clear" w:color="auto" w:fill="E7E6E6"/>
+            <w:vAlign w:val="center"/>
+          </w:tcPr>
           <w:p>
             <w:pPr>
               <w:pStyle w:val="Compact"/>
@@ -37911,7 +38313,13 @@
           </w:p>
         </w:tc>
         <w:tc>
-          <w:tcPr/>
+          <w:tcPr>
+            <w:tcBorders>
+              <w:bottom w:val="single" w:sz="8" w:space="0" w:color="000000"/>
+            </w:tcBorders>
+            <w:shd w:val="clear" w:color="auto" w:fill="E7E6E6"/>
+            <w:vAlign w:val="center"/>
+          </w:tcPr>
           <w:p>
             <w:pPr>
               <w:pStyle w:val="Compact"/>
@@ -37927,7 +38335,13 @@
           </w:p>
         </w:tc>
         <w:tc>
-          <w:tcPr/>
+          <w:tcPr>
+            <w:tcBorders>
+              <w:bottom w:val="single" w:sz="8" w:space="0" w:color="000000"/>
+            </w:tcBorders>
+            <w:shd w:val="clear" w:color="auto" w:fill="E7E6E6"/>
+            <w:vAlign w:val="center"/>
+          </w:tcPr>
           <w:p>
             <w:pPr>
               <w:pStyle w:val="Compact"/>
@@ -37943,7 +38357,13 @@
           </w:p>
         </w:tc>
         <w:tc>
-          <w:tcPr/>
+          <w:tcPr>
+            <w:tcBorders>
+              <w:bottom w:val="single" w:sz="8" w:space="0" w:color="000000"/>
+            </w:tcBorders>
+            <w:shd w:val="clear" w:color="auto" w:fill="E7E6E6"/>
+            <w:vAlign w:val="center"/>
+          </w:tcPr>
           <w:p>
             <w:pPr>
               <w:pStyle w:val="Compact"/>
@@ -37959,7 +38379,13 @@
           </w:p>
         </w:tc>
         <w:tc>
-          <w:tcPr/>
+          <w:tcPr>
+            <w:tcBorders>
+              <w:bottom w:val="single" w:sz="8" w:space="0" w:color="000000"/>
+            </w:tcBorders>
+            <w:shd w:val="clear" w:color="auto" w:fill="E7E6E6"/>
+            <w:vAlign w:val="center"/>
+          </w:tcPr>
           <w:p>
             <w:pPr>
               <w:pStyle w:val="Compact"/>
@@ -37976,6 +38402,9 @@
         </w:tc>
       </w:tr>
       <w:tr>
+        <w:trPr>
+          <w:cantSplit/>
+        </w:trPr>
         <w:tc>
           <w:tcPr/>
           <w:p>
@@ -38049,6 +38478,9 @@
         </w:tc>
       </w:tr>
       <w:tr>
+        <w:trPr>
+          <w:cantSplit/>
+        </w:trPr>
         <w:tc>
           <w:tcPr/>
           <w:p>
@@ -38151,6 +38583,9 @@
         </w:tc>
       </w:tr>
       <w:tr>
+        <w:trPr>
+          <w:cantSplit/>
+        </w:trPr>
         <w:tc>
           <w:tcPr/>
           <w:p>
@@ -38244,6 +38679,9 @@
         </w:tc>
       </w:tr>
       <w:tr>
+        <w:trPr>
+          <w:cantSplit/>
+        </w:trPr>
         <w:tc>
           <w:tcPr/>
           <w:p>
@@ -38317,6 +38755,9 @@
         </w:tc>
       </w:tr>
       <w:tr>
+        <w:trPr>
+          <w:cantSplit/>
+        </w:trPr>
         <w:tc>
           <w:tcPr/>
           <w:p>
@@ -38402,6 +38843,9 @@
         </w:tc>
       </w:tr>
       <w:tr>
+        <w:trPr>
+          <w:cantSplit/>
+        </w:trPr>
         <w:tc>
           <w:tcPr/>
           <w:p>
@@ -38466,6 +38910,9 @@
         </w:tc>
       </w:tr>
       <w:tr>
+        <w:trPr>
+          <w:cantSplit/>
+        </w:trPr>
         <w:tc>
           <w:tcPr/>
           <w:p>
@@ -38530,6 +38977,9 @@
         </w:tc>
       </w:tr>
       <w:tr>
+        <w:trPr>
+          <w:cantSplit/>
+        </w:trPr>
         <w:tc>
           <w:tcPr/>
           <w:p>
@@ -38592,6 +39042,9 @@
         </w:tc>
       </w:tr>
       <w:tr>
+        <w:trPr>
+          <w:cantSplit/>
+        </w:trPr>
         <w:tc>
           <w:tcPr/>
           <w:p>
@@ -38673,8 +39126,8 @@
         <w:t xml:space="preserve">These are functional unit and integration tests in which the blockchain is mocked. They provide initial evidence for SRQ1–SRQ4 and for the first SRQ5 checks, but they are not yet the complete valid, negative and adversarial scenario set of Algorithm 6. Negative cases still to be added in Stage 2 include insufficient approvals at the data-release gate, a duplicate approval attempt, an out-of-scope request submitted directly to the service interface, and a request with a mismatched declared purpose.</w:t>
       </w:r>
     </w:p>
-    <w:bookmarkEnd w:id="152"/>
-    <w:bookmarkStart w:id="153" w:name="on-chain-evidence"/>
+    <w:bookmarkEnd w:id="155"/>
+    <w:bookmarkStart w:id="156" w:name="on-chain-evidence"/>
     <w:p>
       <w:pPr>
         <w:pStyle w:val="Heading2"/>
@@ -38723,10 +39176,17 @@
       </w:tblGrid>
       <w:tr>
         <w:trPr>
+          <w:cantSplit/>
           <w:tblHeader w:val="on"/>
         </w:trPr>
         <w:tc>
-          <w:tcPr/>
+          <w:tcPr>
+            <w:tcBorders>
+              <w:bottom w:val="single" w:sz="8" w:space="0" w:color="000000"/>
+            </w:tcBorders>
+            <w:shd w:val="clear" w:color="auto" w:fill="E7E6E6"/>
+            <w:vAlign w:val="center"/>
+          </w:tcPr>
           <w:p>
             <w:pPr>
               <w:pStyle w:val="Compact"/>
@@ -38742,7 +39202,13 @@
           </w:p>
         </w:tc>
         <w:tc>
-          <w:tcPr/>
+          <w:tcPr>
+            <w:tcBorders>
+              <w:bottom w:val="single" w:sz="8" w:space="0" w:color="000000"/>
+            </w:tcBorders>
+            <w:shd w:val="clear" w:color="auto" w:fill="E7E6E6"/>
+            <w:vAlign w:val="center"/>
+          </w:tcPr>
           <w:p>
             <w:pPr>
               <w:pStyle w:val="Compact"/>
@@ -38758,7 +39224,13 @@
           </w:p>
         </w:tc>
         <w:tc>
-          <w:tcPr/>
+          <w:tcPr>
+            <w:tcBorders>
+              <w:bottom w:val="single" w:sz="8" w:space="0" w:color="000000"/>
+            </w:tcBorders>
+            <w:shd w:val="clear" w:color="auto" w:fill="E7E6E6"/>
+            <w:vAlign w:val="center"/>
+          </w:tcPr>
           <w:p>
             <w:pPr>
               <w:pStyle w:val="Compact"/>
@@ -38775,6 +39247,9 @@
         </w:tc>
       </w:tr>
       <w:tr>
+        <w:trPr>
+          <w:cantSplit/>
+        </w:trPr>
         <w:tc>
           <w:tcPr/>
           <w:p>
@@ -38813,6 +39288,9 @@
         </w:tc>
       </w:tr>
       <w:tr>
+        <w:trPr>
+          <w:cantSplit/>
+        </w:trPr>
         <w:tc>
           <w:tcPr/>
           <w:p>
@@ -38851,6 +39329,9 @@
         </w:tc>
       </w:tr>
       <w:tr>
+        <w:trPr>
+          <w:cantSplit/>
+        </w:trPr>
         <w:tc>
           <w:tcPr/>
           <w:p>
@@ -38889,6 +39370,9 @@
         </w:tc>
       </w:tr>
       <w:tr>
+        <w:trPr>
+          <w:cantSplit/>
+        </w:trPr>
         <w:tc>
           <w:tcPr/>
           <w:p>
@@ -38927,8 +39411,8 @@
         </w:tc>
       </w:tr>
     </w:tbl>
-    <w:bookmarkEnd w:id="153"/>
-    <w:bookmarkStart w:id="154" w:name="implementation-status-and-limitations"/>
+    <w:bookmarkEnd w:id="156"/>
+    <w:bookmarkStart w:id="157" w:name="implementation-status-and-limitations"/>
     <w:p>
       <w:pPr>
         <w:pStyle w:val="Heading2"/>
@@ -39074,9 +39558,9 @@
         <w:t xml:space="preserve">Evaluation to date is functional (18 automated tests); performance and adversarial measurements are Stage 2 work.</w:t>
       </w:r>
     </w:p>
-    <w:bookmarkEnd w:id="154"/>
-    <w:bookmarkEnd w:id="155"/>
-    <w:bookmarkStart w:id="162" w:name="current-progress-status"/>
+    <w:bookmarkEnd w:id="157"/>
+    <w:bookmarkEnd w:id="158"/>
+    <w:bookmarkStart w:id="165" w:name="current-progress-status"/>
     <w:p>
       <w:pPr>
         <w:pStyle w:val="Heading1"/>
@@ -39085,7 +39569,7 @@
         <w:t xml:space="preserve">8 Current Progress Status</w:t>
       </w:r>
     </w:p>
-    <w:bookmarkStart w:id="156" w:name="X14610c74215ca842dde591adf203c91218a1a96"/>
+    <w:bookmarkStart w:id="159" w:name="X14610c74215ca842dde591adf203c91218a1a96"/>
     <w:p>
       <w:pPr>
         <w:pStyle w:val="Heading2"/>
@@ -39296,8 +39780,8 @@
         <w:t xml:space="preserve">(Section 7.2). This provides a conceptual basis for dynamic access decisions and allows subsequent authorisation conditions to be evaluated consistently.</w:t>
       </w:r>
     </w:p>
-    <w:bookmarkEnd w:id="156"/>
-    <w:bookmarkStart w:id="157" w:name="X559e9df15ebd031f98715062b5b54bf7a8f1d60"/>
+    <w:bookmarkEnd w:id="159"/>
+    <w:bookmarkStart w:id="160" w:name="X559e9df15ebd031f98715062b5b54bf7a8f1d60"/>
     <w:p>
       <w:pPr>
         <w:pStyle w:val="Heading2"/>
@@ -39366,8 +39850,8 @@
         <w:t xml:space="preserve">The current implementation demonstrates the separation between participant identity and authorisation authority. A valid healthcare participant identity can be verified independently from the question of whether that participant is authorised to access a particular patient’s data. In the prototype, guardian approvals are EIP-712 signatures verified by public-key recovery; a wrong guardian, a wrong consent identifier or a missing signature is rejected (Table 9, T1).</w:t>
       </w:r>
     </w:p>
-    <w:bookmarkEnd w:id="157"/>
-    <w:bookmarkStart w:id="158" w:name="Xf706e6be99deea6c1433defe6c0978157a655ed"/>
+    <w:bookmarkEnd w:id="160"/>
+    <w:bookmarkStart w:id="161" w:name="Xf706e6be99deea6c1433defe6c0978157a655ed"/>
     <w:p>
       <w:pPr>
         <w:pStyle w:val="Heading2"/>
@@ -39506,8 +39990,8 @@
         <w:t xml:space="preserve">This provides preliminary evidence that the proposed framework can enforce collective rather than unilateral authorisation.</w:t>
       </w:r>
     </w:p>
-    <w:bookmarkEnd w:id="158"/>
-    <w:bookmarkStart w:id="159" w:name="X8600b2f76ef27bbd75c7c71838aa9377b2ebdb3"/>
+    <w:bookmarkEnd w:id="161"/>
+    <w:bookmarkStart w:id="162" w:name="X8600b2f76ef27bbd75c7c71838aa9377b2ebdb3"/>
     <w:p>
       <w:pPr>
         <w:pStyle w:val="Heading2"/>
@@ -39612,8 +40096,8 @@
         <w:t xml:space="preserve">) and routing data release through the full decision matrix are scheduled for Stage 2 (Section 6.4.1).</w:t>
       </w:r>
     </w:p>
-    <w:bookmarkEnd w:id="159"/>
-    <w:bookmarkStart w:id="160" w:name="X8e6146f09fe285d619620b5d8a35865b7344e11"/>
+    <w:bookmarkEnd w:id="162"/>
+    <w:bookmarkStart w:id="163" w:name="X8e6146f09fe285d619620b5d8a35865b7344e11"/>
     <w:p>
       <w:pPr>
         <w:pStyle w:val="Heading2"/>
@@ -39695,8 +40179,8 @@
         <w:t xml:space="preserve">The expected outcome is a lifecycle-aware consent mechanism capable of rejecting access after expiration or revocation and preventing unauthorised lifecycle transitions. This work will constitute a major component of next stage.</w:t>
       </w:r>
     </w:p>
-    <w:bookmarkEnd w:id="160"/>
-    <w:bookmarkStart w:id="161" w:name="Xd9cfcdd9e757a6720ff3496d27d05dcd5fd4592"/>
+    <w:bookmarkEnd w:id="163"/>
+    <w:bookmarkStart w:id="164" w:name="Xd9cfcdd9e757a6720ff3496d27d05dcd5fd4592"/>
     <w:p>
       <w:pPr>
         <w:pStyle w:val="Heading2"/>
@@ -39765,9 +40249,9 @@
         <w:t xml:space="preserve">The remaining security assurance and comprehensive empirical evaluation will be conducted in next stage. These activities will include policy-violation scenarios, temporal expiration, revocation, invalid lifecycle transitions, formal security properties, and broader experimental validation.</w:t>
       </w:r>
     </w:p>
-    <w:bookmarkEnd w:id="161"/>
-    <w:bookmarkEnd w:id="162"/>
-    <w:bookmarkStart w:id="163" w:name="publications-summary"/>
+    <w:bookmarkEnd w:id="164"/>
+    <w:bookmarkEnd w:id="165"/>
+    <w:bookmarkStart w:id="166" w:name="publications-summary"/>
     <w:p>
       <w:pPr>
         <w:pStyle w:val="Heading1"/>
@@ -39807,10 +40291,17 @@
       </w:tblGrid>
       <w:tr>
         <w:trPr>
+          <w:cantSplit/>
           <w:tblHeader w:val="on"/>
         </w:trPr>
         <w:tc>
-          <w:tcPr/>
+          <w:tcPr>
+            <w:tcBorders>
+              <w:bottom w:val="single" w:sz="8" w:space="0" w:color="000000"/>
+            </w:tcBorders>
+            <w:shd w:val="clear" w:color="auto" w:fill="E7E6E6"/>
+            <w:vAlign w:val="center"/>
+          </w:tcPr>
           <w:p>
             <w:pPr>
               <w:pStyle w:val="Compact"/>
@@ -39826,7 +40317,13 @@
           </w:p>
         </w:tc>
         <w:tc>
-          <w:tcPr/>
+          <w:tcPr>
+            <w:tcBorders>
+              <w:bottom w:val="single" w:sz="8" w:space="0" w:color="000000"/>
+            </w:tcBorders>
+            <w:shd w:val="clear" w:color="auto" w:fill="E7E6E6"/>
+            <w:vAlign w:val="center"/>
+          </w:tcPr>
           <w:p>
             <w:pPr>
               <w:pStyle w:val="Compact"/>
@@ -39842,7 +40339,13 @@
           </w:p>
         </w:tc>
         <w:tc>
-          <w:tcPr/>
+          <w:tcPr>
+            <w:tcBorders>
+              <w:bottom w:val="single" w:sz="8" w:space="0" w:color="000000"/>
+            </w:tcBorders>
+            <w:shd w:val="clear" w:color="auto" w:fill="E7E6E6"/>
+            <w:vAlign w:val="center"/>
+          </w:tcPr>
           <w:p>
             <w:pPr>
               <w:pStyle w:val="Compact"/>
@@ -39858,7 +40361,13 @@
           </w:p>
         </w:tc>
         <w:tc>
-          <w:tcPr/>
+          <w:tcPr>
+            <w:tcBorders>
+              <w:bottom w:val="single" w:sz="8" w:space="0" w:color="000000"/>
+            </w:tcBorders>
+            <w:shd w:val="clear" w:color="auto" w:fill="E7E6E6"/>
+            <w:vAlign w:val="center"/>
+          </w:tcPr>
           <w:p>
             <w:pPr>
               <w:pStyle w:val="Compact"/>
@@ -39875,6 +40384,9 @@
         </w:tc>
       </w:tr>
       <w:tr>
+        <w:trPr>
+          <w:cantSplit/>
+        </w:trPr>
         <w:tc>
           <w:tcPr/>
           <w:p>
@@ -39939,6 +40451,9 @@
         </w:tc>
       </w:tr>
       <w:tr>
+        <w:trPr>
+          <w:cantSplit/>
+        </w:trPr>
         <w:tc>
           <w:tcPr/>
           <w:p>
@@ -40003,6 +40518,9 @@
         </w:tc>
       </w:tr>
       <w:tr>
+        <w:trPr>
+          <w:cantSplit/>
+        </w:trPr>
         <w:tc>
           <w:tcPr/>
           <w:p>
@@ -40075,8 +40593,8 @@
         <w:t xml:space="preserve">The publication strategy is aligned with the progression of the research. The current stage work establishes the conceptual and technical foundation, while the next stage work will strengthen the framework through formal analysis and comprehensive empirical validation.</w:t>
       </w:r>
     </w:p>
-    <w:bookmarkEnd w:id="163"/>
-    <w:bookmarkStart w:id="166" w:name="research-plan"/>
+    <w:bookmarkEnd w:id="166"/>
+    <w:bookmarkStart w:id="169" w:name="research-plan"/>
     <w:p>
       <w:pPr>
         <w:pStyle w:val="Heading1"/>
@@ -40093,7 +40611,7 @@
         <w:t xml:space="preserve">The research plan is divided into two major stages corresponding to current and next stage.</w:t>
       </w:r>
     </w:p>
-    <w:bookmarkStart w:id="164" w:name="current-stage-completed-and-current-work"/>
+    <w:bookmarkStart w:id="167" w:name="current-stage-completed-and-current-work"/>
     <w:p>
       <w:pPr>
         <w:pStyle w:val="Heading2"/>
@@ -40118,8 +40636,8 @@
         <w:t xml:space="preserve">RO1–RO4 have been implemented at prototype level and initially validated through the HALAH prototype (Chapter 7), and a first version of RO5 (expiry and revocation) is already operational.</w:t>
       </w:r>
     </w:p>
-    <w:bookmarkEnd w:id="164"/>
-    <w:bookmarkStart w:id="165" w:name="next-stage-planned-work"/>
+    <w:bookmarkEnd w:id="167"/>
+    <w:bookmarkStart w:id="168" w:name="next-stage-planned-work"/>
     <w:p>
       <w:pPr>
         <w:pStyle w:val="Heading2"/>
@@ -40262,10 +40780,17 @@
       </w:tblGrid>
       <w:tr>
         <w:trPr>
+          <w:cantSplit/>
           <w:tblHeader w:val="on"/>
         </w:trPr>
         <w:tc>
-          <w:tcPr/>
+          <w:tcPr>
+            <w:tcBorders>
+              <w:bottom w:val="single" w:sz="8" w:space="0" w:color="000000"/>
+            </w:tcBorders>
+            <w:shd w:val="clear" w:color="auto" w:fill="E7E6E6"/>
+            <w:vAlign w:val="center"/>
+          </w:tcPr>
           <w:p>
             <w:pPr>
               <w:pStyle w:val="Compact"/>
@@ -40281,7 +40806,13 @@
           </w:p>
         </w:tc>
         <w:tc>
-          <w:tcPr/>
+          <w:tcPr>
+            <w:tcBorders>
+              <w:bottom w:val="single" w:sz="8" w:space="0" w:color="000000"/>
+            </w:tcBorders>
+            <w:shd w:val="clear" w:color="auto" w:fill="E7E6E6"/>
+            <w:vAlign w:val="center"/>
+          </w:tcPr>
           <w:p>
             <w:pPr>
               <w:pStyle w:val="Compact"/>
@@ -40297,7 +40828,13 @@
           </w:p>
         </w:tc>
         <w:tc>
-          <w:tcPr/>
+          <w:tcPr>
+            <w:tcBorders>
+              <w:bottom w:val="single" w:sz="8" w:space="0" w:color="000000"/>
+            </w:tcBorders>
+            <w:shd w:val="clear" w:color="auto" w:fill="E7E6E6"/>
+            <w:vAlign w:val="center"/>
+          </w:tcPr>
           <w:p>
             <w:pPr>
               <w:pStyle w:val="Compact"/>
@@ -40314,6 +40851,9 @@
         </w:tc>
       </w:tr>
       <w:tr>
+        <w:trPr>
+          <w:cantSplit/>
+        </w:trPr>
         <w:tc>
           <w:tcPr/>
           <w:p>
@@ -40362,6 +40902,9 @@
         </w:tc>
       </w:tr>
       <w:tr>
+        <w:trPr>
+          <w:cantSplit/>
+        </w:trPr>
         <w:tc>
           <w:tcPr/>
           <w:p>
@@ -40410,6 +40953,9 @@
         </w:tc>
       </w:tr>
       <w:tr>
+        <w:trPr>
+          <w:cantSplit/>
+        </w:trPr>
         <w:tc>
           <w:tcPr/>
           <w:p>
@@ -40458,6 +41004,9 @@
         </w:tc>
       </w:tr>
       <w:tr>
+        <w:trPr>
+          <w:cantSplit/>
+        </w:trPr>
         <w:tc>
           <w:tcPr/>
           <w:p>
@@ -40719,9 +41268,9 @@
         <w:t xml:space="preserve">that trust should no longer apply.</w:t>
       </w:r>
     </w:p>
-    <w:bookmarkEnd w:id="165"/>
-    <w:bookmarkEnd w:id="166"/>
-    <w:bookmarkStart w:id="167" w:name="references"/>
+    <w:bookmarkEnd w:id="168"/>
+    <w:bookmarkEnd w:id="169"/>
+    <w:bookmarkStart w:id="170" w:name="references"/>
     <w:p>
       <w:pPr>
         <w:pStyle w:val="Heading1"/>
@@ -41572,7 +42121,7 @@
         <w:t xml:space="preserve">[42] W3C. Verifiable Credentials Data Model v2.0. W3C Recommendation, 2025. https://www.w3.org/TR/vc-data-model-2.0/.</w:t>
       </w:r>
     </w:p>
-    <w:bookmarkEnd w:id="167"/>
+    <w:bookmarkEnd w:id="170"/>
     <w:sectPr>
       <w:footnotePr>
         <w:numRestart w:val="eachSect"/>
@@ -46056,9 +46605,9 @@
         <w:insideV w:color="000000" w:space="0" w:sz="4" w:val="single"/>
       </w:tblBorders>
       <w:tblCellMar>
-        <w:top w:type="dxa" w:w="0"/>
+        <w:top w:type="dxa" w:w="40"/>
         <w:left w:type="dxa" w:w="108"/>
-        <w:bottom w:type="dxa" w:w="0"/>
+        <w:bottom w:type="dxa" w:w="40"/>
         <w:right w:type="dxa" w:w="108"/>
       </w:tblCellMar>
     </w:tblPr>

</xml_diff>

<commit_message>
CA2 Word report: restore colour design for Figures 1-6 with fixes
- Figure 1 original; Figures 2, 3, 5, 6 re-drawn in the same Mermaid style,
  colours and font with spelling, subscript and readability fixes
- Flowcharts 7-12 stay black and white; change log updated

Co-Authored-By: Claude Opus 5.5 <noreply@anthropic.com>
Claude-Session: https://claude.ai/code/session_017h1Gwx95j2svhJWPEddHRu
</commit_message>
<xml_diff>
--- a/review/word/Yasir_CA2_Report_CLEAN.docx
+++ b/review/word/Yasir_CA2_Report_CLEAN.docx
@@ -1012,14 +1012,14 @@
       <w:r>
         <w:drawing>
           <wp:inline>
-            <wp:extent cx="5753100" cy="2741910"/>
+            <wp:extent cx="5465445" cy="3370858"/>
             <wp:effectExtent b="0" l="0" r="0" t="0"/>
             <wp:docPr descr="Figure 1: SLR Search String Definition" title="" id="17" name="Picture"/>
             <a:graphic>
               <a:graphicData uri="http://schemas.openxmlformats.org/drawingml/2006/picture">
                 <pic:pic>
                   <pic:nvPicPr>
-                    <pic:cNvPr descr="media_bw/fig01.png" id="18" name="Picture"/>
+                    <pic:cNvPr descr="media/fig01.png" id="18" name="Picture"/>
                     <pic:cNvPicPr>
                       <a:picLocks noChangeArrowheads="1" noChangeAspect="1"/>
                     </pic:cNvPicPr>
@@ -1033,7 +1033,7 @@
                   <pic:spPr bwMode="auto">
                     <a:xfrm>
                       <a:off x="0" y="0"/>
-                      <a:ext cx="5753100" cy="2741910"/>
+                      <a:ext cx="5465445" cy="3370858"/>
                     </a:xfrm>
                     <a:prstGeom prst="rect">
                       <a:avLst/>
@@ -1351,14 +1351,14 @@
       <w:r>
         <w:drawing>
           <wp:inline>
-            <wp:extent cx="5753100" cy="3499976"/>
+            <wp:extent cx="5753100" cy="2898564"/>
             <wp:effectExtent b="0" l="0" r="0" t="0"/>
             <wp:docPr descr="Figure 2: PRISMA Study Selection Summary" title="" id="23" name="Picture"/>
             <a:graphic>
               <a:graphicData uri="http://schemas.openxmlformats.org/drawingml/2006/picture">
                 <pic:pic>
                   <pic:nvPicPr>
-                    <pic:cNvPr descr="media_bw/fig02.png" id="24" name="Picture"/>
+                    <pic:cNvPr descr="media_col/fig02.png" id="24" name="Picture"/>
                     <pic:cNvPicPr>
                       <a:picLocks noChangeArrowheads="1" noChangeAspect="1"/>
                     </pic:cNvPicPr>
@@ -1372,7 +1372,7 @@
                   <pic:spPr bwMode="auto">
                     <a:xfrm>
                       <a:off x="0" y="0"/>
-                      <a:ext cx="5753100" cy="3499976"/>
+                      <a:ext cx="5753100" cy="2898564"/>
                     </a:xfrm>
                     <a:prstGeom prst="rect">
                       <a:avLst/>
@@ -8976,14 +8976,14 @@
       <w:r>
         <w:drawing>
           <wp:inline>
-            <wp:extent cx="5753100" cy="5261416"/>
+            <wp:extent cx="5753100" cy="5228452"/>
             <wp:effectExtent b="0" l="0" r="0" t="0"/>
             <wp:docPr descr="Figure 3: Layered MVC Architecture and Component Decomposition of the HALAH Framework" title="" id="59" name="Picture"/>
             <a:graphic>
               <a:graphicData uri="http://schemas.openxmlformats.org/drawingml/2006/picture">
                 <pic:pic>
                   <pic:nvPicPr>
-                    <pic:cNvPr descr="media_bw/fig03.png" id="60" name="Picture"/>
+                    <pic:cNvPr descr="media_col/fig03.png" id="60" name="Picture"/>
                     <pic:cNvPicPr>
                       <a:picLocks noChangeArrowheads="1" noChangeAspect="1"/>
                     </pic:cNvPicPr>
@@ -8997,7 +8997,7 @@
                   <pic:spPr bwMode="auto">
                     <a:xfrm>
                       <a:off x="0" y="0"/>
-                      <a:ext cx="5753100" cy="5261416"/>
+                      <a:ext cx="5753100" cy="5228452"/>
                     </a:xfrm>
                     <a:prstGeom prst="rect">
                       <a:avLst/>
@@ -9472,14 +9472,14 @@
       <w:r>
         <w:drawing>
           <wp:inline>
-            <wp:extent cx="3300984" cy="7074844"/>
+            <wp:extent cx="2880360" cy="7676010"/>
             <wp:effectExtent b="0" l="0" r="0" t="0"/>
             <wp:docPr descr="Figure 4: Trust Predicate Evaluation and Authorisation Decision Flow" title="" id="63" name="Picture"/>
             <a:graphic>
               <a:graphicData uri="http://schemas.openxmlformats.org/drawingml/2006/picture">
                 <pic:pic>
                   <pic:nvPicPr>
-                    <pic:cNvPr descr="media_bw/fig05.png" id="64" name="Picture"/>
+                    <pic:cNvPr descr="media_col/fig05.png" id="64" name="Picture"/>
                     <pic:cNvPicPr>
                       <a:picLocks noChangeArrowheads="1" noChangeAspect="1"/>
                     </pic:cNvPicPr>
@@ -9493,7 +9493,7 @@
                   <pic:spPr bwMode="auto">
                     <a:xfrm>
                       <a:off x="0" y="0"/>
-                      <a:ext cx="3300984" cy="7074844"/>
+                      <a:ext cx="2880360" cy="7676010"/>
                     </a:xfrm>
                     <a:prstGeom prst="rect">
                       <a:avLst/>
@@ -10219,14 +10219,14 @@
       <w:r>
         <w:drawing>
           <wp:inline>
-            <wp:extent cx="2505456" cy="7676543"/>
+            <wp:extent cx="2121408" cy="7666389"/>
             <wp:effectExtent b="0" l="0" r="0" t="0"/>
             <wp:docPr descr="Figure 5: End-to-End Workflow of Trust-Oriented Consent Authorisation Framework" title="" id="70" name="Picture"/>
             <a:graphic>
               <a:graphicData uri="http://schemas.openxmlformats.org/drawingml/2006/picture">
                 <pic:pic>
                   <pic:nvPicPr>
-                    <pic:cNvPr descr="media_bw/fig06.png" id="71" name="Picture"/>
+                    <pic:cNvPr descr="media_col/fig06.png" id="71" name="Picture"/>
                     <pic:cNvPicPr>
                       <a:picLocks noChangeArrowheads="1" noChangeAspect="1"/>
                     </pic:cNvPicPr>
@@ -10240,7 +10240,7 @@
                   <pic:spPr bwMode="auto">
                     <a:xfrm>
                       <a:off x="0" y="0"/>
-                      <a:ext cx="2505456" cy="7676543"/>
+                      <a:ext cx="2121408" cy="7666389"/>
                     </a:xfrm>
                     <a:prstGeom prst="rect">
                       <a:avLst/>
@@ -15371,7 +15371,7 @@
       <w:r>
         <w:drawing>
           <wp:inline>
-            <wp:extent cx="4416552" cy="7572102"/>
+            <wp:extent cx="4480560" cy="7681842"/>
             <wp:effectExtent b="0" l="0" r="0" t="0"/>
             <wp:docPr descr="Figure 7: RO2 workflow for decentralised identity and authority verification" title="" id="92" name="Picture"/>
             <a:graphic>
@@ -15392,7 +15392,7 @@
                   <pic:spPr bwMode="auto">
                     <a:xfrm>
                       <a:off x="0" y="0"/>
-                      <a:ext cx="4416552" cy="7572102"/>
+                      <a:ext cx="4480560" cy="7681842"/>
                     </a:xfrm>
                     <a:prstGeom prst="rect">
                       <a:avLst/>

</xml_diff>

<commit_message>
CA2 Word report: Figures 3 and 4 in their original colour design
- Figure 3 re-drawn in the original banded layout and colours, readable
- Figure 4 restored (no longer deleted) and re-drawn readable in the same design
- Clean copy now numbers figures 1-18; change log updated

Co-Authored-By: Claude Opus 5.5 <noreply@anthropic.com>
Claude-Session: https://claude.ai/code/session_017h1Gwx95j2svhJWPEddHRu
</commit_message>
<xml_diff>
--- a/review/word/Yasir_CA2_Report_CLEAN.docx
+++ b/review/word/Yasir_CA2_Report_CLEAN.docx
@@ -8725,7 +8725,7 @@
     </w:p>
     <w:bookmarkEnd w:id="56"/>
     <w:bookmarkEnd w:id="57"/>
-    <w:bookmarkStart w:id="82" w:name="research-architecture-mvc"/>
+    <w:bookmarkStart w:id="85" w:name="research-architecture-mvc"/>
     <w:p>
       <w:pPr>
         <w:pStyle w:val="Heading1"/>
@@ -8863,7 +8863,7 @@
         <w:t xml:space="preserve">.</w:t>
       </w:r>
     </w:p>
-    <w:bookmarkStart w:id="68" w:name="X4c5c546815ea228e4b76521fee5c855eb2a3a8b"/>
+    <w:bookmarkStart w:id="71" w:name="X4c5c546815ea228e4b76521fee5c855eb2a3a8b"/>
     <w:p>
       <w:pPr>
         <w:pStyle w:val="Heading2"/>
@@ -8976,7 +8976,7 @@
       <w:r>
         <w:drawing>
           <wp:inline>
-            <wp:extent cx="5753100" cy="5228452"/>
+            <wp:extent cx="5753100" cy="5884501"/>
             <wp:effectExtent b="0" l="0" r="0" t="0"/>
             <wp:docPr descr="Figure 3: Layered MVC Architecture and Component Decomposition of the HALAH Framework" title="" id="59" name="Picture"/>
             <a:graphic>
@@ -8997,7 +8997,7 @@
                   <pic:spPr bwMode="auto">
                     <a:xfrm>
                       <a:off x="0" y="0"/>
-                      <a:ext cx="5753100" cy="5228452"/>
+                      <a:ext cx="5753100" cy="5884501"/>
                     </a:xfrm>
                     <a:prstGeom prst="rect">
                       <a:avLst/>
@@ -9024,7 +9024,7 @@
         <w:t xml:space="preserve">Figure 3: Layered MVC Architecture and Component Decomposition of the HALAH Framework</w:t>
       </w:r>
     </w:p>
-    <w:bookmarkStart w:id="61" w:name="mvc-component-decomposition"/>
+    <w:bookmarkStart w:id="64" w:name="mvc-component-decomposition"/>
     <w:p>
       <w:pPr>
         <w:pStyle w:val="Heading3"/>
@@ -9038,431 +9038,7 @@
         <w:pStyle w:val="FirstParagraph"/>
       </w:pPr>
       <w:r>
-        <w:t xml:space="preserve">The three architectural layers are further decomposed into functional components, each corresponding to a distinct responsibility within the trust-oriented authorisation process. The View is decomposed according to the principal stakeholder roles. The patient interface supports consent specification and consent-related actions. The guardian or other authorised-participant interface supports independent approval. The healthcare professional interface supports authorised data-access requests. The auditor interface supports inspection of authorisation evidence and audit history. These interfaces represent different interaction responsibilities but share the same architectural principle: none of them independently determines whether access should be granted.</w:t>
-      </w:r>
-    </w:p>
-    <w:p>
-      <w:pPr>
-        <w:pStyle w:val="BodyText"/>
-      </w:pPr>
-      <w:r>
-        <w:t xml:space="preserve">The Controller is decomposed into six principal security functions.</w:t>
-      </w:r>
-      <w:r>
-        <w:t xml:space="preserve"> </w:t>
-      </w:r>
-      <w:r>
-        <w:rPr>
-          <w:i/>
-          <w:iCs/>
-        </w:rPr>
-        <w:t xml:space="preserve">Identity Verification</w:t>
-      </w:r>
-      <w:r>
-        <w:t xml:space="preserve"> </w:t>
-      </w:r>
-      <w:r>
-        <w:t xml:space="preserve">establishes whether a participant can be identified through the relevant decentralised identity mechanism.</w:t>
-      </w:r>
-      <w:r>
-        <w:t xml:space="preserve"> </w:t>
-      </w:r>
-      <w:r>
-        <w:rPr>
-          <w:i/>
-          <w:iCs/>
-        </w:rPr>
-        <w:t xml:space="preserve">Authority Verification</w:t>
-      </w:r>
-      <w:r>
-        <w:t xml:space="preserve"> </w:t>
-      </w:r>
-      <w:r>
-        <w:t xml:space="preserve">evaluates whether the participant possesses appropriate evidence concerning the required role or authority.</w:t>
-      </w:r>
-      <w:r>
-        <w:t xml:space="preserve"> </w:t>
-      </w:r>
-      <w:r>
-        <w:rPr>
-          <w:i/>
-          <w:iCs/>
-        </w:rPr>
-        <w:t xml:space="preserve">Approval Aggregation</w:t>
-      </w:r>
-      <w:r>
-        <w:t xml:space="preserve"> </w:t>
-      </w:r>
-      <w:r>
-        <w:t xml:space="preserve">determines whether independently verified approvals satisfy the predefined threshold.</w:t>
-      </w:r>
-      <w:r>
-        <w:t xml:space="preserve"> </w:t>
-      </w:r>
-      <w:r>
-        <w:rPr>
-          <w:i/>
-          <w:iCs/>
-        </w:rPr>
-        <w:t xml:space="preserve">Policy Enforcement</w:t>
-      </w:r>
-      <w:r>
-        <w:t xml:space="preserve"> </w:t>
-      </w:r>
-      <w:r>
-        <w:t xml:space="preserve">evaluates whether the requested purpose and data scope comply with the consent policy.</w:t>
-      </w:r>
-      <w:r>
-        <w:t xml:space="preserve"> </w:t>
-      </w:r>
-      <w:r>
-        <w:rPr>
-          <w:i/>
-          <w:iCs/>
-        </w:rPr>
-        <w:t xml:space="preserve">Decision</w:t>
-      </w:r>
-      <w:r>
-        <w:t xml:space="preserve"> </w:t>
-      </w:r>
-      <w:r>
-        <w:rPr>
-          <w:i/>
-          <w:iCs/>
-        </w:rPr>
-        <w:t xml:space="preserve">Engine</w:t>
-      </w:r>
-      <w:r>
-        <w:t xml:space="preserve"> </w:t>
-      </w:r>
-      <w:r>
-        <w:t xml:space="preserve">combines the resulting predicates into the final authorisation decision. Finally,</w:t>
-      </w:r>
-      <w:r>
-        <w:t xml:space="preserve"> </w:t>
-      </w:r>
-      <w:r>
-        <w:rPr>
-          <w:i/>
-          <w:iCs/>
-        </w:rPr>
-        <w:t xml:space="preserve">Audit</w:t>
-      </w:r>
-      <w:r>
-        <w:t xml:space="preserve"> </w:t>
-      </w:r>
-      <w:r>
-        <w:rPr>
-          <w:i/>
-          <w:iCs/>
-        </w:rPr>
-        <w:t xml:space="preserve">Coordination</w:t>
-      </w:r>
-      <w:r>
-        <w:t xml:space="preserve"> </w:t>
-      </w:r>
-      <w:r>
-        <w:t xml:space="preserve">records the relevant evidence and decision events.</w:t>
-      </w:r>
-    </w:p>
-    <w:p>
-      <w:pPr>
-        <w:pStyle w:val="BodyText"/>
-      </w:pPr>
-      <w:r>
-        <w:t xml:space="preserve">The Model is decomposed into seven principal state representations. The DID component represents decentralised identity information; the VC component represents credential and authority evidence; the Consent component represents the structured patient authorisation object; the Approval component represents verified multi-party approval evidence; the Policy component represents purpose and data-scope constraints; the Evidence component represents evidence generated throughout the authorisation process; and the Lifecycle component represents the current state of the consent object and its permissible transitions.</w:t>
-      </w:r>
-    </w:p>
-    <w:p>
-      <w:pPr>
-        <w:pStyle w:val="BodyText"/>
-      </w:pPr>
-      <w:r>
-        <w:t xml:space="preserve">This decomposition establishes an explicit distinction between</w:t>
-      </w:r>
-      <w:r>
-        <w:t xml:space="preserve"> </w:t>
-      </w:r>
-      <w:r>
-        <w:rPr>
-          <w:i/>
-          <w:iCs/>
-        </w:rPr>
-        <w:t xml:space="preserve">state</w:t>
-      </w:r>
-      <w:r>
-        <w:t xml:space="preserve">,</w:t>
-      </w:r>
-      <w:r>
-        <w:t xml:space="preserve"> </w:t>
-      </w:r>
-      <w:r>
-        <w:rPr>
-          <w:i/>
-          <w:iCs/>
-        </w:rPr>
-        <w:t xml:space="preserve">interaction</w:t>
-      </w:r>
-      <w:r>
-        <w:t xml:space="preserve">, and</w:t>
-      </w:r>
-      <w:r>
-        <w:t xml:space="preserve"> </w:t>
-      </w:r>
-      <w:r>
-        <w:rPr>
-          <w:i/>
-          <w:iCs/>
-        </w:rPr>
-        <w:t xml:space="preserve">enforcement</w:t>
-      </w:r>
-      <w:r>
-        <w:t xml:space="preserve">. The Model stores and represents security-relevant state, the View expresses stakeholder actions, and the Controller determines whether those actions satisfy the required trust conditions.</w:t>
-      </w:r>
-    </w:p>
-    <w:bookmarkEnd w:id="61"/>
-    <w:bookmarkStart w:id="65" w:name="trust-evaluation-across-the-mvc-layers"/>
-    <w:p>
-      <w:pPr>
-        <w:pStyle w:val="Heading3"/>
-      </w:pPr>
-      <w:r>
-        <w:t xml:space="preserve">5.1.2 Trust Evaluation Across the MVC Layers</w:t>
-      </w:r>
-    </w:p>
-    <w:p>
-      <w:pPr>
-        <w:pStyle w:val="FirstParagraph"/>
-      </w:pPr>
-      <w:r>
-        <w:t xml:space="preserve">The architectural layers cooperate through a controlled authorisation sequence rather than through unrestricted direct communication. The relationship between the MVC components and the trust predicates introduced by SRQ1–SRQ5 is illustrated in Figure 4.</w:t>
-      </w:r>
-    </w:p>
-    <w:p>
-      <w:pPr>
-        <w:pStyle w:val="BodyText"/>
-      </w:pPr>
-      <w:r>
-        <w:t xml:space="preserve">Figure 4 provides the logical relationship between the architectural components and the integrated trust model. A healthcare data-access request is not evaluated according to a single authentication event. Instead, the Controller coordinates a sequence of trust predicates representing the conditions established by SRQ1–SRQ5.</w:t>
-      </w:r>
-    </w:p>
-    <w:p>
-      <w:pPr>
-        <w:pStyle w:val="BodyText"/>
-      </w:pPr>
-      <w:r>
-        <w:t xml:space="preserve">The first condition,</w:t>
-      </w:r>
-      <w:r>
-        <w:t xml:space="preserve"> </w:t>
-      </w:r>
-      <w:r>
-        <w:rPr>
-          <w:i/>
-          <w:iCs/>
-        </w:rPr>
-        <w:t xml:space="preserve">V</w:t>
-      </w:r>
-      <w:r>
-        <w:rPr>
-          <w:vertAlign w:val="subscript"/>
-        </w:rPr>
-        <w:t xml:space="preserve">I</w:t>
-      </w:r>
-      <w:r>
-        <w:t xml:space="preserve">(</w:t>
-      </w:r>
-      <w:r>
-        <w:rPr>
-          <w:i/>
-          <w:iCs/>
-        </w:rPr>
-        <w:t xml:space="preserve">u</w:t>
-      </w:r>
-      <w:r>
-        <w:t xml:space="preserve">), determines whether the requesting participant possesses valid identity and authority evidence. The second condition,</w:t>
-      </w:r>
-      <w:r>
-        <w:t xml:space="preserve"> </w:t>
-      </w:r>
-      <w:r>
-        <w:rPr>
-          <w:i/>
-          <w:iCs/>
-        </w:rPr>
-        <w:t xml:space="preserve">V</w:t>
-      </w:r>
-      <w:r>
-        <w:rPr>
-          <w:vertAlign w:val="subscript"/>
-        </w:rPr>
-        <w:t xml:space="preserve">A</w:t>
-      </w:r>
-      <w:r>
-        <w:t xml:space="preserve">(</w:t>
-      </w:r>
-      <w:r>
-        <w:rPr>
-          <w:i/>
-          <w:iCs/>
-        </w:rPr>
-        <w:t xml:space="preserve">C</w:t>
-      </w:r>
-      <w:r>
-        <w:t xml:space="preserve">), determines whether the required independently verified participants have collectively satisfied the authorisation threshold. The third condition,</w:t>
-      </w:r>
-      <w:r>
-        <w:t xml:space="preserve"> </w:t>
-      </w:r>
-      <w:r>
-        <w:rPr>
-          <w:i/>
-          <w:iCs/>
-        </w:rPr>
-        <w:t xml:space="preserve">V</w:t>
-      </w:r>
-      <w:r>
-        <w:rPr>
-          <w:vertAlign w:val="subscript"/>
-        </w:rPr>
-        <w:t xml:space="preserve">P</w:t>
-      </w:r>
-      <w:r>
-        <w:t xml:space="preserve">(</w:t>
-      </w:r>
-      <w:r>
-        <w:rPr>
-          <w:i/>
-          <w:iCs/>
-        </w:rPr>
-        <w:t xml:space="preserve">C, R</w:t>
-      </w:r>
-      <w:r>
-        <w:t xml:space="preserve">), determines whether the requested operation complies with the consent policy, including purpose and data-scope restrictions. The fourth condition,</w:t>
-      </w:r>
-      <w:r>
-        <w:t xml:space="preserve"> </w:t>
-      </w:r>
-      <w:r>
-        <w:rPr>
-          <w:i/>
-          <w:iCs/>
-        </w:rPr>
-        <w:t xml:space="preserve">V</w:t>
-      </w:r>
-      <w:r>
-        <w:rPr>
-          <w:vertAlign w:val="subscript"/>
-        </w:rPr>
-        <w:t xml:space="preserve">T</w:t>
-      </w:r>
-      <w:r>
-        <w:t xml:space="preserve">(</w:t>
-      </w:r>
-      <w:r>
-        <w:rPr>
-          <w:i/>
-          <w:iCs/>
-        </w:rPr>
-        <w:t xml:space="preserve">C, t</w:t>
-      </w:r>
-      <w:r>
-        <w:t xml:space="preserve">), determines whether the consent remains valid at the time of the request. The fifth condition,</w:t>
-      </w:r>
-      <w:r>
-        <w:t xml:space="preserve"> </w:t>
-      </w:r>
-      <w:r>
-        <w:rPr>
-          <w:i/>
-          <w:iCs/>
-        </w:rPr>
-        <w:t xml:space="preserve">V</w:t>
-      </w:r>
-      <w:r>
-        <w:rPr>
-          <w:vertAlign w:val="subscript"/>
-        </w:rPr>
-        <w:t xml:space="preserve">L</w:t>
-      </w:r>
-      <w:r>
-        <w:t xml:space="preserve">(</w:t>
-      </w:r>
-      <w:r>
-        <w:rPr>
-          <w:i/>
-          <w:iCs/>
-        </w:rPr>
-        <w:t xml:space="preserve">C</w:t>
-      </w:r>
-      <w:r>
-        <w:t xml:space="preserve">), determines whether the consent remains in a valid lifecycle state.</w:t>
-      </w:r>
-    </w:p>
-    <w:p>
-      <w:pPr>
-        <w:pStyle w:val="BodyText"/>
-      </w:pPr>
-      <w:r>
-        <w:t xml:space="preserve">The integrated decision is therefore given by Eq. (24).</w:t>
-      </w:r>
-    </w:p>
-    <w:p>
-      <w:pPr>
-        <w:pStyle w:val="BodyText"/>
-      </w:pPr>
-      <w:r>
-        <w:t xml:space="preserve"> </w:t>
-      </w:r>
-    </w:p>
-    <w:p>
-      <w:pPr>
-        <w:pStyle w:val="BodyText"/>
-      </w:pPr>
-      <w:r>
-        <w:t xml:space="preserve">The Controller does not itself create these trust conditions. Instead, it evaluates evidence represented by the Model and coordinates the resulting decision. This distinction is important for the interpretation of the architecture: the Controller is a</w:t>
-      </w:r>
-      <w:r>
-        <w:t xml:space="preserve"> </w:t>
-      </w:r>
-      <w:r>
-        <w:rPr>
-          <w:i/>
-          <w:iCs/>
-        </w:rPr>
-        <w:t xml:space="preserve">decision-enforcement mechanism</w:t>
-      </w:r>
-      <w:r>
-        <w:t xml:space="preserve">, whereas the Model is a</w:t>
-      </w:r>
-      <w:r>
-        <w:t xml:space="preserve"> </w:t>
-      </w:r>
-      <w:r>
-        <w:rPr>
-          <w:i/>
-          <w:iCs/>
-        </w:rPr>
-        <w:t xml:space="preserve">representation of trust and governance state</w:t>
-      </w:r>
-      <w:r>
-        <w:t xml:space="preserve">.</w:t>
-      </w:r>
-    </w:p>
-    <w:p>
-      <w:pPr>
-        <w:pStyle w:val="BodyText"/>
-      </w:pPr>
-      <w:r>
-        <w:t xml:space="preserve">If any required predicate evaluates to false, the decision is DENY (Eq. (18)).</w:t>
-      </w:r>
-    </w:p>
-    <w:p>
-      <w:pPr>
-        <w:pStyle w:val="BodyText"/>
-      </w:pPr>
-      <w:r>
-        <w:t xml:space="preserve"> </w:t>
+        <w:t xml:space="preserve">The three architectural layers are further decomposed into functional components, each corresponding to a distinct responsibility within the trust-oriented authorisation process. Figure 4 presents this decomposition. The View is decomposed according to the principal stakeholder roles. The patient interface supports consent specification and consent-related actions. The guardian or other authorised-participant interface supports independent approval. The healthcare professional interface supports authorised data-access requests. The auditor interface supports inspection of authorisation evidence and audit history. These interfaces represent different interaction responsibilities but share the same architectural principle: none of them independently determines whether access should be granted.</w:t>
       </w:r>
     </w:p>
     <w:p>
@@ -9472,20 +9048,499 @@
       <w:r>
         <w:drawing>
           <wp:inline>
-            <wp:extent cx="2880360" cy="7676010"/>
+            <wp:extent cx="5753100" cy="3155240"/>
             <wp:effectExtent b="0" l="0" r="0" t="0"/>
-            <wp:docPr descr="Figure 4: Trust Predicate Evaluation and Authorisation Decision Flow" title="" id="63" name="Picture"/>
+            <wp:docPr descr="Figure 4: Functional Decomposition of the MVC Components" title="" id="62" name="Picture"/>
             <a:graphic>
               <a:graphicData uri="http://schemas.openxmlformats.org/drawingml/2006/picture">
                 <pic:pic>
                   <pic:nvPicPr>
-                    <pic:cNvPr descr="media_col/fig05.png" id="64" name="Picture"/>
+                    <pic:cNvPr descr="media_col/fig04.png" id="63" name="Picture"/>
                     <pic:cNvPicPr>
                       <a:picLocks noChangeArrowheads="1" noChangeAspect="1"/>
                     </pic:cNvPicPr>
                   </pic:nvPicPr>
                   <pic:blipFill>
-                    <a:blip r:embed="rId62"/>
+                    <a:blip r:embed="rId61"/>
+                    <a:stretch>
+                      <a:fillRect/>
+                    </a:stretch>
+                  </pic:blipFill>
+                  <pic:spPr bwMode="auto">
+                    <a:xfrm>
+                      <a:off x="0" y="0"/>
+                      <a:ext cx="5753100" cy="3155240"/>
+                    </a:xfrm>
+                    <a:prstGeom prst="rect">
+                      <a:avLst/>
+                    </a:prstGeom>
+                    <a:noFill/>
+                    <a:ln w="9525">
+                      <a:noFill/>
+                      <a:headEnd/>
+                      <a:tailEnd/>
+                    </a:ln>
+                  </pic:spPr>
+                </pic:pic>
+              </a:graphicData>
+            </a:graphic>
+          </wp:inline>
+        </w:drawing>
+      </w:r>
+    </w:p>
+    <w:p>
+      <w:pPr>
+        <w:pStyle w:val="ImageCaption"/>
+      </w:pPr>
+      <w:r>
+        <w:t xml:space="preserve">Figure 4: Functional Decomposition of the MVC Components</w:t>
+      </w:r>
+    </w:p>
+    <w:p>
+      <w:pPr>
+        <w:pStyle w:val="BodyText"/>
+      </w:pPr>
+      <w:r>
+        <w:t xml:space="preserve">The Controller is decomposed into six principal security functions.</w:t>
+      </w:r>
+      <w:r>
+        <w:t xml:space="preserve"> </w:t>
+      </w:r>
+      <w:r>
+        <w:rPr>
+          <w:i/>
+          <w:iCs/>
+        </w:rPr>
+        <w:t xml:space="preserve">Identity Verification</w:t>
+      </w:r>
+      <w:r>
+        <w:t xml:space="preserve"> </w:t>
+      </w:r>
+      <w:r>
+        <w:t xml:space="preserve">establishes whether a participant can be identified through the relevant decentralised identity mechanism.</w:t>
+      </w:r>
+      <w:r>
+        <w:t xml:space="preserve"> </w:t>
+      </w:r>
+      <w:r>
+        <w:rPr>
+          <w:i/>
+          <w:iCs/>
+        </w:rPr>
+        <w:t xml:space="preserve">Authority Verification</w:t>
+      </w:r>
+      <w:r>
+        <w:t xml:space="preserve"> </w:t>
+      </w:r>
+      <w:r>
+        <w:t xml:space="preserve">evaluates whether the participant possesses appropriate evidence concerning the required role or authority.</w:t>
+      </w:r>
+      <w:r>
+        <w:t xml:space="preserve"> </w:t>
+      </w:r>
+      <w:r>
+        <w:rPr>
+          <w:i/>
+          <w:iCs/>
+        </w:rPr>
+        <w:t xml:space="preserve">Approval Aggregation</w:t>
+      </w:r>
+      <w:r>
+        <w:t xml:space="preserve"> </w:t>
+      </w:r>
+      <w:r>
+        <w:t xml:space="preserve">determines whether independently verified approvals satisfy the predefined threshold.</w:t>
+      </w:r>
+      <w:r>
+        <w:t xml:space="preserve"> </w:t>
+      </w:r>
+      <w:r>
+        <w:rPr>
+          <w:i/>
+          <w:iCs/>
+        </w:rPr>
+        <w:t xml:space="preserve">Policy Enforcement</w:t>
+      </w:r>
+      <w:r>
+        <w:t xml:space="preserve"> </w:t>
+      </w:r>
+      <w:r>
+        <w:t xml:space="preserve">evaluates whether the requested purpose and data scope comply with the consent policy.</w:t>
+      </w:r>
+      <w:r>
+        <w:t xml:space="preserve"> </w:t>
+      </w:r>
+      <w:r>
+        <w:rPr>
+          <w:i/>
+          <w:iCs/>
+        </w:rPr>
+        <w:t xml:space="preserve">Decision</w:t>
+      </w:r>
+      <w:r>
+        <w:t xml:space="preserve"> </w:t>
+      </w:r>
+      <w:r>
+        <w:rPr>
+          <w:i/>
+          <w:iCs/>
+        </w:rPr>
+        <w:t xml:space="preserve">Engine</w:t>
+      </w:r>
+      <w:r>
+        <w:t xml:space="preserve"> </w:t>
+      </w:r>
+      <w:r>
+        <w:t xml:space="preserve">combines the resulting predicates into the final authorisation decision. Finally,</w:t>
+      </w:r>
+      <w:r>
+        <w:t xml:space="preserve"> </w:t>
+      </w:r>
+      <w:r>
+        <w:rPr>
+          <w:i/>
+          <w:iCs/>
+        </w:rPr>
+        <w:t xml:space="preserve">Audit</w:t>
+      </w:r>
+      <w:r>
+        <w:t xml:space="preserve"> </w:t>
+      </w:r>
+      <w:r>
+        <w:rPr>
+          <w:i/>
+          <w:iCs/>
+        </w:rPr>
+        <w:t xml:space="preserve">Coordination</w:t>
+      </w:r>
+      <w:r>
+        <w:t xml:space="preserve"> </w:t>
+      </w:r>
+      <w:r>
+        <w:t xml:space="preserve">records the relevant evidence and decision events.</w:t>
+      </w:r>
+    </w:p>
+    <w:p>
+      <w:pPr>
+        <w:pStyle w:val="BodyText"/>
+      </w:pPr>
+      <w:r>
+        <w:t xml:space="preserve">The Model is decomposed into seven principal state representations. The DID component represents decentralised identity information; the VC component represents credential and authority evidence; the Consent component represents the structured patient authorisation object; the Approval component represents verified multi-party approval evidence; the Policy component represents purpose and data-scope constraints; the Evidence component represents evidence generated throughout the authorisation process; and the Lifecycle component represents the current state of the consent object and its permissible transitions.</w:t>
+      </w:r>
+    </w:p>
+    <w:p>
+      <w:pPr>
+        <w:pStyle w:val="BodyText"/>
+      </w:pPr>
+      <w:r>
+        <w:t xml:space="preserve">This decomposition establishes an explicit distinction between</w:t>
+      </w:r>
+      <w:r>
+        <w:t xml:space="preserve"> </w:t>
+      </w:r>
+      <w:r>
+        <w:rPr>
+          <w:i/>
+          <w:iCs/>
+        </w:rPr>
+        <w:t xml:space="preserve">state</w:t>
+      </w:r>
+      <w:r>
+        <w:t xml:space="preserve">,</w:t>
+      </w:r>
+      <w:r>
+        <w:t xml:space="preserve"> </w:t>
+      </w:r>
+      <w:r>
+        <w:rPr>
+          <w:i/>
+          <w:iCs/>
+        </w:rPr>
+        <w:t xml:space="preserve">interaction</w:t>
+      </w:r>
+      <w:r>
+        <w:t xml:space="preserve">, and</w:t>
+      </w:r>
+      <w:r>
+        <w:t xml:space="preserve"> </w:t>
+      </w:r>
+      <w:r>
+        <w:rPr>
+          <w:i/>
+          <w:iCs/>
+        </w:rPr>
+        <w:t xml:space="preserve">enforcement</w:t>
+      </w:r>
+      <w:r>
+        <w:t xml:space="preserve">. The Model stores and represents security-relevant state, the View expresses stakeholder actions, and the Controller determines whether those actions satisfy the required trust conditions.</w:t>
+      </w:r>
+    </w:p>
+    <w:bookmarkEnd w:id="64"/>
+    <w:bookmarkStart w:id="68" w:name="trust-evaluation-across-the-mvc-layers"/>
+    <w:p>
+      <w:pPr>
+        <w:pStyle w:val="Heading3"/>
+      </w:pPr>
+      <w:r>
+        <w:t xml:space="preserve">5.1.2 Trust Evaluation Across the MVC Layers</w:t>
+      </w:r>
+    </w:p>
+    <w:p>
+      <w:pPr>
+        <w:pStyle w:val="FirstParagraph"/>
+      </w:pPr>
+      <w:r>
+        <w:t xml:space="preserve">The architectural layers cooperate through a controlled authorisation sequence rather than through unrestricted direct communication. The relationship between the MVC components and the trust predicates introduced by SRQ1–SRQ5 is illustrated in Figure 5.</w:t>
+      </w:r>
+    </w:p>
+    <w:p>
+      <w:pPr>
+        <w:pStyle w:val="BodyText"/>
+      </w:pPr>
+      <w:r>
+        <w:t xml:space="preserve">Figure 5 provides the logical relationship between the architectural components and the integrated trust model. A healthcare data-access request is not evaluated according to a single authentication event. Instead, the Controller coordinates a sequence of trust predicates representing the conditions established by SRQ1–SRQ5.</w:t>
+      </w:r>
+    </w:p>
+    <w:p>
+      <w:pPr>
+        <w:pStyle w:val="BodyText"/>
+      </w:pPr>
+      <w:r>
+        <w:t xml:space="preserve">The first condition,</w:t>
+      </w:r>
+      <w:r>
+        <w:t xml:space="preserve"> </w:t>
+      </w:r>
+      <w:r>
+        <w:rPr>
+          <w:i/>
+          <w:iCs/>
+        </w:rPr>
+        <w:t xml:space="preserve">V</w:t>
+      </w:r>
+      <w:r>
+        <w:rPr>
+          <w:vertAlign w:val="subscript"/>
+        </w:rPr>
+        <w:t xml:space="preserve">I</w:t>
+      </w:r>
+      <w:r>
+        <w:t xml:space="preserve">(</w:t>
+      </w:r>
+      <w:r>
+        <w:rPr>
+          <w:i/>
+          <w:iCs/>
+        </w:rPr>
+        <w:t xml:space="preserve">u</w:t>
+      </w:r>
+      <w:r>
+        <w:t xml:space="preserve">), determines whether the requesting participant possesses valid identity and authority evidence. The second condition,</w:t>
+      </w:r>
+      <w:r>
+        <w:t xml:space="preserve"> </w:t>
+      </w:r>
+      <w:r>
+        <w:rPr>
+          <w:i/>
+          <w:iCs/>
+        </w:rPr>
+        <w:t xml:space="preserve">V</w:t>
+      </w:r>
+      <w:r>
+        <w:rPr>
+          <w:vertAlign w:val="subscript"/>
+        </w:rPr>
+        <w:t xml:space="preserve">A</w:t>
+      </w:r>
+      <w:r>
+        <w:t xml:space="preserve">(</w:t>
+      </w:r>
+      <w:r>
+        <w:rPr>
+          <w:i/>
+          <w:iCs/>
+        </w:rPr>
+        <w:t xml:space="preserve">C</w:t>
+      </w:r>
+      <w:r>
+        <w:t xml:space="preserve">), determines whether the required independently verified participants have collectively satisfied the authorisation threshold. The third condition,</w:t>
+      </w:r>
+      <w:r>
+        <w:t xml:space="preserve"> </w:t>
+      </w:r>
+      <w:r>
+        <w:rPr>
+          <w:i/>
+          <w:iCs/>
+        </w:rPr>
+        <w:t xml:space="preserve">V</w:t>
+      </w:r>
+      <w:r>
+        <w:rPr>
+          <w:vertAlign w:val="subscript"/>
+        </w:rPr>
+        <w:t xml:space="preserve">P</w:t>
+      </w:r>
+      <w:r>
+        <w:t xml:space="preserve">(</w:t>
+      </w:r>
+      <w:r>
+        <w:rPr>
+          <w:i/>
+          <w:iCs/>
+        </w:rPr>
+        <w:t xml:space="preserve">C, R</w:t>
+      </w:r>
+      <w:r>
+        <w:t xml:space="preserve">), determines whether the requested operation complies with the consent policy, including purpose and data-scope restrictions. The fourth condition,</w:t>
+      </w:r>
+      <w:r>
+        <w:t xml:space="preserve"> </w:t>
+      </w:r>
+      <w:r>
+        <w:rPr>
+          <w:i/>
+          <w:iCs/>
+        </w:rPr>
+        <w:t xml:space="preserve">V</w:t>
+      </w:r>
+      <w:r>
+        <w:rPr>
+          <w:vertAlign w:val="subscript"/>
+        </w:rPr>
+        <w:t xml:space="preserve">T</w:t>
+      </w:r>
+      <w:r>
+        <w:t xml:space="preserve">(</w:t>
+      </w:r>
+      <w:r>
+        <w:rPr>
+          <w:i/>
+          <w:iCs/>
+        </w:rPr>
+        <w:t xml:space="preserve">C, t</w:t>
+      </w:r>
+      <w:r>
+        <w:t xml:space="preserve">), determines whether the consent remains valid at the time of the request. The fifth condition,</w:t>
+      </w:r>
+      <w:r>
+        <w:t xml:space="preserve"> </w:t>
+      </w:r>
+      <w:r>
+        <w:rPr>
+          <w:i/>
+          <w:iCs/>
+        </w:rPr>
+        <w:t xml:space="preserve">V</w:t>
+      </w:r>
+      <w:r>
+        <w:rPr>
+          <w:vertAlign w:val="subscript"/>
+        </w:rPr>
+        <w:t xml:space="preserve">L</w:t>
+      </w:r>
+      <w:r>
+        <w:t xml:space="preserve">(</w:t>
+      </w:r>
+      <w:r>
+        <w:rPr>
+          <w:i/>
+          <w:iCs/>
+        </w:rPr>
+        <w:t xml:space="preserve">C</w:t>
+      </w:r>
+      <w:r>
+        <w:t xml:space="preserve">), determines whether the consent remains in a valid lifecycle state.</w:t>
+      </w:r>
+    </w:p>
+    <w:p>
+      <w:pPr>
+        <w:pStyle w:val="BodyText"/>
+      </w:pPr>
+      <w:r>
+        <w:t xml:space="preserve">The integrated decision is therefore given by Eq. (24).</w:t>
+      </w:r>
+    </w:p>
+    <w:p>
+      <w:pPr>
+        <w:pStyle w:val="BodyText"/>
+      </w:pPr>
+      <w:r>
+        <w:t xml:space="preserve"> </w:t>
+      </w:r>
+    </w:p>
+    <w:p>
+      <w:pPr>
+        <w:pStyle w:val="BodyText"/>
+      </w:pPr>
+      <w:r>
+        <w:t xml:space="preserve">The Controller does not itself create these trust conditions. Instead, it evaluates evidence represented by the Model and coordinates the resulting decision. This distinction is important for the interpretation of the architecture: the Controller is a</w:t>
+      </w:r>
+      <w:r>
+        <w:t xml:space="preserve"> </w:t>
+      </w:r>
+      <w:r>
+        <w:rPr>
+          <w:i/>
+          <w:iCs/>
+        </w:rPr>
+        <w:t xml:space="preserve">decision-enforcement mechanism</w:t>
+      </w:r>
+      <w:r>
+        <w:t xml:space="preserve">, whereas the Model is a</w:t>
+      </w:r>
+      <w:r>
+        <w:t xml:space="preserve"> </w:t>
+      </w:r>
+      <w:r>
+        <w:rPr>
+          <w:i/>
+          <w:iCs/>
+        </w:rPr>
+        <w:t xml:space="preserve">representation of trust and governance state</w:t>
+      </w:r>
+      <w:r>
+        <w:t xml:space="preserve">.</w:t>
+      </w:r>
+    </w:p>
+    <w:p>
+      <w:pPr>
+        <w:pStyle w:val="BodyText"/>
+      </w:pPr>
+      <w:r>
+        <w:t xml:space="preserve">If any required predicate evaluates to false, the decision is DENY (Eq. (18)).</w:t>
+      </w:r>
+    </w:p>
+    <w:p>
+      <w:pPr>
+        <w:pStyle w:val="BodyText"/>
+      </w:pPr>
+      <w:r>
+        <w:t xml:space="preserve"> </w:t>
+      </w:r>
+    </w:p>
+    <w:p>
+      <w:pPr>
+        <w:pStyle w:val="CaptionedFigure"/>
+      </w:pPr>
+      <w:r>
+        <w:drawing>
+          <wp:inline>
+            <wp:extent cx="2880360" cy="7676010"/>
+            <wp:effectExtent b="0" l="0" r="0" t="0"/>
+            <wp:docPr descr="Figure 5: Trust Predicate Evaluation and Authorisation Decision Flow" title="" id="66" name="Picture"/>
+            <a:graphic>
+              <a:graphicData uri="http://schemas.openxmlformats.org/drawingml/2006/picture">
+                <pic:pic>
+                  <pic:nvPicPr>
+                    <pic:cNvPr descr="media_col/fig05.png" id="67" name="Picture"/>
+                    <pic:cNvPicPr>
+                      <a:picLocks noChangeArrowheads="1" noChangeAspect="1"/>
+                    </pic:cNvPicPr>
+                  </pic:nvPicPr>
+                  <pic:blipFill>
+                    <a:blip r:embed="rId65"/>
                     <a:stretch>
                       <a:fillRect/>
                     </a:stretch>
@@ -9517,7 +9572,7 @@
         <w:pStyle w:val="ImageCaption"/>
       </w:pPr>
       <w:r>
-        <w:t xml:space="preserve">Figure 4: Trust Predicate Evaluation and Authorisation Decision Flow</w:t>
+        <w:t xml:space="preserve">Figure 5: Trust Predicate Evaluation and Authorisation Decision Flow</w:t>
       </w:r>
     </w:p>
     <w:p>
@@ -9528,8 +9583,8 @@
         <w:t xml:space="preserve">Both successful and unsuccessful decisions are subsequently associated with authorisation evidence. This ensures that the architecture supports not only access enforcement but also accountability and subsequent verification.</w:t>
       </w:r>
     </w:p>
-    <w:bookmarkEnd w:id="65"/>
-    <w:bookmarkStart w:id="66" w:name="X78e7c83bde76a8fa89c47d21e3a1fec3e5afd01"/>
+    <w:bookmarkEnd w:id="68"/>
+    <w:bookmarkStart w:id="69" w:name="X78e7c83bde76a8fa89c47d21e3a1fec3e5afd01"/>
     <w:p>
       <w:pPr>
         <w:pStyle w:val="Heading3"/>
@@ -10031,8 +10086,8 @@
         <w:t xml:space="preserve">This mapping demonstrates that MVC functions as the implementation architecture through which the conceptual research questions are operationalised. It does not replace the trust model; rather, it provides the structural boundaries through which the trust model can be implemented, evaluated, and validated.</w:t>
       </w:r>
     </w:p>
-    <w:bookmarkEnd w:id="66"/>
-    <w:bookmarkStart w:id="67" w:name="Xd007e785e3bfaada6ef882ac3ef6839127aa1d0"/>
+    <w:bookmarkEnd w:id="69"/>
+    <w:bookmarkStart w:id="70" w:name="Xd007e785e3bfaada6ef882ac3ef6839127aa1d0"/>
     <w:p>
       <w:pPr>
         <w:pStyle w:val="Heading3"/>
@@ -10089,9 +10144,9 @@
         <w:t xml:space="preserve">Accordingly, the MVC architecture provides the structural foundation for implementing the trust-oriented authorisation model. The subsequent sections describe each layer in greater detail, beginning with the Model representation of trust-aware consent and authorisation state, followed by the View interaction mechanisms and Controller-based enforcement mechanisms.</w:t>
       </w:r>
     </w:p>
-    <w:bookmarkEnd w:id="67"/>
-    <w:bookmarkEnd w:id="68"/>
-    <w:bookmarkStart w:id="72" w:name="X558a2b42e7f558743af400a9676e37558071ee0"/>
+    <w:bookmarkEnd w:id="70"/>
+    <w:bookmarkEnd w:id="71"/>
+    <w:bookmarkStart w:id="75" w:name="X558a2b42e7f558743af400a9676e37558071ee0"/>
     <w:p>
       <w:pPr>
         <w:pStyle w:val="Heading2"/>
@@ -10105,7 +10160,7 @@
         <w:pStyle w:val="FirstParagraph"/>
       </w:pPr>
       <w:r>
-        <w:t xml:space="preserve">Figure 5 presents the end-to-end workflow of the proposed trust-oriented patient consent authorisation framework. The workflow operationalises the central premise of this research that trustworthy healthcare data access cannot be established by a single mechanism, such as a blockchain record or an authenticated identity. Instead, an access decision should be established through the coordinated verification of consent specifications, participant identity and authority, multi-party authorisation, and policy compliance. Accordingly, the proposed workflow transforms a patient’s consent from a static permission record into an evaluable authorisation object that can be verified before healthcare data are released.</w:t>
+        <w:t xml:space="preserve">Figure 6 presents the end-to-end workflow of the proposed trust-oriented patient consent authorisation framework. The workflow operationalises the central premise of this research that trustworthy healthcare data access cannot be established by a single mechanism, such as a blockchain record or an authenticated identity. Instead, an access decision should be established through the coordinated verification of consent specifications, participant identity and authority, multi-party authorisation, and policy compliance. Accordingly, the proposed workflow transforms a patient’s consent from a static permission record into an evaluable authorisation object that can be verified before healthcare data are released.</w:t>
       </w:r>
     </w:p>
     <w:p>
@@ -10221,18 +10276,18 @@
           <wp:inline>
             <wp:extent cx="2121408" cy="7666389"/>
             <wp:effectExtent b="0" l="0" r="0" t="0"/>
-            <wp:docPr descr="Figure 5: End-to-End Workflow of Trust-Oriented Consent Authorisation Framework" title="" id="70" name="Picture"/>
+            <wp:docPr descr="Figure 6: End-to-End Workflow of Trust-Oriented Consent Authorisation Framework" title="" id="73" name="Picture"/>
             <a:graphic>
               <a:graphicData uri="http://schemas.openxmlformats.org/drawingml/2006/picture">
                 <pic:pic>
                   <pic:nvPicPr>
-                    <pic:cNvPr descr="media_col/fig06.png" id="71" name="Picture"/>
+                    <pic:cNvPr descr="media_col/fig06.png" id="74" name="Picture"/>
                     <pic:cNvPicPr>
                       <a:picLocks noChangeArrowheads="1" noChangeAspect="1"/>
                     </pic:cNvPicPr>
                   </pic:nvPicPr>
                   <pic:blipFill>
-                    <a:blip r:embed="rId69"/>
+                    <a:blip r:embed="rId72"/>
                     <a:stretch>
                       <a:fillRect/>
                     </a:stretch>
@@ -10264,7 +10319,7 @@
         <w:pStyle w:val="ImageCaption"/>
       </w:pPr>
       <w:r>
-        <w:t xml:space="preserve">Figure 5: End-to-End Workflow of Trust-Oriented Consent Authorisation Framework</w:t>
+        <w:t xml:space="preserve">Figure 6: End-to-End Workflow of Trust-Oriented Consent Authorisation Framework</w:t>
       </w:r>
     </w:p>
     <w:p>
@@ -10422,8 +10477,8 @@
         <w:t xml:space="preserve">Finally, the framework records the resulting authorisation evidence in the audit layer. Importantly, both successful and denied decisions should be recorded because a trustworthy authorisation framework requires accountability not only for data that were released but also for access attempts that were rejected. The audit evidence can therefore provide a traceable record of the authorisation decision, including the relevant consent, participants, policy evaluation, decision outcome, and associated evidence. In this manner, the workflow connects consent specification with identity trust, collective authorisation, policy enforcement, and accountability, providing the operational foundation of the proposed trust-oriented authorisation framework.</w:t>
       </w:r>
     </w:p>
-    <w:bookmarkEnd w:id="72"/>
-    <w:bookmarkStart w:id="73" w:name="Xe4d2ece9a21da9d7e0f73941c1ddb60d05c823c"/>
+    <w:bookmarkEnd w:id="75"/>
+    <w:bookmarkStart w:id="76" w:name="Xe4d2ece9a21da9d7e0f73941c1ddb60d05c823c"/>
     <w:p>
       <w:pPr>
         <w:pStyle w:val="Heading2"/>
@@ -10897,8 +10952,8 @@
         <w:t xml:space="preserve">For the current stage implementation, the Model focuses on the foundational dimensions of identity, authority, multi-party approval, policy constraints, and authorisation evidence. The next-stage research will extend this representation to include temporal validity, expiration, revocation, lifecycle transitions, and formal security properties.</w:t>
       </w:r>
     </w:p>
-    <w:bookmarkEnd w:id="73"/>
-    <w:bookmarkStart w:id="74" w:name="X96d81aae39a4d93ee42ea3f75f4e5970520a9db"/>
+    <w:bookmarkEnd w:id="76"/>
+    <w:bookmarkStart w:id="77" w:name="X96d81aae39a4d93ee42ea3f75f4e5970520a9db"/>
     <w:p>
       <w:pPr>
         <w:pStyle w:val="Heading2"/>
@@ -10970,8 +11025,8 @@
         <w:t xml:space="preserve">This distinction is particularly important in decentralised environments where different stakeholders may not fully trust one another. The proposed architecture therefore treats each user action as a claim that must be independently evaluated rather than as an automatically trusted system operation.</w:t>
       </w:r>
     </w:p>
-    <w:bookmarkEnd w:id="74"/>
-    <w:bookmarkStart w:id="75" w:name="X29a124864d396411eac11d932965b7ef7582ae4"/>
+    <w:bookmarkEnd w:id="77"/>
+    <w:bookmarkStart w:id="78" w:name="X29a124864d396411eac11d932965b7ef7582ae4"/>
     <w:p>
       <w:pPr>
         <w:pStyle w:val="Heading2"/>
@@ -11206,8 +11261,8 @@
         <w:t xml:space="preserve">This creates a conjunctive trust model in which the failure of any required condition prevents the final authorisation decision. More importantly, the Controller provides a single security-enforcement point through which all sensitive operations must be evaluated. This reduces the risk that different components independently interpret consent conditions and produce inconsistent access decisions.</w:t>
       </w:r>
     </w:p>
-    <w:bookmarkEnd w:id="75"/>
-    <w:bookmarkStart w:id="76" w:name="X7ea2e96574592c59422d2a5ee233779814b7dd7"/>
+    <w:bookmarkEnd w:id="78"/>
+    <w:bookmarkStart w:id="79" w:name="X7ea2e96574592c59422d2a5ee233779814b7dd7"/>
     <w:p>
       <w:pPr>
         <w:pStyle w:val="Heading2"/>
@@ -11671,8 +11726,8 @@
         <w:t xml:space="preserve">The architectural contribution therefore lies in the combination of identity verification and collective decision making. Trust is not assumed to reside in a single privileged entity. Instead, it emerges from the coordinated satisfaction of independently verifiable requirements across multiple participants.</w:t>
       </w:r>
     </w:p>
-    <w:bookmarkEnd w:id="76"/>
-    <w:bookmarkStart w:id="77" w:name="policy-aware-consent-enforcement"/>
+    <w:bookmarkEnd w:id="79"/>
+    <w:bookmarkStart w:id="80" w:name="policy-aware-consent-enforcement"/>
     <w:p>
       <w:pPr>
         <w:pStyle w:val="Heading2"/>
@@ -11768,8 +11823,8 @@
         <w:t xml:space="preserve">This policy-centric approach also provides a basis for future extensions. While the current stage implementation focuses on purpose and healthcare data scope, the same mechanism can subsequently incorporate additional contextual conditions, including location, organisation, treatment relationship, emergency status, temporal restrictions, and other regulatory constraints.</w:t>
       </w:r>
     </w:p>
-    <w:bookmarkEnd w:id="77"/>
-    <w:bookmarkStart w:id="78" w:name="authorisation-evidence-and-auditability"/>
+    <w:bookmarkEnd w:id="80"/>
+    <w:bookmarkStart w:id="81" w:name="authorisation-evidence-and-auditability"/>
     <w:p>
       <w:pPr>
         <w:pStyle w:val="Heading2"/>
@@ -12162,8 +12217,8 @@
         <w:t xml:space="preserve">The trustworthiness of the access decision instead originates from the coordinated enforcement of identity, authority, multi-party approval, and policy conditions.</w:t>
       </w:r>
     </w:p>
-    <w:bookmarkEnd w:id="78"/>
-    <w:bookmarkStart w:id="79" w:name="architectural-security-properties"/>
+    <w:bookmarkEnd w:id="81"/>
+    <w:bookmarkStart w:id="82" w:name="architectural-security-properties"/>
     <w:p>
       <w:pPr>
         <w:pStyle w:val="Heading2"/>
@@ -12285,8 +12340,8 @@
         <w:t xml:space="preserve">. The system maintains evidence concerning the conditions that produced an authorisation decision, thereby supporting auditing and subsequent verification. These properties can be summarised as shown in Table 5.</w:t>
       </w:r>
     </w:p>
-    <w:bookmarkEnd w:id="79"/>
-    <w:bookmarkStart w:id="80" w:name="Xa2cefacf258c40709ece440e33da236e205e6c3"/>
+    <w:bookmarkEnd w:id="82"/>
+    <w:bookmarkStart w:id="83" w:name="Xa2cefacf258c40709ece440e33da236e205e6c3"/>
     <w:p>
       <w:pPr>
         <w:pStyle w:val="Heading2"/>
@@ -12311,8 +12366,8 @@
         <w:t xml:space="preserve">As shown in Table 6, the View provides the operational environment through which these mechanisms are exercised by independent participants. Importantly, the View does not determine whether an operation is authorised. Instead, it captures participant actions and forwards them to the Controller, which evaluates the security predicates defined by the Model.</w:t>
       </w:r>
     </w:p>
-    <w:bookmarkEnd w:id="80"/>
-    <w:bookmarkStart w:id="81" w:name="architectural-contribution-and-scope"/>
+    <w:bookmarkEnd w:id="83"/>
+    <w:bookmarkStart w:id="84" w:name="architectural-contribution-and-scope"/>
     <w:p>
       <w:pPr>
         <w:pStyle w:val="Heading2"/>
@@ -13137,9 +13192,9 @@
         <w:t xml:space="preserve">Accordingly, the current stage architecture establishes the foundational security core of the research, while the next stage will investigate whether this core can maintain trust dynamically over time, satisfy formally defined security properties, and consistently enforce the complete trust-oriented authorisation model under representative and adversarial healthcare data-sharing conditions.</w:t>
       </w:r>
     </w:p>
-    <w:bookmarkEnd w:id="81"/>
-    <w:bookmarkEnd w:id="82"/>
-    <w:bookmarkStart w:id="126" w:name="proposed-solution"/>
+    <w:bookmarkEnd w:id="84"/>
+    <w:bookmarkEnd w:id="85"/>
+    <w:bookmarkStart w:id="129" w:name="proposed-solution"/>
     <w:p>
       <w:pPr>
         <w:pStyle w:val="Heading1"/>
@@ -13148,7 +13203,7 @@
         <w:t xml:space="preserve">6 Proposed Solution</w:t>
       </w:r>
     </w:p>
-    <w:bookmarkStart w:id="89" w:name="trust-centric-consent-model-for-ro1"/>
+    <w:bookmarkStart w:id="92" w:name="trust-centric-consent-model-for-ro1"/>
     <w:p>
       <w:pPr>
         <w:pStyle w:val="Heading2"/>
@@ -13311,7 +13366,7 @@
         <w:t xml:space="preserve">The consent model therefore separates the specification of consent from the final access decision. A consent object does not automatically imply that every subsequent request is authorised. Instead, the object provides the conditions against which a request can be evaluated.</w:t>
       </w:r>
     </w:p>
-    <w:bookmarkStart w:id="86" w:name="ro1-consent-creation-workflow"/>
+    <w:bookmarkStart w:id="89" w:name="ro1-consent-creation-workflow"/>
     <w:p>
       <w:pPr>
         <w:pStyle w:val="Heading3"/>
@@ -13333,7 +13388,7 @@
         <w:pStyle w:val="BodyText"/>
       </w:pPr>
       <w:r>
-        <w:t xml:space="preserve">The workflow first collects the patient identity and the intended healthcare participants. It then specifies the purpose and data scope of the consent. In the HALAH implementation, the patient interface allows the patient to select a patient DID, specify an authorised doctor, identify guardian DIDs, and select healthcare data modules such as Observation, Medication, Condition, and Procedure. This interface is shown in Figure 12 (Section 7.2). The implementation also collects the start and expiry time of the consent.</w:t>
+        <w:t xml:space="preserve">The workflow first collects the patient identity and the intended healthcare participants. It then specifies the purpose and data scope of the consent. In the HALAH implementation, the patient interface allows the patient to select a patient DID, specify an authorised doctor, identify guardian DIDs, and select healthcare data modules such as Observation, Medication, Condition, and Procedure. This interface is shown in Figure 13 (Section 7.2). The implementation also collects the start and expiry time of the consent.</w:t>
       </w:r>
     </w:p>
     <w:p>
@@ -13345,18 +13400,18 @@
           <wp:inline>
             <wp:extent cx="4288536" cy="7675254"/>
             <wp:effectExtent b="0" l="0" r="0" t="0"/>
-            <wp:docPr descr="Figure 6: RO1 workflow for trust-centric consent creation" title="" id="84" name="Picture"/>
+            <wp:docPr descr="Figure 7: RO1 workflow for trust-centric consent creation" title="" id="87" name="Picture"/>
             <a:graphic>
               <a:graphicData uri="http://schemas.openxmlformats.org/drawingml/2006/picture">
                 <pic:pic>
                   <pic:nvPicPr>
-                    <pic:cNvPr descr="media_bw/fig07.png" id="85" name="Picture"/>
+                    <pic:cNvPr descr="media_bw/fig07.png" id="88" name="Picture"/>
                     <pic:cNvPicPr>
                       <a:picLocks noChangeArrowheads="1" noChangeAspect="1"/>
                     </pic:cNvPicPr>
                   </pic:nvPicPr>
                   <pic:blipFill>
-                    <a:blip r:embed="rId83"/>
+                    <a:blip r:embed="rId86"/>
                     <a:stretch>
                       <a:fillRect/>
                     </a:stretch>
@@ -13388,7 +13443,7 @@
         <w:pStyle w:val="ImageCaption"/>
       </w:pPr>
       <w:r>
-        <w:t xml:space="preserve">Figure 6: RO1 workflow for trust-centric consent creation</w:t>
+        <w:t xml:space="preserve">Figure 7: RO1 workflow for trust-centric consent creation</w:t>
       </w:r>
     </w:p>
     <w:p>
@@ -13399,8 +13454,8 @@
         <w:t xml:space="preserve">The specification is accepted only when the required fields are valid. For example, the expiry time must be later than the start time. After validation, the system creates the consent object, assigns a consent identifier, persists the record, and records the creation event in the audit layer. This process ensures that the consent object contains sufficient information for subsequent identity verification, multi-party authorisation, policy evaluation, and auditability.</w:t>
       </w:r>
     </w:p>
-    <w:bookmarkEnd w:id="86"/>
-    <w:bookmarkStart w:id="87" w:name="Xc188a3981fd31bd266aea119eb4e582f5917a4c"/>
+    <w:bookmarkEnd w:id="89"/>
+    <w:bookmarkStart w:id="90" w:name="Xc188a3981fd31bd266aea119eb4e582f5917a4c"/>
     <w:p>
       <w:pPr>
         <w:pStyle w:val="Heading3"/>
@@ -15029,8 +15084,8 @@
         </m:r>
       </m:oMath>
     </w:p>
-    <w:bookmarkEnd w:id="87"/>
-    <w:bookmarkStart w:id="88" w:name="algorithm-1-trust-aware-consent-creation"/>
+    <w:bookmarkEnd w:id="90"/>
+    <w:bookmarkStart w:id="91" w:name="algorithm-1-trust-aware-consent-creation"/>
     <w:p>
       <w:pPr>
         <w:pStyle w:val="Heading3"/>
@@ -15094,9 +15149,9 @@
         <w:t xml:space="preserve">. Consequently, RO1 provides the data structure upon which the subsequent trust-oriented authorisation mechanisms operate.</w:t>
       </w:r>
     </w:p>
-    <w:bookmarkEnd w:id="88"/>
-    <w:bookmarkEnd w:id="89"/>
-    <w:bookmarkStart w:id="96" w:name="X3b93ca6d6b3213e06bf792918c5f2e554ad197d"/>
+    <w:bookmarkEnd w:id="91"/>
+    <w:bookmarkEnd w:id="92"/>
+    <w:bookmarkStart w:id="99" w:name="X3b93ca6d6b3213e06bf792918c5f2e554ad197d"/>
     <w:p>
       <w:pPr>
         <w:pStyle w:val="Heading2"/>
@@ -15165,7 +15220,7 @@
         <w:t xml:space="preserve">is the requesting participant. The DID verification process establishes whether the identity reference is valid. The VC verification process establishes whether the participant possesses valid authority evidence. The final authorisation decision remains dependent on the consent requirements and access policy.</w:t>
       </w:r>
     </w:p>
-    <w:bookmarkStart w:id="90" w:name="X40f13bf52dbab2e76356a6753423f1584e794fb"/>
+    <w:bookmarkStart w:id="93" w:name="X40f13bf52dbab2e76356a6753423f1584e794fb"/>
     <w:p>
       <w:pPr>
         <w:pStyle w:val="Heading3"/>
@@ -15230,8 +15285,8 @@
         <w:t xml:space="preserve">The output of RO2 is not an access-grant decision. It is a verified identity and authority result that can be consumed by RO3 and RO4. This separation prevents a participant from obtaining access merely by presenting a valid identity credential.</w:t>
       </w:r>
     </w:p>
-    <w:bookmarkEnd w:id="90"/>
-    <w:bookmarkStart w:id="94" w:name="Xa8518206654d9551af54c2e3b82ee4012d4395c"/>
+    <w:bookmarkEnd w:id="93"/>
+    <w:bookmarkStart w:id="97" w:name="Xa8518206654d9551af54c2e3b82ee4012d4395c"/>
     <w:p>
       <w:pPr>
         <w:pStyle w:val="Heading3"/>
@@ -15373,18 +15428,18 @@
           <wp:inline>
             <wp:extent cx="4480560" cy="7681842"/>
             <wp:effectExtent b="0" l="0" r="0" t="0"/>
-            <wp:docPr descr="Figure 7: RO2 workflow for decentralised identity and authority verification" title="" id="92" name="Picture"/>
+            <wp:docPr descr="Figure 8: RO2 workflow for decentralised identity and authority verification" title="" id="95" name="Picture"/>
             <a:graphic>
               <a:graphicData uri="http://schemas.openxmlformats.org/drawingml/2006/picture">
                 <pic:pic>
                   <pic:nvPicPr>
-                    <pic:cNvPr descr="media_bw/fig08.png" id="93" name="Picture"/>
+                    <pic:cNvPr descr="media_bw/fig08.png" id="96" name="Picture"/>
                     <pic:cNvPicPr>
                       <a:picLocks noChangeArrowheads="1" noChangeAspect="1"/>
                     </pic:cNvPicPr>
                   </pic:nvPicPr>
                   <pic:blipFill>
-                    <a:blip r:embed="rId91"/>
+                    <a:blip r:embed="rId94"/>
                     <a:stretch>
                       <a:fillRect/>
                     </a:stretch>
@@ -15416,7 +15471,7 @@
         <w:pStyle w:val="ImageCaption"/>
       </w:pPr>
       <w:r>
-        <w:t xml:space="preserve">Figure 7: RO2 workflow for decentralised identity and authority verification</w:t>
+        <w:t xml:space="preserve">Figure 8: RO2 workflow for decentralised identity and authority verification</w:t>
       </w:r>
     </w:p>
     <w:p>
@@ -16962,8 +17017,8 @@
         <w:t xml:space="preserve">This distinction is important for the proposed framework because a valid healthcare identity does not imply unrestricted access to healthcare data. DID and VC mechanisms provide trustworthy identity and attribute evidence, while the consent object provides the context against which those claims are evaluated. The resulting verification evidence can then be consumed by the subsequent policy, scope, and access-authorisation stages.</w:t>
       </w:r>
     </w:p>
-    <w:bookmarkEnd w:id="94"/>
-    <w:bookmarkStart w:id="95" w:name="Xc4f55700a7f258d13fe1dec9692def6c68b650d"/>
+    <w:bookmarkEnd w:id="97"/>
+    <w:bookmarkStart w:id="98" w:name="Xc4f55700a7f258d13fe1dec9692def6c68b650d"/>
     <w:p>
       <w:pPr>
         <w:pStyle w:val="Heading3"/>
@@ -17521,9 +17576,9 @@
         <w:t xml:space="preserve">VALID</w:t>
       </w:r>
     </w:p>
-    <w:bookmarkEnd w:id="95"/>
-    <w:bookmarkEnd w:id="96"/>
-    <w:bookmarkStart w:id="103" w:name="X2fe5cbf561c8a3bc135795b66ae3ba1eef8bc71"/>
+    <w:bookmarkEnd w:id="98"/>
+    <w:bookmarkEnd w:id="99"/>
+    <w:bookmarkStart w:id="106" w:name="X2fe5cbf561c8a3bc135795b66ae3ba1eef8bc71"/>
     <w:p>
       <w:pPr>
         <w:pStyle w:val="Heading2"/>
@@ -17602,7 +17657,7 @@
         <w:t xml:space="preserve">The threshold mechanism establishes collective authorisation without requiring every possible participant to approve. For example, a consent may require two valid guardian approvals. In this case, one valid approval is insufficient, whereas two valid approvals satisfy the threshold.</w:t>
       </w:r>
     </w:p>
-    <w:bookmarkStart w:id="97" w:name="ro3-multi-party-authorisation-workflow"/>
+    <w:bookmarkStart w:id="100" w:name="ro3-multi-party-authorisation-workflow"/>
     <w:p>
       <w:pPr>
         <w:pStyle w:val="Heading3"/>
@@ -17624,7 +17679,7 @@
         <w:pStyle w:val="BodyText"/>
       </w:pPr>
       <w:r>
-        <w:t xml:space="preserve">In the HALAH prototype, the Guardian workflow (Figure 13, Section 7.3) verifies each guardian’s EIP-712 approval signature, refuses a second approval from the same guardian, adds the guardian DID to the consent’s signature set and displays the approval count against the threshold (e.g., 2/2). When the threshold is reached, a Soulbound Token (SBT) identifier is assigned, a MINT_SBT event is written to the audit log, and the consent is anchored on the Ethereum Sepolia testnet by minting a non-transferable consent token. Four such mints, made with the v2 consent contract, are recorded in Table 10; the v3 contract adds on-chain validity checks and ERC-5484 consensual burn [40].</w:t>
+        <w:t xml:space="preserve">In the HALAH prototype, the Guardian workflow (Figure 14, Section 7.3) verifies each guardian’s EIP-712 approval signature, refuses a second approval from the same guardian, adds the guardian DID to the consent’s signature set and displays the approval count against the threshold (e.g., 2/2). When the threshold is reached, a Soulbound Token (SBT) identifier is assigned, a MINT_SBT event is written to the audit log, and the consent is anchored on the Ethereum Sepolia testnet by minting a non-transferable consent token. Four such mints, made with the v2 consent contract, are recorded in Table 10; the v3 contract adds on-chain validity checks and ERC-5484 consensual burn [40].</w:t>
       </w:r>
     </w:p>
     <w:p>
@@ -17635,8 +17690,8 @@
         <w:t xml:space="preserve">The SBT should be interpreted as an activation or representation mechanism for the consent state rather than as the fundamental source of trust. The trust decision is established by the verification of participants and the satisfaction of the authorisation threshold. The blockchain or token layer provides persistence, traceability, and evidence of the resulting state.</w:t>
       </w:r>
     </w:p>
-    <w:bookmarkEnd w:id="97"/>
-    <w:bookmarkStart w:id="101" w:name="X9dea25ed2e3c65720ba6349f36c23195c56aab5"/>
+    <w:bookmarkEnd w:id="100"/>
+    <w:bookmarkStart w:id="104" w:name="X9dea25ed2e3c65720ba6349f36c23195c56aab5"/>
     <w:p>
       <w:pPr>
         <w:pStyle w:val="Heading3"/>
@@ -17747,18 +17802,18 @@
           <wp:inline>
             <wp:extent cx="4690872" cy="7676810"/>
             <wp:effectExtent b="0" l="0" r="0" t="0"/>
-            <wp:docPr descr="Figure 8: RO3 workflow for threshold-based multi-party authorisation" title="" id="99" name="Picture"/>
+            <wp:docPr descr="Figure 9: RO3 workflow for threshold-based multi-party authorisation" title="" id="102" name="Picture"/>
             <a:graphic>
               <a:graphicData uri="http://schemas.openxmlformats.org/drawingml/2006/picture">
                 <pic:pic>
                   <pic:nvPicPr>
-                    <pic:cNvPr descr="media_bw/fig09.png" id="100" name="Picture"/>
+                    <pic:cNvPr descr="media_bw/fig09.png" id="103" name="Picture"/>
                     <pic:cNvPicPr>
                       <a:picLocks noChangeArrowheads="1" noChangeAspect="1"/>
                     </pic:cNvPicPr>
                   </pic:nvPicPr>
                   <pic:blipFill>
-                    <a:blip r:embed="rId98"/>
+                    <a:blip r:embed="rId101"/>
                     <a:stretch>
                       <a:fillRect/>
                     </a:stretch>
@@ -17790,7 +17845,7 @@
         <w:pStyle w:val="ImageCaption"/>
       </w:pPr>
       <w:r>
-        <w:t xml:space="preserve">Figure 8: RO3 workflow for threshold-based multi-party authorisation</w:t>
+        <w:t xml:space="preserve">Figure 9: RO3 workflow for threshold-based multi-party authorisation</w:t>
       </w:r>
     </w:p>
     <w:p>
@@ -19952,8 +20007,8 @@
         </m:oMath>
       </m:oMathPara>
     </w:p>
-    <w:bookmarkEnd w:id="101"/>
-    <w:bookmarkStart w:id="102" w:name="Xb33811a272d7ecbf6236afe90e31520d262e370"/>
+    <w:bookmarkEnd w:id="104"/>
+    <w:bookmarkStart w:id="105" w:name="Xb33811a272d7ecbf6236afe90e31520d262e370"/>
     <w:p>
       <w:pPr>
         <w:pStyle w:val="Heading3"/>
@@ -20543,9 +20598,9 @@
         <w:t xml:space="preserve">end if</w:t>
       </w:r>
     </w:p>
-    <w:bookmarkEnd w:id="102"/>
-    <w:bookmarkEnd w:id="103"/>
-    <w:bookmarkStart w:id="110" w:name="X77d8a567f90fbf98e40547b4be1462ed72e9750"/>
+    <w:bookmarkEnd w:id="105"/>
+    <w:bookmarkEnd w:id="106"/>
+    <w:bookmarkStart w:id="113" w:name="X77d8a567f90fbf98e40547b4be1462ed72e9750"/>
     <w:p>
       <w:pPr>
         <w:pStyle w:val="Heading2"/>
@@ -20991,7 +21046,7 @@
         <w:t xml:space="preserve"> </w:t>
       </w:r>
     </w:p>
-    <w:bookmarkStart w:id="107" w:name="ro4-policy-aware-access-workflow"/>
+    <w:bookmarkStart w:id="110" w:name="ro4-policy-aware-access-workflow"/>
     <w:p>
       <w:pPr>
         <w:pStyle w:val="Heading3"/>
@@ -21021,7 +21076,7 @@
         <w:pStyle w:val="BodyText"/>
       </w:pPr>
       <w:r>
-        <w:t xml:space="preserve">The HALAH implementation provides a concrete basis for this objective. The Doctor interface retrieves a consent, evaluates its state, allows a requested scope to be selected from the consent scope, generates a proof, checks the requested scope, and invokes the authorisation function before returning data. This behaviour is shown in Figures 14–15 (Section 7.4).</w:t>
+        <w:t xml:space="preserve">The HALAH implementation provides a concrete basis for this objective. The Doctor interface retrieves a consent, evaluates its state, allows a requested scope to be selected from the consent scope, generates a proof, checks the requested scope, and invokes the authorisation function before returning data. This behaviour is shown in Figures 15–16 (Section 7.4).</w:t>
       </w:r>
     </w:p>
     <w:p>
@@ -21368,18 +21423,18 @@
           <wp:inline>
             <wp:extent cx="2788920" cy="7689425"/>
             <wp:effectExtent b="0" l="0" r="0" t="0"/>
-            <wp:docPr descr="Figure 9: RO4 workflow for policy- and context-aware access control" title="" id="105" name="Picture"/>
+            <wp:docPr descr="Figure 10: RO4 workflow for policy- and context-aware access control" title="" id="108" name="Picture"/>
             <a:graphic>
               <a:graphicData uri="http://schemas.openxmlformats.org/drawingml/2006/picture">
                 <pic:pic>
                   <pic:nvPicPr>
-                    <pic:cNvPr descr="media_bw/fig10.png" id="106" name="Picture"/>
+                    <pic:cNvPr descr="media_bw/fig10.png" id="109" name="Picture"/>
                     <pic:cNvPicPr>
                       <a:picLocks noChangeArrowheads="1" noChangeAspect="1"/>
                     </pic:cNvPicPr>
                   </pic:nvPicPr>
                   <pic:blipFill>
-                    <a:blip r:embed="rId104"/>
+                    <a:blip r:embed="rId107"/>
                     <a:stretch>
                       <a:fillRect/>
                     </a:stretch>
@@ -21411,11 +21466,11 @@
         <w:pStyle w:val="ImageCaption"/>
       </w:pPr>
       <w:r>
-        <w:t xml:space="preserve">Figure 9: RO4 workflow for policy- and context-aware access control</w:t>
-      </w:r>
-    </w:p>
-    <w:bookmarkEnd w:id="107"/>
-    <w:bookmarkStart w:id="108" w:name="X9b9350abce928b4bfd4821dc61b387a8eede2be"/>
+        <w:t xml:space="preserve">Figure 10: RO4 workflow for policy- and context-aware access control</w:t>
+      </w:r>
+    </w:p>
+    <w:bookmarkEnd w:id="110"/>
+    <w:bookmarkStart w:id="111" w:name="X9b9350abce928b4bfd4821dc61b387a8eede2be"/>
     <w:p>
       <w:pPr>
         <w:pStyle w:val="Heading3"/>
@@ -24019,8 +24074,8 @@
         <w:t xml:space="preserve">This architecture transforms healthcare data access from a simple credential-based permission check into an evidence-based authorisation process in which identity, consent, authority, distributed approval, purpose, scope, and audit evidence jointly determine the final access decision.</w:t>
       </w:r>
     </w:p>
-    <w:bookmarkEnd w:id="108"/>
-    <w:bookmarkStart w:id="109" w:name="algorithm-4-policy-aware-access-decision"/>
+    <w:bookmarkEnd w:id="111"/>
+    <w:bookmarkStart w:id="112" w:name="algorithm-4-policy-aware-access-decision"/>
     <w:p>
       <w:pPr>
         <w:pStyle w:val="Heading3"/>
@@ -24612,9 +24667,9 @@
         <w:t xml:space="preserve">The algorithm also establishes the connection between the proposed framework and the HALAH access-control implementation. The system must not only determine whether a consent exists, but also evaluate whether the current request satisfies the consent’s scope and purpose constraints. Both granted and denied requests should be recorded to support accountability and auditability.</w:t>
       </w:r>
     </w:p>
-    <w:bookmarkEnd w:id="109"/>
-    <w:bookmarkEnd w:id="110"/>
-    <w:bookmarkStart w:id="117" w:name="temporal-and-lifecycle-trust-for-ro5"/>
+    <w:bookmarkEnd w:id="112"/>
+    <w:bookmarkEnd w:id="113"/>
+    <w:bookmarkStart w:id="120" w:name="temporal-and-lifecycle-trust-for-ro5"/>
     <w:p>
       <w:pPr>
         <w:pStyle w:val="Heading2"/>
@@ -24772,7 +24827,7 @@
         <w:t xml:space="preserve">The purpose of RO5 is not simply to add an expiry field. It is to ensure that the validity of a consent depends on both its temporal interval and its current lifecycle state. A consent that has expired or been revoked must not remain usable merely because its original approval threshold was satisfied.</w:t>
       </w:r>
     </w:p>
-    <w:bookmarkStart w:id="111" w:name="ro5-temporal-and-lifecycle-workflow"/>
+    <w:bookmarkStart w:id="114" w:name="ro5-temporal-and-lifecycle-workflow"/>
     <w:p>
       <w:pPr>
         <w:pStyle w:val="Heading3"/>
@@ -24955,8 +25010,8 @@
         <w:t xml:space="preserve">is reserved for lifecycle validity as defined here.</w:t>
       </w:r>
     </w:p>
-    <w:bookmarkEnd w:id="111"/>
-    <w:bookmarkStart w:id="112" w:name="X76e1ecd5ca9116901ef2fba9faaf6fcb0ec1702"/>
+    <w:bookmarkEnd w:id="114"/>
+    <w:bookmarkStart w:id="115" w:name="X76e1ecd5ca9116901ef2fba9faaf6fcb0ec1702"/>
     <w:p>
       <w:pPr>
         <w:pStyle w:val="Heading3"/>
@@ -27968,8 +28023,8 @@
         <w:t xml:space="preserve">Rather than treating authorisation as a one-time event, this approach enables the system to determine whether authorisation remains valid at the precise time an operation is requested. This is particularly important for dynamic consent environments in which permissions may expire, be revoked, suspended, renewed, or otherwise modified during the lifecycle of a healthcare data-sharing relationship.</w:t>
       </w:r>
     </w:p>
-    <w:bookmarkEnd w:id="112"/>
-    <w:bookmarkStart w:id="116" w:name="X43f085cbe35cf9229d124bd6c8707d40ef3f488"/>
+    <w:bookmarkEnd w:id="115"/>
+    <w:bookmarkStart w:id="119" w:name="X43f085cbe35cf9229d124bd6c8707d40ef3f488"/>
     <w:p>
       <w:pPr>
         <w:pStyle w:val="Heading3"/>
@@ -28567,18 +28622,18 @@
           <wp:inline>
             <wp:extent cx="4142232" cy="7687826"/>
             <wp:effectExtent b="0" l="0" r="0" t="0"/>
-            <wp:docPr descr="Figure 10: RO5 planned workflow for temporal and consent lifecycle trust" title="" id="114" name="Picture"/>
+            <wp:docPr descr="Figure 11: RO5 planned workflow for temporal and consent lifecycle trust" title="" id="117" name="Picture"/>
             <a:graphic>
               <a:graphicData uri="http://schemas.openxmlformats.org/drawingml/2006/picture">
                 <pic:pic>
                   <pic:nvPicPr>
-                    <pic:cNvPr descr="media_bw/fig11.png" id="115" name="Picture"/>
+                    <pic:cNvPr descr="media_bw/fig11.png" id="118" name="Picture"/>
                     <pic:cNvPicPr>
                       <a:picLocks noChangeArrowheads="1" noChangeAspect="1"/>
                     </pic:cNvPicPr>
                   </pic:nvPicPr>
                   <pic:blipFill>
-                    <a:blip r:embed="rId113"/>
+                    <a:blip r:embed="rId116"/>
                     <a:stretch>
                       <a:fillRect/>
                     </a:stretch>
@@ -28610,7 +28665,7 @@
         <w:pStyle w:val="ImageCaption"/>
       </w:pPr>
       <w:r>
-        <w:t xml:space="preserve">Figure 10: RO5 planned workflow for temporal and consent lifecycle trust</w:t>
+        <w:t xml:space="preserve">Figure 11: RO5 planned workflow for temporal and consent lifecycle trust</w:t>
       </w:r>
     </w:p>
     <w:p>
@@ -28621,9 +28676,9 @@
         <w:t xml:space="preserve">Algorithm 5 extends the current-stage decision process by ensuring that consent validity is dynamic rather than permanent. The algorithm is intended for the CA3 implementation and evaluation stage. It will be used to investigate expiration, revocation, and controlled state transitions as additional conditions of trustworthy access.</w:t>
       </w:r>
     </w:p>
-    <w:bookmarkEnd w:id="116"/>
-    <w:bookmarkEnd w:id="117"/>
-    <w:bookmarkStart w:id="124" w:name="X28e4c471c7af957781c5be37513d338d1f9028e"/>
+    <w:bookmarkEnd w:id="119"/>
+    <w:bookmarkEnd w:id="120"/>
+    <w:bookmarkStart w:id="127" w:name="X28e4c471c7af957781c5be37513d338d1f9028e"/>
     <w:p>
       <w:pPr>
         <w:pStyle w:val="Heading2"/>
@@ -29127,7 +29182,7 @@
         </m:oMath>
       </m:oMathPara>
     </w:p>
-    <w:bookmarkStart w:id="118" w:name="ro6-assurance-and-validation-workflow"/>
+    <w:bookmarkStart w:id="121" w:name="ro6-assurance-and-validation-workflow"/>
     <w:p>
       <w:pPr>
         <w:pStyle w:val="Heading3"/>
@@ -29160,8 +29215,8 @@
         <w:t xml:space="preserve">The HALAH prototype provides the implementation basis for this evaluation. The current system includes separate patient, guardian, doctor, and auditor interfaces. It also records consent creation, guardian approval, token minting, state checks, and data-access events. Current evidence from the prototype is reported in Sections 7.11–7.12.</w:t>
       </w:r>
     </w:p>
-    <w:bookmarkEnd w:id="118"/>
-    <w:bookmarkStart w:id="122" w:name="Xd260b2be908768b418291e3c2c86d2d9077224a"/>
+    <w:bookmarkEnd w:id="121"/>
+    <w:bookmarkStart w:id="125" w:name="Xd260b2be908768b418291e3c2c86d2d9077224a"/>
     <w:p>
       <w:pPr>
         <w:pStyle w:val="Heading3"/>
@@ -29203,18 +29258,18 @@
           <wp:inline>
             <wp:extent cx="5753100" cy="6601216"/>
             <wp:effectExtent b="0" l="0" r="0" t="0"/>
-            <wp:docPr descr="Figure 11: RO6 planned workflow for formal security assurance and empirical validation" title="" id="120" name="Picture"/>
+            <wp:docPr descr="Figure 12: RO6 planned workflow for formal security assurance and empirical validation" title="" id="123" name="Picture"/>
             <a:graphic>
               <a:graphicData uri="http://schemas.openxmlformats.org/drawingml/2006/picture">
                 <pic:pic>
                   <pic:nvPicPr>
-                    <pic:cNvPr descr="media_bw/fig12.png" id="121" name="Picture"/>
+                    <pic:cNvPr descr="media_bw/fig12.png" id="124" name="Picture"/>
                     <pic:cNvPicPr>
                       <a:picLocks noChangeArrowheads="1" noChangeAspect="1"/>
                     </pic:cNvPicPr>
                   </pic:nvPicPr>
                   <pic:blipFill>
-                    <a:blip r:embed="rId119"/>
+                    <a:blip r:embed="rId122"/>
                     <a:stretch>
                       <a:fillRect/>
                     </a:stretch>
@@ -29246,7 +29301,7 @@
         <w:pStyle w:val="ImageCaption"/>
       </w:pPr>
       <w:r>
-        <w:t xml:space="preserve">Figure 11: RO6 planned workflow for formal security assurance and empirical validation</w:t>
+        <w:t xml:space="preserve">Figure 12: RO6 planned workflow for formal security assurance and empirical validation</w:t>
       </w:r>
     </w:p>
     <w:p>
@@ -33867,8 +33922,8 @@
         <w:t xml:space="preserve">Validation results</w:t>
       </w:r>
     </w:p>
-    <w:bookmarkEnd w:id="122"/>
-    <w:bookmarkStart w:id="123" w:name="Xb697f75e4cb43d67a9074b27c380a0731d6d029"/>
+    <w:bookmarkEnd w:id="125"/>
+    <w:bookmarkStart w:id="126" w:name="Xb697f75e4cb43d67a9074b27c380a0731d6d029"/>
     <w:p>
       <w:pPr>
         <w:pStyle w:val="Heading3"/>
@@ -33893,9 +33948,9 @@
         <w:t xml:space="preserve">The formal and empirical components are complementary. Formal reasoning defines what the framework should guarantee, while empirical testing examines whether the implementation satisfies those guarantees in representative operational scenarios. This combination is necessary because a system may be conceptually correct but incorrectly implemented, or may pass functional tests while failing under invalid or adversarial conditions.</w:t>
       </w:r>
     </w:p>
-    <w:bookmarkEnd w:id="123"/>
-    <w:bookmarkEnd w:id="124"/>
-    <w:bookmarkStart w:id="125" w:name="algorithms-and-the-research-objectives"/>
+    <w:bookmarkEnd w:id="126"/>
+    <w:bookmarkEnd w:id="127"/>
+    <w:bookmarkStart w:id="128" w:name="algorithms-and-the-research-objectives"/>
     <w:p>
       <w:pPr>
         <w:pStyle w:val="Heading2"/>
@@ -33960,9 +34015,9 @@
         <w:t xml:space="preserve">These equations demonstrate that trust is not provided by blockchain alone. Blockchain contributes integrity, tamper resistance, persistence, and auditability. DID and VC mechanisms contribute identity and authority evidence. Multi-party authorisation contributes collective decision-making. Policy evaluation contributes contextual compliance. Temporal and lifecycle controls contribute dynamic validity. The proposed framework integrates these mechanisms into a coherent authorisation process in which access is granted only when the required trust conditions are satisfied.</w:t>
       </w:r>
     </w:p>
-    <w:bookmarkEnd w:id="125"/>
-    <w:bookmarkEnd w:id="126"/>
-    <w:bookmarkStart w:id="158" w:name="halah-system-and-workflow"/>
+    <w:bookmarkEnd w:id="128"/>
+    <w:bookmarkEnd w:id="129"/>
+    <w:bookmarkStart w:id="161" w:name="halah-system-and-workflow"/>
     <w:p>
       <w:pPr>
         <w:pStyle w:val="Heading1"/>
@@ -34095,7 +34150,7 @@
         <w:t xml:space="preserve">This sequence provides an end-to-end demonstration of how the conceptual consent model is translated into an operational healthcare data-sharing process.</w:t>
       </w:r>
     </w:p>
-    <w:bookmarkStart w:id="127" w:name="halah-system"/>
+    <w:bookmarkStart w:id="130" w:name="halah-system"/>
     <w:p>
       <w:pPr>
         <w:pStyle w:val="Heading2"/>
@@ -34165,8 +34220,8 @@
         <w:t xml:space="preserve">The subsystem therefore serves as the entry point for demonstrating the complete authorisation process rather than functioning merely as a conventional patient-record application.</w:t>
       </w:r>
     </w:p>
-    <w:bookmarkEnd w:id="127"/>
-    <w:bookmarkStart w:id="131" w:name="X858cfcdf50eeab536ac64fcc0cad8eb3398a81c"/>
+    <w:bookmarkEnd w:id="130"/>
+    <w:bookmarkStart w:id="134" w:name="X858cfcdf50eeab536ac64fcc0cad8eb3398a81c"/>
     <w:p>
       <w:pPr>
         <w:pStyle w:val="Heading2"/>
@@ -34368,18 +34423,18 @@
           <wp:inline>
             <wp:extent cx="5465445" cy="2746127"/>
             <wp:effectExtent b="0" l="0" r="0" t="0"/>
-            <wp:docPr descr="Figure 12: HALAH patient subsystem – Create Smart Consent Contract" title="" id="129" name="Picture"/>
+            <wp:docPr descr="Figure 13: HALAH patient subsystem – Create Smart Consent Contract" title="" id="132" name="Picture"/>
             <a:graphic>
               <a:graphicData uri="http://schemas.openxmlformats.org/drawingml/2006/picture">
                 <pic:pic>
                   <pic:nvPicPr>
-                    <pic:cNvPr descr="halah_media/media/image1.png" id="130" name="Picture"/>
+                    <pic:cNvPr descr="halah_media/media/image1.png" id="133" name="Picture"/>
                     <pic:cNvPicPr>
                       <a:picLocks noChangeArrowheads="1" noChangeAspect="1"/>
                     </pic:cNvPicPr>
                   </pic:nvPicPr>
                   <pic:blipFill>
-                    <a:blip r:embed="rId128"/>
+                    <a:blip r:embed="rId131"/>
                     <a:stretch>
                       <a:fillRect/>
                     </a:stretch>
@@ -34411,7 +34466,7 @@
         <w:pStyle w:val="ImageCaption"/>
       </w:pPr>
       <w:r>
-        <w:t xml:space="preserve">Figure 12: HALAH patient subsystem – Create Smart Consent Contract</w:t>
+        <w:t xml:space="preserve">Figure 13: HALAH patient subsystem – Create Smart Consent Contract</w:t>
       </w:r>
     </w:p>
     <w:p>
@@ -34606,8 +34661,8 @@
         <w:t xml:space="preserve">.</w:t>
       </w:r>
     </w:p>
-    <w:bookmarkEnd w:id="131"/>
-    <w:bookmarkStart w:id="135" w:name="guardian-cryptographic-approval"/>
+    <w:bookmarkEnd w:id="134"/>
+    <w:bookmarkStart w:id="138" w:name="guardian-cryptographic-approval"/>
     <w:p>
       <w:pPr>
         <w:pStyle w:val="Heading2"/>
@@ -34646,18 +34701,18 @@
           <wp:inline>
             <wp:extent cx="5465445" cy="2225799"/>
             <wp:effectExtent b="0" l="0" r="0" t="0"/>
-            <wp:docPr descr="Figure 13: HALAH guardian subsystem – Guardian Cryptographic Approval" title="" id="133" name="Picture"/>
+            <wp:docPr descr="Figure 14: HALAH guardian subsystem – Guardian Cryptographic Approval" title="" id="136" name="Picture"/>
             <a:graphic>
               <a:graphicData uri="http://schemas.openxmlformats.org/drawingml/2006/picture">
                 <pic:pic>
                   <pic:nvPicPr>
-                    <pic:cNvPr descr="halah_media/media/image2.png" id="134" name="Picture"/>
+                    <pic:cNvPr descr="halah_media/media/image2.png" id="137" name="Picture"/>
                     <pic:cNvPicPr>
                       <a:picLocks noChangeArrowheads="1" noChangeAspect="1"/>
                     </pic:cNvPicPr>
                   </pic:nvPicPr>
                   <pic:blipFill>
-                    <a:blip r:embed="rId132"/>
+                    <a:blip r:embed="rId135"/>
                     <a:stretch>
                       <a:fillRect/>
                     </a:stretch>
@@ -34689,7 +34744,7 @@
         <w:pStyle w:val="ImageCaption"/>
       </w:pPr>
       <w:r>
-        <w:t xml:space="preserve">Figure 13: HALAH guardian subsystem – Guardian Cryptographic Approval</w:t>
+        <w:t xml:space="preserve">Figure 14: HALAH guardian subsystem – Guardian Cryptographic Approval</w:t>
       </w:r>
     </w:p>
     <w:p>
@@ -35026,8 +35081,8 @@
         <w:t xml:space="preserve">in the proposed architecture.</w:t>
       </w:r>
     </w:p>
-    <w:bookmarkEnd w:id="135"/>
-    <w:bookmarkStart w:id="142" w:name="secure-patient-data-access-for-doctor"/>
+    <w:bookmarkEnd w:id="138"/>
+    <w:bookmarkStart w:id="145" w:name="secure-patient-data-access-for-doctor"/>
     <w:p>
       <w:pPr>
         <w:pStyle w:val="Heading2"/>
@@ -35136,18 +35191,18 @@
           <wp:inline>
             <wp:extent cx="5465445" cy="3388081"/>
             <wp:effectExtent b="0" l="0" r="0" t="0"/>
-            <wp:docPr descr="Figure 14: HALAH doctor subsystem – consent information, state and authorised data scope" title="" id="137" name="Picture"/>
+            <wp:docPr descr="Figure 15: HALAH doctor subsystem – consent information, state and authorised data scope" title="" id="140" name="Picture"/>
             <a:graphic>
               <a:graphicData uri="http://schemas.openxmlformats.org/drawingml/2006/picture">
                 <pic:pic>
                   <pic:nvPicPr>
-                    <pic:cNvPr descr="halah_media/media/image3.png" id="138" name="Picture"/>
+                    <pic:cNvPr descr="halah_media/media/image3.png" id="141" name="Picture"/>
                     <pic:cNvPicPr>
                       <a:picLocks noChangeArrowheads="1" noChangeAspect="1"/>
                     </pic:cNvPicPr>
                   </pic:nvPicPr>
                   <pic:blipFill>
-                    <a:blip r:embed="rId136"/>
+                    <a:blip r:embed="rId139"/>
                     <a:stretch>
                       <a:fillRect/>
                     </a:stretch>
@@ -35179,7 +35234,7 @@
         <w:pStyle w:val="ImageCaption"/>
       </w:pPr>
       <w:r>
-        <w:t xml:space="preserve">Figure 14: HALAH doctor subsystem – consent information, state and authorised data scope</w:t>
+        <w:t xml:space="preserve">Figure 15: HALAH doctor subsystem – consent information, state and authorised data scope</w:t>
       </w:r>
     </w:p>
     <w:p>
@@ -35326,18 +35381,18 @@
           <wp:inline>
             <wp:extent cx="5465445" cy="3048937"/>
             <wp:effectExtent b="0" l="0" r="0" t="0"/>
-            <wp:docPr descr="Figure 15: HALAH doctor subsystem – requested modules, access decision and authorised medical records" title="" id="140" name="Picture"/>
+            <wp:docPr descr="Figure 16: HALAH doctor subsystem – requested modules, access decision and authorised medical records" title="" id="143" name="Picture"/>
             <a:graphic>
               <a:graphicData uri="http://schemas.openxmlformats.org/drawingml/2006/picture">
                 <pic:pic>
                   <pic:nvPicPr>
-                    <pic:cNvPr descr="halah_media/media/image4.png" id="141" name="Picture"/>
+                    <pic:cNvPr descr="halah_media/media/image4.png" id="144" name="Picture"/>
                     <pic:cNvPicPr>
                       <a:picLocks noChangeArrowheads="1" noChangeAspect="1"/>
                     </pic:cNvPicPr>
                   </pic:nvPicPr>
                   <pic:blipFill>
-                    <a:blip r:embed="rId139"/>
+                    <a:blip r:embed="rId142"/>
                     <a:stretch>
                       <a:fillRect/>
                     </a:stretch>
@@ -35369,7 +35424,7 @@
         <w:pStyle w:val="ImageCaption"/>
       </w:pPr>
       <w:r>
-        <w:t xml:space="preserve">Figure 15: HALAH doctor subsystem – requested modules, access decision and authorised medical records</w:t>
+        <w:t xml:space="preserve">Figure 16: HALAH doctor subsystem – requested modules, access decision and authorised medical records</w:t>
       </w:r>
     </w:p>
     <w:p>
@@ -35569,8 +35624,8 @@
         <w:t xml:space="preserve">.</w:t>
       </w:r>
     </w:p>
-    <w:bookmarkEnd w:id="142"/>
-    <w:bookmarkStart w:id="146" w:name="X57c96dacccf675fd0ab00cb69daa4402dc4878a"/>
+    <w:bookmarkEnd w:id="145"/>
+    <w:bookmarkStart w:id="149" w:name="X57c96dacccf675fd0ab00cb69daa4402dc4878a"/>
     <w:p>
       <w:pPr>
         <w:pStyle w:val="Heading2"/>
@@ -35612,18 +35667,18 @@
           <wp:inline>
             <wp:extent cx="5465445" cy="2905354"/>
             <wp:effectExtent b="0" l="0" r="0" t="0"/>
-            <wp:docPr descr="Figure 16: HALAH auditor subsystem – Blockchain Audit &amp; Consent Lifecycle" title="" id="144" name="Picture"/>
+            <wp:docPr descr="Figure 17: HALAH auditor subsystem – Blockchain Audit &amp; Consent Lifecycle" title="" id="147" name="Picture"/>
             <a:graphic>
               <a:graphicData uri="http://schemas.openxmlformats.org/drawingml/2006/picture">
                 <pic:pic>
                   <pic:nvPicPr>
-                    <pic:cNvPr descr="halah_media/media/image5.png" id="145" name="Picture"/>
+                    <pic:cNvPr descr="halah_media/media/image5.png" id="148" name="Picture"/>
                     <pic:cNvPicPr>
                       <a:picLocks noChangeArrowheads="1" noChangeAspect="1"/>
                     </pic:cNvPicPr>
                   </pic:nvPicPr>
                   <pic:blipFill>
-                    <a:blip r:embed="rId143"/>
+                    <a:blip r:embed="rId146"/>
                     <a:stretch>
                       <a:fillRect/>
                     </a:stretch>
@@ -35655,7 +35710,7 @@
         <w:pStyle w:val="ImageCaption"/>
       </w:pPr>
       <w:r>
-        <w:t xml:space="preserve">Figure 16: HALAH auditor subsystem – Blockchain Audit &amp; Consent Lifecycle</w:t>
+        <w:t xml:space="preserve">Figure 17: HALAH auditor subsystem – Blockchain Audit &amp; Consent Lifecycle</w:t>
       </w:r>
     </w:p>
     <w:p>
@@ -36411,8 +36466,8 @@
         <w:t xml:space="preserve">.</w:t>
       </w:r>
     </w:p>
-    <w:bookmarkEnd w:id="146"/>
-    <w:bookmarkStart w:id="147" w:name="detailed-audit-records"/>
+    <w:bookmarkEnd w:id="149"/>
+    <w:bookmarkStart w:id="150" w:name="detailed-audit-records"/>
     <w:p>
       <w:pPr>
         <w:pStyle w:val="Heading2"/>
@@ -36510,8 +36565,8 @@
         <w:t xml:space="preserve">CA 3 Discussion</w:t>
       </w:r>
     </w:p>
-    <w:bookmarkEnd w:id="147"/>
-    <w:bookmarkStart w:id="148" w:name="complete-blockchain-audit-ledger"/>
+    <w:bookmarkEnd w:id="150"/>
+    <w:bookmarkStart w:id="151" w:name="complete-blockchain-audit-ledger"/>
     <w:p>
       <w:pPr>
         <w:pStyle w:val="Heading2"/>
@@ -36630,8 +36685,8 @@
         <w:t xml:space="preserve">For example, the demonstrated sequence shows that the doctor receives a GRANTED result only after the consent has reached the ACTIVE state. This provides an implementation-level demonstration that access decisions are linked to the consent lifecycle rather than being independent application events.</w:t>
       </w:r>
     </w:p>
-    <w:bookmarkEnd w:id="148"/>
-    <w:bookmarkStart w:id="149" w:name="Xae142eb24e81642c0aa2124fc4bee8c550545ec"/>
+    <w:bookmarkEnd w:id="151"/>
+    <w:bookmarkStart w:id="152" w:name="Xae142eb24e81642c0aa2124fc4bee8c550545ec"/>
     <w:p>
       <w:pPr>
         <w:pStyle w:val="Heading2"/>
@@ -37245,8 +37300,8 @@
         <w:t xml:space="preserve">This mapping demonstrates that the implementation is not merely a collection of independent user-subsystem modules. Rather, the modules correspond to successive stages of the proposed authorisation protocol.</w:t>
       </w:r>
     </w:p>
-    <w:bookmarkEnd w:id="149"/>
-    <w:bookmarkStart w:id="150" w:name="overall-system-demonstration"/>
+    <w:bookmarkEnd w:id="152"/>
+    <w:bookmarkStart w:id="153" w:name="overall-system-demonstration"/>
     <w:p>
       <w:pPr>
         <w:pStyle w:val="Heading2"/>
@@ -37483,8 +37538,8 @@
         <w:t xml:space="preserve">. The user subsystems provide a visible representation of this continuity, allowing the proposed HALAH model to be demonstrated as an operational authorisation workflow rather than only as a conceptual framework.</w:t>
       </w:r>
     </w:p>
-    <w:bookmarkEnd w:id="150"/>
-    <w:bookmarkStart w:id="154" w:name="X88b3d53607b792a9f4430f1be3c348b9a46cb27"/>
+    <w:bookmarkEnd w:id="153"/>
+    <w:bookmarkStart w:id="157" w:name="X88b3d53607b792a9f4430f1be3c348b9a46cb27"/>
     <w:p>
       <w:pPr>
         <w:pStyle w:val="Heading2"/>
@@ -38186,7 +38241,7 @@
         <w:pStyle w:val="BodyText"/>
       </w:pPr>
       <w:r>
-        <w:t xml:space="preserve">Figure 17 traces one consent through the four subsystems of the prototype and shows where each check is enforced and which events are written to the audit log.</w:t>
+        <w:t xml:space="preserve">Figure 18 traces one consent through the four subsystems of the prototype and shows where each check is enforced and which events are written to the audit log.</w:t>
       </w:r>
     </w:p>
     <w:p>
@@ -38198,18 +38253,18 @@
           <wp:inline>
             <wp:extent cx="3886200" cy="7632356"/>
             <wp:effectExtent b="0" l="0" r="0" t="0"/>
-            <wp:docPr descr="Figure 17: HALAH prototype workflow from consent creation to audited access decision" title="" id="152" name="Picture"/>
+            <wp:docPr descr="Figure 18: HALAH prototype workflow from consent creation to audited access decision" title="" id="155" name="Picture"/>
             <a:graphic>
               <a:graphicData uri="http://schemas.openxmlformats.org/drawingml/2006/picture">
                 <pic:pic>
                   <pic:nvPicPr>
-                    <pic:cNvPr descr="media_bw/fig_halah.png" id="153" name="Picture"/>
+                    <pic:cNvPr descr="media_bw/fig_halah.png" id="156" name="Picture"/>
                     <pic:cNvPicPr>
                       <a:picLocks noChangeArrowheads="1" noChangeAspect="1"/>
                     </pic:cNvPicPr>
                   </pic:nvPicPr>
                   <pic:blipFill>
-                    <a:blip r:embed="rId151"/>
+                    <a:blip r:embed="rId154"/>
                     <a:stretch>
                       <a:fillRect/>
                     </a:stretch>
@@ -38241,11 +38296,11 @@
         <w:pStyle w:val="ImageCaption"/>
       </w:pPr>
       <w:r>
-        <w:t xml:space="preserve">Figure 17: HALAH prototype workflow from consent creation to audited access decision</w:t>
-      </w:r>
-    </w:p>
-    <w:bookmarkEnd w:id="154"/>
-    <w:bookmarkStart w:id="155" w:name="automated-test-evidence"/>
+        <w:t xml:space="preserve">Figure 18: HALAH prototype workflow from consent creation to audited access decision</w:t>
+      </w:r>
+    </w:p>
+    <w:bookmarkEnd w:id="157"/>
+    <w:bookmarkStart w:id="158" w:name="automated-test-evidence"/>
     <w:p>
       <w:pPr>
         <w:pStyle w:val="Heading2"/>
@@ -39126,8 +39181,8 @@
         <w:t xml:space="preserve">These are functional unit and integration tests in which the blockchain is mocked. They provide initial evidence for SRQ1–SRQ4 and for the first SRQ5 checks, but they are not yet the complete valid, negative and adversarial scenario set of Algorithm 6. Negative cases still to be added in Stage 2 include insufficient approvals at the data-release gate, a duplicate approval attempt, an out-of-scope request submitted directly to the service interface, and a request with a mismatched declared purpose.</w:t>
       </w:r>
     </w:p>
-    <w:bookmarkEnd w:id="155"/>
-    <w:bookmarkStart w:id="156" w:name="on-chain-evidence"/>
+    <w:bookmarkEnd w:id="158"/>
+    <w:bookmarkStart w:id="159" w:name="on-chain-evidence"/>
     <w:p>
       <w:pPr>
         <w:pStyle w:val="Heading2"/>
@@ -39411,8 +39466,8 @@
         </w:tc>
       </w:tr>
     </w:tbl>
-    <w:bookmarkEnd w:id="156"/>
-    <w:bookmarkStart w:id="157" w:name="implementation-status-and-limitations"/>
+    <w:bookmarkEnd w:id="159"/>
+    <w:bookmarkStart w:id="160" w:name="implementation-status-and-limitations"/>
     <w:p>
       <w:pPr>
         <w:pStyle w:val="Heading2"/>
@@ -39426,7 +39481,7 @@
         <w:pStyle w:val="FirstParagraph"/>
       </w:pPr>
       <w:r>
-        <w:t xml:space="preserve">The screenshots in Figures 12–16 were captured from the first version of the prototype. The current version (v1.1) records guardian approvals as EIP-712 signatures, labels the data-access proof as a placeholder unless the zero-knowledge circuit is built, and reports on-chain anchoring per event. The following limitations apply to the current evidence:</w:t>
+        <w:t xml:space="preserve">The screenshots in Figures 13–17 were captured from the first version of the prototype. The current version (v1.1) records guardian approvals as EIP-712 signatures, labels the data-access proof as a placeholder unless the zero-knowledge circuit is built, and reports on-chain anchoring per event. The following limitations apply to the current evidence:</w:t>
       </w:r>
     </w:p>
     <w:p>
@@ -39558,9 +39613,9 @@
         <w:t xml:space="preserve">Evaluation to date is functional (18 automated tests); performance and adversarial measurements are Stage 2 work.</w:t>
       </w:r>
     </w:p>
-    <w:bookmarkEnd w:id="157"/>
-    <w:bookmarkEnd w:id="158"/>
-    <w:bookmarkStart w:id="165" w:name="current-progress-status"/>
+    <w:bookmarkEnd w:id="160"/>
+    <w:bookmarkEnd w:id="161"/>
+    <w:bookmarkStart w:id="168" w:name="current-progress-status"/>
     <w:p>
       <w:pPr>
         <w:pStyle w:val="Heading1"/>
@@ -39569,7 +39624,7 @@
         <w:t xml:space="preserve">8 Current Progress Status</w:t>
       </w:r>
     </w:p>
-    <w:bookmarkStart w:id="159" w:name="X14610c74215ca842dde591adf203c91218a1a96"/>
+    <w:bookmarkStart w:id="162" w:name="X14610c74215ca842dde591adf203c91218a1a96"/>
     <w:p>
       <w:pPr>
         <w:pStyle w:val="Heading2"/>
@@ -39780,8 +39835,8 @@
         <w:t xml:space="preserve">(Section 7.2). This provides a conceptual basis for dynamic access decisions and allows subsequent authorisation conditions to be evaluated consistently.</w:t>
       </w:r>
     </w:p>
-    <w:bookmarkEnd w:id="159"/>
-    <w:bookmarkStart w:id="160" w:name="X559e9df15ebd031f98715062b5b54bf7a8f1d60"/>
+    <w:bookmarkEnd w:id="162"/>
+    <w:bookmarkStart w:id="163" w:name="X559e9df15ebd031f98715062b5b54bf7a8f1d60"/>
     <w:p>
       <w:pPr>
         <w:pStyle w:val="Heading2"/>
@@ -39850,8 +39905,8 @@
         <w:t xml:space="preserve">The current implementation demonstrates the separation between participant identity and authorisation authority. A valid healthcare participant identity can be verified independently from the question of whether that participant is authorised to access a particular patient’s data. In the prototype, guardian approvals are EIP-712 signatures verified by public-key recovery; a wrong guardian, a wrong consent identifier or a missing signature is rejected (Table 9, T1).</w:t>
       </w:r>
     </w:p>
-    <w:bookmarkEnd w:id="160"/>
-    <w:bookmarkStart w:id="161" w:name="Xf706e6be99deea6c1433defe6c0978157a655ed"/>
+    <w:bookmarkEnd w:id="163"/>
+    <w:bookmarkStart w:id="164" w:name="Xf706e6be99deea6c1433defe6c0978157a655ed"/>
     <w:p>
       <w:pPr>
         <w:pStyle w:val="Heading2"/>
@@ -39971,7 +40026,7 @@
         <w:pStyle w:val="BodyText"/>
       </w:pPr>
       <w:r>
-        <w:t xml:space="preserve">For example, with two guardians, one approval leaves the consent in the PENDING_SIGNATURE state, and two approvals followed by SBT minting activate it (Eqs. (22)–(23); Figure 13; Table 9, T3).</w:t>
+        <w:t xml:space="preserve">For example, with two guardians, one approval leaves the consent in the PENDING_SIGNATURE state, and two approvals followed by SBT minting activate it (Eqs. (22)–(23); Figure 14; Table 9, T3).</w:t>
       </w:r>
     </w:p>
     <w:p>
@@ -39990,8 +40045,8 @@
         <w:t xml:space="preserve">This provides preliminary evidence that the proposed framework can enforce collective rather than unilateral authorisation.</w:t>
       </w:r>
     </w:p>
-    <w:bookmarkEnd w:id="161"/>
-    <w:bookmarkStart w:id="162" w:name="X8600b2f76ef27bbd75c7c71838aa9377b2ebdb3"/>
+    <w:bookmarkEnd w:id="164"/>
+    <w:bookmarkStart w:id="165" w:name="X8600b2f76ef27bbd75c7c71838aa9377b2ebdb3"/>
     <w:p>
       <w:pPr>
         <w:pStyle w:val="Heading2"/>
@@ -40017,7 +40072,7 @@
         <w:pStyle w:val="BodyText"/>
       </w:pPr>
       <w:r>
-        <w:t xml:space="preserve">RO4 has been implemented at prototype level. The Doctor interface (Figures 14–15, Section 7.4) allows the requester to select only modules from the consented scope, and the service layer independently enforces</w:t>
+        <w:t xml:space="preserve">RO4 has been implemented at prototype level. The Doctor interface (Figures 15–16, Section 7.4) allows the requester to select only modules from the consented scope, and the service layer independently enforces</w:t>
       </w:r>
       <w:r>
         <w:t xml:space="preserve"> </w:t>
@@ -40096,8 +40151,8 @@
         <w:t xml:space="preserve">) and routing data release through the full decision matrix are scheduled for Stage 2 (Section 6.4.1).</w:t>
       </w:r>
     </w:p>
-    <w:bookmarkEnd w:id="162"/>
-    <w:bookmarkStart w:id="163" w:name="X8e6146f09fe285d619620b5d8a35865b7344e11"/>
+    <w:bookmarkEnd w:id="165"/>
+    <w:bookmarkStart w:id="166" w:name="X8e6146f09fe285d619620b5d8a35865b7344e11"/>
     <w:p>
       <w:pPr>
         <w:pStyle w:val="Heading2"/>
@@ -40179,8 +40234,8 @@
         <w:t xml:space="preserve">The expected outcome is a lifecycle-aware consent mechanism capable of rejecting access after expiration or revocation and preventing unauthorised lifecycle transitions. This work will constitute a major component of next stage.</w:t>
       </w:r>
     </w:p>
-    <w:bookmarkEnd w:id="163"/>
-    <w:bookmarkStart w:id="164" w:name="Xd9cfcdd9e757a6720ff3496d27d05dcd5fd4592"/>
+    <w:bookmarkEnd w:id="166"/>
+    <w:bookmarkStart w:id="167" w:name="Xd9cfcdd9e757a6720ff3496d27d05dcd5fd4592"/>
     <w:p>
       <w:pPr>
         <w:pStyle w:val="Heading2"/>
@@ -40249,9 +40304,9 @@
         <w:t xml:space="preserve">The remaining security assurance and comprehensive empirical evaluation will be conducted in next stage. These activities will include policy-violation scenarios, temporal expiration, revocation, invalid lifecycle transitions, formal security properties, and broader experimental validation.</w:t>
       </w:r>
     </w:p>
-    <w:bookmarkEnd w:id="164"/>
-    <w:bookmarkEnd w:id="165"/>
-    <w:bookmarkStart w:id="166" w:name="publications-summary"/>
+    <w:bookmarkEnd w:id="167"/>
+    <w:bookmarkEnd w:id="168"/>
+    <w:bookmarkStart w:id="169" w:name="publications-summary"/>
     <w:p>
       <w:pPr>
         <w:pStyle w:val="Heading1"/>
@@ -40593,8 +40648,8 @@
         <w:t xml:space="preserve">The publication strategy is aligned with the progression of the research. The current stage work establishes the conceptual and technical foundation, while the next stage work will strengthen the framework through formal analysis and comprehensive empirical validation.</w:t>
       </w:r>
     </w:p>
-    <w:bookmarkEnd w:id="166"/>
-    <w:bookmarkStart w:id="169" w:name="research-plan"/>
+    <w:bookmarkEnd w:id="169"/>
+    <w:bookmarkStart w:id="172" w:name="research-plan"/>
     <w:p>
       <w:pPr>
         <w:pStyle w:val="Heading1"/>
@@ -40611,7 +40666,7 @@
         <w:t xml:space="preserve">The research plan is divided into two major stages corresponding to current and next stage.</w:t>
       </w:r>
     </w:p>
-    <w:bookmarkStart w:id="167" w:name="current-stage-completed-and-current-work"/>
+    <w:bookmarkStart w:id="170" w:name="current-stage-completed-and-current-work"/>
     <w:p>
       <w:pPr>
         <w:pStyle w:val="Heading2"/>
@@ -40636,8 +40691,8 @@
         <w:t xml:space="preserve">RO1–RO4 have been implemented at prototype level and initially validated through the HALAH prototype (Chapter 7), and a first version of RO5 (expiry and revocation) is already operational.</w:t>
       </w:r>
     </w:p>
-    <w:bookmarkEnd w:id="167"/>
-    <w:bookmarkStart w:id="168" w:name="next-stage-planned-work"/>
+    <w:bookmarkEnd w:id="170"/>
+    <w:bookmarkStart w:id="171" w:name="next-stage-planned-work"/>
     <w:p>
       <w:pPr>
         <w:pStyle w:val="Heading2"/>
@@ -41268,9 +41323,9 @@
         <w:t xml:space="preserve">that trust should no longer apply.</w:t>
       </w:r>
     </w:p>
-    <w:bookmarkEnd w:id="168"/>
-    <w:bookmarkEnd w:id="169"/>
-    <w:bookmarkStart w:id="170" w:name="references"/>
+    <w:bookmarkEnd w:id="171"/>
+    <w:bookmarkEnd w:id="172"/>
+    <w:bookmarkStart w:id="173" w:name="references"/>
     <w:p>
       <w:pPr>
         <w:pStyle w:val="Heading1"/>
@@ -42121,7 +42176,7 @@
         <w:t xml:space="preserve">[42] W3C. Verifiable Credentials Data Model v2.0. W3C Recommendation, 2025. https://www.w3.org/TR/vc-data-model-2.0/.</w:t>
       </w:r>
     </w:p>
-    <w:bookmarkEnd w:id="170"/>
+    <w:bookmarkEnd w:id="173"/>
     <w:sectPr>
       <w:footnotePr>
         <w:numRestart w:val="eachSect"/>

</xml_diff>

<commit_message>
CA2 report: Figures 3 and 4 redesigned in original colours, vector exports
- Figure 3 keeps the original stakeholder order (Auditors ... Patients) and
  banded View/Controller/Model design; model row respaced for readability
- Figures 3 and 4 exported as PNG, PDF and SVG for direct use in the report

Co-Authored-By: Claude Opus 5.5 <noreply@anthropic.com>
Claude-Session: https://claude.ai/code/session_017h1Gwx95j2svhJWPEddHRu
</commit_message>
<xml_diff>
--- a/review/word/Yasir_CA2_Report_CLEAN.docx
+++ b/review/word/Yasir_CA2_Report_CLEAN.docx
@@ -8976,7 +8976,7 @@
       <w:r>
         <w:drawing>
           <wp:inline>
-            <wp:extent cx="5753100" cy="5884501"/>
+            <wp:extent cx="5753100" cy="5876720"/>
             <wp:effectExtent b="0" l="0" r="0" t="0"/>
             <wp:docPr descr="Figure 3: Layered MVC Architecture and Component Decomposition of the HALAH Framework" title="" id="59" name="Picture"/>
             <a:graphic>
@@ -8997,7 +8997,7 @@
                   <pic:spPr bwMode="auto">
                     <a:xfrm>
                       <a:off x="0" y="0"/>
-                      <a:ext cx="5753100" cy="5884501"/>
+                      <a:ext cx="5753100" cy="5876720"/>
                     </a:xfrm>
                     <a:prstGeom prst="rect">
                       <a:avLst/>

</xml_diff>

<commit_message>
CA2 report: align every figure with the text, equations and algorithms
- Fig 2 exclusion reason uses criterion 1 wording; note on automation tools
- Fig 4 labels match Section 5.1.1 (Healthcare Professional, Audit Coordination)
- Fig 5 shows Controller evaluating Model evidence; Fig 6 failed checks -> DENY
- Figs 7-12 aligned with Algorithms 1-6 (missing checks and steps added)
- Figure files exported as PNG, PDF and SVG; consistency table in change log

Co-Authored-By: Claude Opus 5.5 <noreply@anthropic.com>
Claude-Session: https://claude.ai/code/session_017h1Gwx95j2svhJWPEddHRu
</commit_message>
<xml_diff>
--- a/review/word/Yasir_CA2_Report_CLEAN.docx
+++ b/review/word/Yasir_CA2_Report_CLEAN.docx
@@ -1351,7 +1351,7 @@
       <w:r>
         <w:drawing>
           <wp:inline>
-            <wp:extent cx="5753100" cy="2898564"/>
+            <wp:extent cx="5753100" cy="3074679"/>
             <wp:effectExtent b="0" l="0" r="0" t="0"/>
             <wp:docPr descr="Figure 2: PRISMA Study Selection Summary" title="" id="23" name="Picture"/>
             <a:graphic>
@@ -1372,7 +1372,7 @@
                   <pic:spPr bwMode="auto">
                     <a:xfrm>
                       <a:off x="0" y="0"/>
-                      <a:ext cx="5753100" cy="2898564"/>
+                      <a:ext cx="5753100" cy="3074679"/>
                     </a:xfrm>
                     <a:prstGeom prst="rect">
                       <a:avLst/>
@@ -9527,7 +9527,7 @@
       <w:r>
         <w:drawing>
           <wp:inline>
-            <wp:extent cx="2880360" cy="7676010"/>
+            <wp:extent cx="3419856" cy="7671897"/>
             <wp:effectExtent b="0" l="0" r="0" t="0"/>
             <wp:docPr descr="Figure 5: Trust Predicate Evaluation and Authorisation Decision Flow" title="" id="66" name="Picture"/>
             <a:graphic>
@@ -9548,7 +9548,7 @@
                   <pic:spPr bwMode="auto">
                     <a:xfrm>
                       <a:off x="0" y="0"/>
-                      <a:ext cx="2880360" cy="7676010"/>
+                      <a:ext cx="3419856" cy="7671897"/>
                     </a:xfrm>
                     <a:prstGeom prst="rect">
                       <a:avLst/>
@@ -10274,7 +10274,7 @@
       <w:r>
         <w:drawing>
           <wp:inline>
-            <wp:extent cx="2121408" cy="7666389"/>
+            <wp:extent cx="2194560" cy="7674568"/>
             <wp:effectExtent b="0" l="0" r="0" t="0"/>
             <wp:docPr descr="Figure 6: End-to-End Workflow of Trust-Oriented Consent Authorisation Framework" title="" id="73" name="Picture"/>
             <a:graphic>
@@ -10295,7 +10295,7 @@
                   <pic:spPr bwMode="auto">
                     <a:xfrm>
                       <a:off x="0" y="0"/>
-                      <a:ext cx="2121408" cy="7666389"/>
+                      <a:ext cx="2194560" cy="7674568"/>
                     </a:xfrm>
                     <a:prstGeom prst="rect">
                       <a:avLst/>
@@ -13398,7 +13398,7 @@
       <w:r>
         <w:drawing>
           <wp:inline>
-            <wp:extent cx="4288536" cy="7675254"/>
+            <wp:extent cx="3913632" cy="7680896"/>
             <wp:effectExtent b="0" l="0" r="0" t="0"/>
             <wp:docPr descr="Figure 7: RO1 workflow for trust-centric consent creation" title="" id="87" name="Picture"/>
             <a:graphic>
@@ -13419,7 +13419,7 @@
                   <pic:spPr bwMode="auto">
                     <a:xfrm>
                       <a:off x="0" y="0"/>
-                      <a:ext cx="4288536" cy="7675254"/>
+                      <a:ext cx="3913632" cy="7680896"/>
                     </a:xfrm>
                     <a:prstGeom prst="rect">
                       <a:avLst/>
@@ -15426,7 +15426,7 @@
       <w:r>
         <w:drawing>
           <wp:inline>
-            <wp:extent cx="4480560" cy="7681842"/>
+            <wp:extent cx="4133087" cy="7678519"/>
             <wp:effectExtent b="0" l="0" r="0" t="0"/>
             <wp:docPr descr="Figure 8: RO2 workflow for decentralised identity and authority verification" title="" id="95" name="Picture"/>
             <a:graphic>
@@ -15447,7 +15447,7 @@
                   <pic:spPr bwMode="auto">
                     <a:xfrm>
                       <a:off x="0" y="0"/>
-                      <a:ext cx="4480560" cy="7681842"/>
+                      <a:ext cx="4133087" cy="7678519"/>
                     </a:xfrm>
                     <a:prstGeom prst="rect">
                       <a:avLst/>
@@ -17800,7 +17800,7 @@
       <w:r>
         <w:drawing>
           <wp:inline>
-            <wp:extent cx="4690872" cy="7676810"/>
+            <wp:extent cx="5753100" cy="7461079"/>
             <wp:effectExtent b="0" l="0" r="0" t="0"/>
             <wp:docPr descr="Figure 9: RO3 workflow for threshold-based multi-party authorisation" title="" id="102" name="Picture"/>
             <a:graphic>
@@ -17821,7 +17821,7 @@
                   <pic:spPr bwMode="auto">
                     <a:xfrm>
                       <a:off x="0" y="0"/>
-                      <a:ext cx="4690872" cy="7676810"/>
+                      <a:ext cx="5753100" cy="7461079"/>
                     </a:xfrm>
                     <a:prstGeom prst="rect">
                       <a:avLst/>
@@ -21421,7 +21421,7 @@
       <w:r>
         <w:drawing>
           <wp:inline>
-            <wp:extent cx="2788920" cy="7689425"/>
+            <wp:extent cx="3072384" cy="7684849"/>
             <wp:effectExtent b="0" l="0" r="0" t="0"/>
             <wp:docPr descr="Figure 10: RO4 workflow for policy- and context-aware access control" title="" id="108" name="Picture"/>
             <a:graphic>
@@ -21442,7 +21442,7 @@
                   <pic:spPr bwMode="auto">
                     <a:xfrm>
                       <a:off x="0" y="0"/>
-                      <a:ext cx="2788920" cy="7689425"/>
+                      <a:ext cx="3072384" cy="7684849"/>
                     </a:xfrm>
                     <a:prstGeom prst="rect">
                       <a:avLst/>
@@ -28620,7 +28620,7 @@
       <w:r>
         <w:drawing>
           <wp:inline>
-            <wp:extent cx="4142232" cy="7687826"/>
+            <wp:extent cx="3593592" cy="7679000"/>
             <wp:effectExtent b="0" l="0" r="0" t="0"/>
             <wp:docPr descr="Figure 11: RO5 planned workflow for temporal and consent lifecycle trust" title="" id="117" name="Picture"/>
             <a:graphic>
@@ -28641,7 +28641,7 @@
                   <pic:spPr bwMode="auto">
                     <a:xfrm>
                       <a:off x="0" y="0"/>
-                      <a:ext cx="4142232" cy="7687826"/>
+                      <a:ext cx="3593592" cy="7679000"/>
                     </a:xfrm>
                     <a:prstGeom prst="rect">
                       <a:avLst/>
@@ -29256,7 +29256,7 @@
       <w:r>
         <w:drawing>
           <wp:inline>
-            <wp:extent cx="5753100" cy="6601216"/>
+            <wp:extent cx="5753100" cy="7402813"/>
             <wp:effectExtent b="0" l="0" r="0" t="0"/>
             <wp:docPr descr="Figure 12: RO6 planned workflow for formal security assurance and empirical validation" title="" id="123" name="Picture"/>
             <a:graphic>
@@ -29277,7 +29277,7 @@
                   <pic:spPr bwMode="auto">
                     <a:xfrm>
                       <a:off x="0" y="0"/>
-                      <a:ext cx="5753100" cy="6601216"/>
+                      <a:ext cx="5753100" cy="7402813"/>
                     </a:xfrm>
                     <a:prstGeom prst="rect">
                       <a:avLst/>

</xml_diff>

<commit_message>
CA2 report: figures checked against the text; workflows 7-12 and 18 redrawn in colour
- Figures 7-12 aligned step by step with Algorithms 1-6 (missing checks added)
- Each workflow figure is now cited in its paragraph; Figures 8-12 moved
  next to the paragraph that describes them
- Figure 10 laid out with each check beside its step so it is readable
- Figure wrapper tables widened so no image is clipped in the red-line
- Change log and figure sources updated

Co-Authored-By: Claude Fable 5.1 <noreply@anthropic.com>
Claude-Session: https://claude.ai/code/session_017h1Gwx95j2svhJWPEddHRu
</commit_message>
<xml_diff>
--- a/review/word/Yasir_CA2_Report_CLEAN.docx
+++ b/review/word/Yasir_CA2_Report_CLEAN.docx
@@ -1351,7 +1351,7 @@
       <w:r>
         <w:drawing>
           <wp:inline>
-            <wp:extent cx="5753100" cy="3074679"/>
+            <wp:extent cx="5486400" cy="2932144"/>
             <wp:effectExtent b="0" l="0" r="0" t="0"/>
             <wp:docPr descr="Figure 2: PRISMA Study Selection Summary" title="" id="23" name="Picture"/>
             <a:graphic>
@@ -1372,7 +1372,7 @@
                   <pic:spPr bwMode="auto">
                     <a:xfrm>
                       <a:off x="0" y="0"/>
-                      <a:ext cx="5753100" cy="3074679"/>
+                      <a:ext cx="5486400" cy="2932144"/>
                     </a:xfrm>
                     <a:prstGeom prst="rect">
                       <a:avLst/>
@@ -8976,7 +8976,7 @@
       <w:r>
         <w:drawing>
           <wp:inline>
-            <wp:extent cx="5753100" cy="5876720"/>
+            <wp:extent cx="5486400" cy="5604289"/>
             <wp:effectExtent b="0" l="0" r="0" t="0"/>
             <wp:docPr descr="Figure 3: Layered MVC Architecture and Component Decomposition of the HALAH Framework" title="" id="59" name="Picture"/>
             <a:graphic>
@@ -8997,7 +8997,7 @@
                   <pic:spPr bwMode="auto">
                     <a:xfrm>
                       <a:off x="0" y="0"/>
-                      <a:ext cx="5753100" cy="5876720"/>
+                      <a:ext cx="5486400" cy="5604289"/>
                     </a:xfrm>
                     <a:prstGeom prst="rect">
                       <a:avLst/>
@@ -9048,7 +9048,7 @@
       <w:r>
         <w:drawing>
           <wp:inline>
-            <wp:extent cx="5753100" cy="3155240"/>
+            <wp:extent cx="5486400" cy="3008970"/>
             <wp:effectExtent b="0" l="0" r="0" t="0"/>
             <wp:docPr descr="Figure 4: Functional Decomposition of the MVC Components" title="" id="62" name="Picture"/>
             <a:graphic>
@@ -9069,7 +9069,7 @@
                   <pic:spPr bwMode="auto">
                     <a:xfrm>
                       <a:off x="0" y="0"/>
-                      <a:ext cx="5753100" cy="3155240"/>
+                      <a:ext cx="5486400" cy="3008970"/>
                     </a:xfrm>
                     <a:prstGeom prst="rect">
                       <a:avLst/>
@@ -13380,7 +13380,7 @@
         <w:pStyle w:val="FirstParagraph"/>
       </w:pPr>
       <w:r>
-        <w:t xml:space="preserve">The following workflow describes the creation of a trust-aware consent object. The process begins with a patient request and ends with a structured consent record that can be verified by subsequent authorisation services.</w:t>
+        <w:t xml:space="preserve">The following workflow(Figure 7) describes the creation of a trust-aware consent object. The process begins with a patient request and ends with a structured consent record that can be verified by subsequent authorisation services.</w:t>
       </w:r>
     </w:p>
     <w:p>
@@ -13398,14 +13398,14 @@
       <w:r>
         <w:drawing>
           <wp:inline>
-            <wp:extent cx="3913632" cy="7680896"/>
+            <wp:extent cx="3593592" cy="7675998"/>
             <wp:effectExtent b="0" l="0" r="0" t="0"/>
             <wp:docPr descr="Figure 7: RO1 workflow for trust-centric consent creation" title="" id="87" name="Picture"/>
             <a:graphic>
               <a:graphicData uri="http://schemas.openxmlformats.org/drawingml/2006/picture">
                 <pic:pic>
                   <pic:nvPicPr>
-                    <pic:cNvPr descr="media_bw/fig07.png" id="88" name="Picture"/>
+                    <pic:cNvPr descr="media_col/fig07.png" id="88" name="Picture"/>
                     <pic:cNvPicPr>
                       <a:picLocks noChangeArrowheads="1" noChangeAspect="1"/>
                     </pic:cNvPicPr>
@@ -13419,7 +13419,7 @@
                   <pic:spPr bwMode="auto">
                     <a:xfrm>
                       <a:off x="0" y="0"/>
-                      <a:ext cx="3913632" cy="7680896"/>
+                      <a:ext cx="3593592" cy="7675998"/>
                     </a:xfrm>
                     <a:prstGeom prst="rect">
                       <a:avLst/>
@@ -15220,7 +15220,7 @@
         <w:t xml:space="preserve">is the requesting participant. The DID verification process establishes whether the identity reference is valid. The VC verification process establishes whether the participant possesses valid authority evidence. The final authorisation decision remains dependent on the consent requirements and access policy.</w:t>
       </w:r>
     </w:p>
-    <w:bookmarkStart w:id="93" w:name="X40f13bf52dbab2e76356a6753423f1584e794fb"/>
+    <w:bookmarkStart w:id="96" w:name="X40f13bf52dbab2e76356a6753423f1584e794fb"/>
     <w:p>
       <w:pPr>
         <w:pStyle w:val="Heading3"/>
@@ -15234,189 +15234,7 @@
         <w:pStyle w:val="FirstParagraph"/>
       </w:pPr>
       <w:r>
-        <w:t xml:space="preserve">The workflow begins when a participant attempts to participate in the consent process or requests access to healthcare data. The system resolves and verifies the participant’s DID and then retrieves the associated VC. The credential is checked for validity and its claims are examined to determine whether the participant possesses the authority required by the consent.</w:t>
-      </w:r>
-    </w:p>
-    <w:p>
-      <w:pPr>
-        <w:pStyle w:val="BodyText"/>
-      </w:pPr>
-      <w:r>
-        <w:t xml:space="preserve">In the HALAH prototype, identity and authority are established in two separate steps. First, the guardian’s DID is checked for syntactic validity. Second, the guardian’s approval is expressed as an EIP-712 typed-data signature [39] over the consent identifier, and the approval is accepted only if the address recovered from the signature matches the address bound to that guardian DID; an approval that fails this check is rejected and does not count towards the threshold (Section 7.3). For demonstration, guardian keys are derived deterministically from the DID; in deployment, each guardian would sign the same typed data with their own wallet. Full W3C Verifiable Credential verification [41, 42], covering issuer, proof, credential status and validity period (Steps 3–4 below), is specified here but has not yet been implemented and is scheduled for Stage 2 (CA3). The prototype therefore already separates</w:t>
-      </w:r>
-      <w:r>
-        <w:t xml:space="preserve"> </w:t>
-      </w:r>
-      <w:r>
-        <w:rPr>
-          <w:i/>
-          <w:iCs/>
-        </w:rPr>
-        <w:t xml:space="preserve">who</w:t>
-      </w:r>
-      <w:r>
-        <w:t xml:space="preserve"> </w:t>
-      </w:r>
-      <w:r>
-        <w:t xml:space="preserve">the guardian is from</w:t>
-      </w:r>
-      <w:r>
-        <w:t xml:space="preserve"> </w:t>
-      </w:r>
-      <w:r>
-        <w:rPr>
-          <w:i/>
-          <w:iCs/>
-        </w:rPr>
-        <w:t xml:space="preserve">whether</w:t>
-      </w:r>
-      <w:r>
-        <w:t xml:space="preserve"> </w:t>
-      </w:r>
-      <w:r>
-        <w:t xml:space="preserve">their approval is cryptographically valid, but does not yet verify credential-based authority.</w:t>
-      </w:r>
-    </w:p>
-    <w:p>
-      <w:pPr>
-        <w:pStyle w:val="BodyText"/>
-      </w:pPr>
-      <w:r>
-        <w:t xml:space="preserve">The output of RO2 is not an access-grant decision. It is a verified identity and authority result that can be consumed by RO3 and RO4. This separation prevents a participant from obtaining access merely by presenting a valid identity credential.</w:t>
-      </w:r>
-    </w:p>
-    <w:bookmarkEnd w:id="93"/>
-    <w:bookmarkStart w:id="97" w:name="Xa8518206654d9551af54c2e3b82ee4012d4395c"/>
-    <w:p>
-      <w:pPr>
-        <w:pStyle w:val="Heading3"/>
-      </w:pPr>
-      <w:r>
-        <w:t xml:space="preserve">6.2.2 Procedure for DID and VC Identity and Authority Verification</w:t>
-      </w:r>
-    </w:p>
-    <w:p>
-      <w:pPr>
-        <w:pStyle w:val="FirstParagraph"/>
-      </w:pPr>
-      <w:r>
-        <w:t xml:space="preserve">The DID and VC Identity and Authority Verification procedure determines whether a participant possesses a valid decentralised identity and sufficient verifiable authority to participate in the consent-defined authorisation process. The procedure establishes a verifiable relationship between the participant</w:t>
-      </w:r>
-      <w:r>
-        <w:t xml:space="preserve"> </w:t>
-      </w:r>
-      <w:r>
-        <w:rPr>
-          <w:i/>
-          <w:iCs/>
-        </w:rPr>
-        <w:t xml:space="preserve">u</w:t>
-      </w:r>
-      <w:r>
-        <w:t xml:space="preserve">, the identity information represented by the DID, the attributes contained in the associated VC, and the authority requirements specified by the consent object</w:t>
-      </w:r>
-      <w:r>
-        <w:t xml:space="preserve"> </w:t>
-      </w:r>
-      <w:r>
-        <w:rPr>
-          <w:i/>
-          <w:iCs/>
-        </w:rPr>
-        <w:t xml:space="preserve">C</w:t>
-      </w:r>
-      <w:r>
-        <w:t xml:space="preserve">. The procedure consists of the following steps.</w:t>
-      </w:r>
-    </w:p>
-    <w:p>
-      <w:pPr>
-        <w:pStyle w:val="Compact"/>
-        <w:numPr>
-          <w:ilvl w:val="0"/>
-          <w:numId w:val="1016"/>
-        </w:numPr>
-      </w:pPr>
-      <w:r>
-        <w:rPr>
-          <w:b/>
-          <w:bCs/>
-        </w:rPr>
-        <w:t xml:space="preserve">Step 1 – Resolve the Participant’s DID.</w:t>
-      </w:r>
-    </w:p>
-    <w:p>
-      <w:pPr>
-        <w:pStyle w:val="FirstParagraph"/>
-      </w:pPr>
-      <w:r>
-        <w:t xml:space="preserve">The system first resolves the decentralised identifier (DID) associated with participant</w:t>
-      </w:r>
-      <w:r>
-        <w:t xml:space="preserve"> </w:t>
-      </w:r>
-      <w:r>
-        <w:rPr>
-          <w:i/>
-          <w:iCs/>
-        </w:rPr>
-        <w:t xml:space="preserve">u</w:t>
-      </w:r>
-      <w:r>
-        <w:t xml:space="preserve">. DID resolution retrieves the DID-related information required to establish the participant’s decentralised identity and identify the corresponding DID document. If the DID cannot be successfully resolved, the verification process terminates and returns</w:t>
-      </w:r>
-      <w:r>
-        <w:t xml:space="preserve"> </w:t>
-      </w:r>
-      <w:r>
-        <w:rPr>
-          <w:i/>
-          <w:iCs/>
-        </w:rPr>
-        <w:t xml:space="preserve">INVALID</w:t>
-      </w:r>
-      <w:r>
-        <w:t xml:space="preserve">.</w:t>
-      </w:r>
-    </w:p>
-    <w:p>
-      <w:pPr>
-        <w:pStyle w:val="Compact"/>
-        <w:numPr>
-          <w:ilvl w:val="0"/>
-          <w:numId w:val="1017"/>
-        </w:numPr>
-      </w:pPr>
-      <w:r>
-        <w:rPr>
-          <w:b/>
-          <w:bCs/>
-        </w:rPr>
-        <w:t xml:space="preserve">Step 2 – Verify the DID Document.</w:t>
-      </w:r>
-    </w:p>
-    <w:p>
-      <w:pPr>
-        <w:pStyle w:val="FirstParagraph"/>
-      </w:pPr>
-      <w:r>
-        <w:t xml:space="preserve">After successful resolution, the system verifies the DID document and its associated identity information. The verification process determines whether the document is structurally valid and whether the relevant cryptographic information, such as verification methods and public keys, can be trusted for subsequent credential verification. A failed DID verification results in an</w:t>
-      </w:r>
-      <w:r>
-        <w:t xml:space="preserve"> </w:t>
-      </w:r>
-      <w:r>
-        <w:rPr>
-          <w:i/>
-          <w:iCs/>
-        </w:rPr>
-        <w:t xml:space="preserve">INVALID</w:t>
-      </w:r>
-      <w:r>
-        <w:t xml:space="preserve"> </w:t>
-      </w:r>
-      <w:r>
-        <w:t xml:space="preserve">outcome.</w:t>
+        <w:t xml:space="preserve">The workflow, shown in Figure 8, begins when a participant attempts to participate in the consent process or requests access to healthcare data. The system resolves and verifies the participant’s DID and then retrieves the associated VC. The credential is checked for validity and its claims are examined to determine whether the participant possesses the authority required by the consent.</w:t>
       </w:r>
     </w:p>
     <w:p>
@@ -15426,20 +15244,20 @@
       <w:r>
         <w:drawing>
           <wp:inline>
-            <wp:extent cx="4133087" cy="7678519"/>
+            <wp:extent cx="3008376" cy="7679143"/>
             <wp:effectExtent b="0" l="0" r="0" t="0"/>
-            <wp:docPr descr="Figure 8: RO2 workflow for decentralised identity and authority verification" title="" id="95" name="Picture"/>
+            <wp:docPr descr="Figure 8: RO2 workflow for decentralised identity and authority verification" title="" id="94" name="Picture"/>
             <a:graphic>
               <a:graphicData uri="http://schemas.openxmlformats.org/drawingml/2006/picture">
                 <pic:pic>
                   <pic:nvPicPr>
-                    <pic:cNvPr descr="media_bw/fig08.png" id="96" name="Picture"/>
+                    <pic:cNvPr descr="media_col/fig08.png" id="95" name="Picture"/>
                     <pic:cNvPicPr>
                       <a:picLocks noChangeArrowheads="1" noChangeAspect="1"/>
                     </pic:cNvPicPr>
                   </pic:nvPicPr>
                   <pic:blipFill>
-                    <a:blip r:embed="rId94"/>
+                    <a:blip r:embed="rId93"/>
                     <a:stretch>
                       <a:fillRect/>
                     </a:stretch>
@@ -15447,7 +15265,7 @@
                   <pic:spPr bwMode="auto">
                     <a:xfrm>
                       <a:off x="0" y="0"/>
-                      <a:ext cx="4133087" cy="7678519"/>
+                      <a:ext cx="3008376" cy="7679143"/>
                     </a:xfrm>
                     <a:prstGeom prst="rect">
                       <a:avLst/>
@@ -15472,6 +15290,188 @@
       </w:pPr>
       <w:r>
         <w:t xml:space="preserve">Figure 8: RO2 workflow for decentralised identity and authority verification</w:t>
+      </w:r>
+    </w:p>
+    <w:p>
+      <w:pPr>
+        <w:pStyle w:val="BodyText"/>
+      </w:pPr>
+      <w:r>
+        <w:t xml:space="preserve">In the HALAH prototype, identity and authority are established in two separate steps. First, the guardian’s DID is checked for syntactic validity. Second, the guardian’s approval is expressed as an EIP-712 typed-data signature [39] over the consent identifier, and the approval is accepted only if the address recovered from the signature matches the address bound to that guardian DID; an approval that fails this check is rejected and does not count towards the threshold (Section 7.3). For demonstration, guardian keys are derived deterministically from the DID; in deployment, each guardian would sign the same typed data with their own wallet. Full W3C Verifiable Credential verification [41, 42], covering issuer, proof, credential status and validity period (Steps 3–4 below), is specified here but has not yet been implemented and is scheduled for Stage 2 (CA3). The prototype therefore already separates</w:t>
+      </w:r>
+      <w:r>
+        <w:t xml:space="preserve"> </w:t>
+      </w:r>
+      <w:r>
+        <w:rPr>
+          <w:i/>
+          <w:iCs/>
+        </w:rPr>
+        <w:t xml:space="preserve">who</w:t>
+      </w:r>
+      <w:r>
+        <w:t xml:space="preserve"> </w:t>
+      </w:r>
+      <w:r>
+        <w:t xml:space="preserve">the guardian is from</w:t>
+      </w:r>
+      <w:r>
+        <w:t xml:space="preserve"> </w:t>
+      </w:r>
+      <w:r>
+        <w:rPr>
+          <w:i/>
+          <w:iCs/>
+        </w:rPr>
+        <w:t xml:space="preserve">whether</w:t>
+      </w:r>
+      <w:r>
+        <w:t xml:space="preserve"> </w:t>
+      </w:r>
+      <w:r>
+        <w:t xml:space="preserve">their approval is cryptographically valid, but does not yet verify credential-based authority.</w:t>
+      </w:r>
+    </w:p>
+    <w:p>
+      <w:pPr>
+        <w:pStyle w:val="BodyText"/>
+      </w:pPr>
+      <w:r>
+        <w:t xml:space="preserve">The output of RO2 is not an access-grant decision. It is a verified identity and authority result that can be consumed by RO3 and RO4. This separation prevents a participant from obtaining access merely by presenting a valid identity credential.</w:t>
+      </w:r>
+    </w:p>
+    <w:bookmarkEnd w:id="96"/>
+    <w:bookmarkStart w:id="97" w:name="Xa8518206654d9551af54c2e3b82ee4012d4395c"/>
+    <w:p>
+      <w:pPr>
+        <w:pStyle w:val="Heading3"/>
+      </w:pPr>
+      <w:r>
+        <w:t xml:space="preserve">6.2.2 Procedure for DID and VC Identity and Authority Verification</w:t>
+      </w:r>
+    </w:p>
+    <w:p>
+      <w:pPr>
+        <w:pStyle w:val="FirstParagraph"/>
+      </w:pPr>
+      <w:r>
+        <w:t xml:space="preserve">The DID and VC Identity and Authority Verification procedure determines whether a participant possesses a valid decentralised identity and sufficient verifiable authority to participate in the consent-defined authorisation process. The procedure establishes a verifiable relationship between the participant</w:t>
+      </w:r>
+      <w:r>
+        <w:t xml:space="preserve"> </w:t>
+      </w:r>
+      <w:r>
+        <w:rPr>
+          <w:i/>
+          <w:iCs/>
+        </w:rPr>
+        <w:t xml:space="preserve">u</w:t>
+      </w:r>
+      <w:r>
+        <w:t xml:space="preserve">, the identity information represented by the DID, the attributes contained in the associated VC, and the authority requirements specified by the consent object</w:t>
+      </w:r>
+      <w:r>
+        <w:t xml:space="preserve"> </w:t>
+      </w:r>
+      <w:r>
+        <w:rPr>
+          <w:i/>
+          <w:iCs/>
+        </w:rPr>
+        <w:t xml:space="preserve">C</w:t>
+      </w:r>
+      <w:r>
+        <w:t xml:space="preserve">. The procedure consists of the following steps.</w:t>
+      </w:r>
+    </w:p>
+    <w:p>
+      <w:pPr>
+        <w:pStyle w:val="Compact"/>
+        <w:numPr>
+          <w:ilvl w:val="0"/>
+          <w:numId w:val="1016"/>
+        </w:numPr>
+      </w:pPr>
+      <w:r>
+        <w:rPr>
+          <w:b/>
+          <w:bCs/>
+        </w:rPr>
+        <w:t xml:space="preserve">Step 1 – Resolve the Participant’s DID.</w:t>
+      </w:r>
+    </w:p>
+    <w:p>
+      <w:pPr>
+        <w:pStyle w:val="FirstParagraph"/>
+      </w:pPr>
+      <w:r>
+        <w:t xml:space="preserve">The system first resolves the decentralised identifier (DID) associated with participant</w:t>
+      </w:r>
+      <w:r>
+        <w:t xml:space="preserve"> </w:t>
+      </w:r>
+      <w:r>
+        <w:rPr>
+          <w:i/>
+          <w:iCs/>
+        </w:rPr>
+        <w:t xml:space="preserve">u</w:t>
+      </w:r>
+      <w:r>
+        <w:t xml:space="preserve">. DID resolution retrieves the DID-related information required to establish the participant’s decentralised identity and identify the corresponding DID document. If the DID cannot be successfully resolved, the verification process terminates and returns</w:t>
+      </w:r>
+      <w:r>
+        <w:t xml:space="preserve"> </w:t>
+      </w:r>
+      <w:r>
+        <w:rPr>
+          <w:i/>
+          <w:iCs/>
+        </w:rPr>
+        <w:t xml:space="preserve">INVALID</w:t>
+      </w:r>
+      <w:r>
+        <w:t xml:space="preserve">.</w:t>
+      </w:r>
+    </w:p>
+    <w:p>
+      <w:pPr>
+        <w:pStyle w:val="Compact"/>
+        <w:numPr>
+          <w:ilvl w:val="0"/>
+          <w:numId w:val="1017"/>
+        </w:numPr>
+      </w:pPr>
+      <w:r>
+        <w:rPr>
+          <w:b/>
+          <w:bCs/>
+        </w:rPr>
+        <w:t xml:space="preserve">Step 2 – Verify the DID Document.</w:t>
+      </w:r>
+    </w:p>
+    <w:p>
+      <w:pPr>
+        <w:pStyle w:val="FirstParagraph"/>
+      </w:pPr>
+      <w:r>
+        <w:t xml:space="preserve">After successful resolution, the system verifies the DID document and its associated identity information. The verification process determines whether the document is structurally valid and whether the relevant cryptographic information, such as verification methods and public keys, can be trusted for subsequent credential verification. A failed DID verification results in an</w:t>
+      </w:r>
+      <w:r>
+        <w:t xml:space="preserve"> </w:t>
+      </w:r>
+      <w:r>
+        <w:rPr>
+          <w:i/>
+          <w:iCs/>
+        </w:rPr>
+        <w:t xml:space="preserve">INVALID</w:t>
+      </w:r>
+      <w:r>
+        <w:t xml:space="preserve"> </w:t>
+      </w:r>
+      <w:r>
+        <w:t xml:space="preserve">outcome.</w:t>
       </w:r>
     </w:p>
     <w:p>
@@ -17657,7 +17657,7 @@
         <w:t xml:space="preserve">The threshold mechanism establishes collective authorisation without requiring every possible participant to approve. For example, a consent may require two valid guardian approvals. In this case, one valid approval is insufficient, whereas two valid approvals satisfy the threshold.</w:t>
       </w:r>
     </w:p>
-    <w:bookmarkStart w:id="100" w:name="ro3-multi-party-authorisation-workflow"/>
+    <w:bookmarkStart w:id="103" w:name="ro3-multi-party-authorisation-workflow"/>
     <w:p>
       <w:pPr>
         <w:pStyle w:val="Heading3"/>
@@ -17671,126 +17671,7 @@
         <w:pStyle w:val="FirstParagraph"/>
       </w:pPr>
       <w:r>
-        <w:t xml:space="preserve">The workflow first identifies the participants required by the consent. Each participant must submit an approval that can be independently verified. Invalid approvals are rejected and must not contribute to the threshold count. Valid approvals are recorded and the current approval count is updated.</w:t>
-      </w:r>
-    </w:p>
-    <w:p>
-      <w:pPr>
-        <w:pStyle w:val="BodyText"/>
-      </w:pPr>
-      <w:r>
-        <w:t xml:space="preserve">In the HALAH prototype, the Guardian workflow (Figure 14, Section 7.3) verifies each guardian’s EIP-712 approval signature, refuses a second approval from the same guardian, adds the guardian DID to the consent’s signature set and displays the approval count against the threshold (e.g., 2/2). When the threshold is reached, a Soulbound Token (SBT) identifier is assigned, a MINT_SBT event is written to the audit log, and the consent is anchored on the Ethereum Sepolia testnet by minting a non-transferable consent token. Four such mints, made with the v2 consent contract, are recorded in Table 10; the v3 contract adds on-chain validity checks and ERC-5484 consensual burn [40].</w:t>
-      </w:r>
-    </w:p>
-    <w:p>
-      <w:pPr>
-        <w:pStyle w:val="BodyText"/>
-      </w:pPr>
-      <w:r>
-        <w:t xml:space="preserve">The SBT should be interpreted as an activation or representation mechanism for the consent state rather than as the fundamental source of trust. The trust decision is established by the verification of participants and the satisfaction of the authorisation threshold. The blockchain or token layer provides persistence, traceability, and evidence of the resulting state.</w:t>
-      </w:r>
-    </w:p>
-    <w:bookmarkEnd w:id="100"/>
-    <w:bookmarkStart w:id="104" w:name="X9dea25ed2e3c65720ba6349f36c23195c56aab5"/>
-    <w:p>
-      <w:pPr>
-        <w:pStyle w:val="Heading3"/>
-      </w:pPr>
-      <w:r>
-        <w:t xml:space="preserve">6.3.2 Procedure for Threshold-Based Multi-Party Authorisation</w:t>
-      </w:r>
-    </w:p>
-    <w:p>
-      <w:pPr>
-        <w:pStyle w:val="FirstParagraph"/>
-      </w:pPr>
-      <w:r>
-        <w:t xml:space="preserve">The Threshold-Based Multi-Party Authorisation procedure determines whether a consent-defined authorisation requirement has received sufficient valid approvals from the designated participants. Rather than relying on a single approval authority, the procedure requires a predefined number of eligible participants to independently provide valid approvals. This mechanism reduces reliance on a single decision-maker and provides an auditable basis for activating consent-related authorisation.</w:t>
-      </w:r>
-    </w:p>
-    <w:p>
-      <w:pPr>
-        <w:pStyle w:val="Compact"/>
-        <w:numPr>
-          <w:ilvl w:val="0"/>
-          <w:numId w:val="1025"/>
-        </w:numPr>
-      </w:pPr>
-      <w:r>
-        <w:rPr>
-          <w:b/>
-          <w:bCs/>
-        </w:rPr>
-        <w:t xml:space="preserve">Step 1 – Retrieve the Required Participant Set.</w:t>
-      </w:r>
-    </w:p>
-    <w:p>
-      <w:pPr>
-        <w:pStyle w:val="FirstParagraph"/>
-      </w:pPr>
-      <w:r>
-        <w:t xml:space="preserve">The system first retrieves the required participant set</w:t>
-      </w:r>
-      <w:r>
-        <w:t xml:space="preserve"> </w:t>
-      </w:r>
-      <w:r>
-        <w:rPr>
-          <w:i/>
-          <w:iCs/>
-        </w:rPr>
-        <w:t xml:space="preserve">G</w:t>
-      </w:r>
-      <w:r>
-        <w:t xml:space="preserve"> </w:t>
-      </w:r>
-      <w:r>
-        <w:t xml:space="preserve">associated with the consent object</w:t>
-      </w:r>
-      <w:r>
-        <w:t xml:space="preserve"> </w:t>
-      </w:r>
-      <w:r>
-        <w:rPr>
-          <w:i/>
-          <w:iCs/>
-        </w:rPr>
-        <w:t xml:space="preserve">C</w:t>
-      </w:r>
-      <w:r>
-        <w:t xml:space="preserve">. The set</w:t>
-      </w:r>
-      <w:r>
-        <w:t xml:space="preserve"> </w:t>
-      </w:r>
-      <w:r>
-        <w:rPr>
-          <w:i/>
-          <w:iCs/>
-        </w:rPr>
-        <w:t xml:space="preserve">G</w:t>
-      </w:r>
-      <w:r>
-        <w:t xml:space="preserve"> </w:t>
-      </w:r>
-      <w:r>
-        <w:t xml:space="preserve">defines which participants are eligible to contribute an approval to the authorisation process. Depending on the consent configuration,</w:t>
-      </w:r>
-      <w:r>
-        <w:t xml:space="preserve"> </w:t>
-      </w:r>
-      <w:r>
-        <w:rPr>
-          <w:i/>
-          <w:iCs/>
-        </w:rPr>
-        <w:t xml:space="preserve">G</w:t>
-      </w:r>
-      <w:r>
-        <w:t xml:space="preserve"> </w:t>
-      </w:r>
-      <w:r>
-        <w:t xml:space="preserve">may contain healthcare professionals, guardians, institutional representatives, or other authorised parties.</w:t>
+        <w:t xml:space="preserve">The workflow, shown in Figure 9, first identifies the participants required by the consent. Each participant must submit an approval that can be independently verified. Invalid approvals are rejected and must not contribute to the threshold count. Valid approvals are recorded and the current approval count is updated.</w:t>
       </w:r>
     </w:p>
     <w:p>
@@ -17800,20 +17681,20 @@
       <w:r>
         <w:drawing>
           <wp:inline>
-            <wp:extent cx="5753100" cy="7461079"/>
+            <wp:extent cx="3584448" cy="7671816"/>
             <wp:effectExtent b="0" l="0" r="0" t="0"/>
-            <wp:docPr descr="Figure 9: RO3 workflow for threshold-based multi-party authorisation" title="" id="102" name="Picture"/>
+            <wp:docPr descr="Figure 9: RO3 workflow for threshold-based multi-party authorisation" title="" id="101" name="Picture"/>
             <a:graphic>
               <a:graphicData uri="http://schemas.openxmlformats.org/drawingml/2006/picture">
                 <pic:pic>
                   <pic:nvPicPr>
-                    <pic:cNvPr descr="media_bw/fig09.png" id="103" name="Picture"/>
+                    <pic:cNvPr descr="media_col/fig09.png" id="102" name="Picture"/>
                     <pic:cNvPicPr>
                       <a:picLocks noChangeArrowheads="1" noChangeAspect="1"/>
                     </pic:cNvPicPr>
                   </pic:nvPicPr>
                   <pic:blipFill>
-                    <a:blip r:embed="rId101"/>
+                    <a:blip r:embed="rId100"/>
                     <a:stretch>
                       <a:fillRect/>
                     </a:stretch>
@@ -17821,7 +17702,7 @@
                   <pic:spPr bwMode="auto">
                     <a:xfrm>
                       <a:off x="0" y="0"/>
-                      <a:ext cx="5753100" cy="7461079"/>
+                      <a:ext cx="3584448" cy="7671816"/>
                     </a:xfrm>
                     <a:prstGeom prst="rect">
                       <a:avLst/>
@@ -17846,6 +17727,125 @@
       </w:pPr>
       <w:r>
         <w:t xml:space="preserve">Figure 9: RO3 workflow for threshold-based multi-party authorisation</w:t>
+      </w:r>
+    </w:p>
+    <w:p>
+      <w:pPr>
+        <w:pStyle w:val="BodyText"/>
+      </w:pPr>
+      <w:r>
+        <w:t xml:space="preserve">In the HALAH prototype, the Guardian workflow (Figure 14, Section 7.3) verifies each guardian’s EIP-712 approval signature, refuses a second approval from the same guardian, adds the guardian DID to the consent’s signature set and displays the approval count against the threshold (e.g., 2/2). When the threshold is reached, a Soulbound Token (SBT) identifier is assigned, a MINT_SBT event is written to the audit log, and the consent is anchored on the Ethereum Sepolia testnet by minting a non-transferable consent token. Four such mints, made with the v2 consent contract, are recorded in Table 10; the v3 contract adds on-chain validity checks and ERC-5484 consensual burn [40].</w:t>
+      </w:r>
+    </w:p>
+    <w:p>
+      <w:pPr>
+        <w:pStyle w:val="BodyText"/>
+      </w:pPr>
+      <w:r>
+        <w:t xml:space="preserve">The SBT should be interpreted as an activation or representation mechanism for the consent state rather than as the fundamental source of trust. The trust decision is established by the verification of participants and the satisfaction of the authorisation threshold. The blockchain or token layer provides persistence, traceability, and evidence of the resulting state.</w:t>
+      </w:r>
+    </w:p>
+    <w:bookmarkEnd w:id="103"/>
+    <w:bookmarkStart w:id="104" w:name="X9dea25ed2e3c65720ba6349f36c23195c56aab5"/>
+    <w:p>
+      <w:pPr>
+        <w:pStyle w:val="Heading3"/>
+      </w:pPr>
+      <w:r>
+        <w:t xml:space="preserve">6.3.2 Procedure for Threshold-Based Multi-Party Authorisation</w:t>
+      </w:r>
+    </w:p>
+    <w:p>
+      <w:pPr>
+        <w:pStyle w:val="FirstParagraph"/>
+      </w:pPr>
+      <w:r>
+        <w:t xml:space="preserve">The Threshold-Based Multi-Party Authorisation procedure determines whether a consent-defined authorisation requirement has received sufficient valid approvals from the designated participants. Rather than relying on a single approval authority, the procedure requires a predefined number of eligible participants to independently provide valid approvals. This mechanism reduces reliance on a single decision-maker and provides an auditable basis for activating consent-related authorisation.</w:t>
+      </w:r>
+    </w:p>
+    <w:p>
+      <w:pPr>
+        <w:pStyle w:val="Compact"/>
+        <w:numPr>
+          <w:ilvl w:val="0"/>
+          <w:numId w:val="1025"/>
+        </w:numPr>
+      </w:pPr>
+      <w:r>
+        <w:rPr>
+          <w:b/>
+          <w:bCs/>
+        </w:rPr>
+        <w:t xml:space="preserve">Step 1 – Retrieve the Required Participant Set.</w:t>
+      </w:r>
+    </w:p>
+    <w:p>
+      <w:pPr>
+        <w:pStyle w:val="FirstParagraph"/>
+      </w:pPr>
+      <w:r>
+        <w:t xml:space="preserve">The system first retrieves the required participant set</w:t>
+      </w:r>
+      <w:r>
+        <w:t xml:space="preserve"> </w:t>
+      </w:r>
+      <w:r>
+        <w:rPr>
+          <w:i/>
+          <w:iCs/>
+        </w:rPr>
+        <w:t xml:space="preserve">G</w:t>
+      </w:r>
+      <w:r>
+        <w:t xml:space="preserve"> </w:t>
+      </w:r>
+      <w:r>
+        <w:t xml:space="preserve">associated with the consent object</w:t>
+      </w:r>
+      <w:r>
+        <w:t xml:space="preserve"> </w:t>
+      </w:r>
+      <w:r>
+        <w:rPr>
+          <w:i/>
+          <w:iCs/>
+        </w:rPr>
+        <w:t xml:space="preserve">C</w:t>
+      </w:r>
+      <w:r>
+        <w:t xml:space="preserve">. The set</w:t>
+      </w:r>
+      <w:r>
+        <w:t xml:space="preserve"> </w:t>
+      </w:r>
+      <w:r>
+        <w:rPr>
+          <w:i/>
+          <w:iCs/>
+        </w:rPr>
+        <w:t xml:space="preserve">G</w:t>
+      </w:r>
+      <w:r>
+        <w:t xml:space="preserve"> </w:t>
+      </w:r>
+      <w:r>
+        <w:t xml:space="preserve">defines which participants are eligible to contribute an approval to the authorisation process. Depending on the consent configuration,</w:t>
+      </w:r>
+      <w:r>
+        <w:t xml:space="preserve"> </w:t>
+      </w:r>
+      <w:r>
+        <w:rPr>
+          <w:i/>
+          <w:iCs/>
+        </w:rPr>
+        <w:t xml:space="preserve">G</w:t>
+      </w:r>
+      <w:r>
+        <w:t xml:space="preserve"> </w:t>
+      </w:r>
+      <w:r>
+        <w:t xml:space="preserve">may contain healthcare professionals, guardians, institutional representatives, or other authorised parties.</w:t>
       </w:r>
     </w:p>
     <w:p>
@@ -21060,7 +21060,62 @@
         <w:pStyle w:val="FirstParagraph"/>
       </w:pPr>
       <w:r>
-        <w:t xml:space="preserve">The workflow begins when a doctor submits a request for patient data. The system retrieves the relevant consent object and verifies the requesting participant. It then checks whether the required multi-party authorisation has been established.</w:t>
+        <w:t xml:space="preserve">The workflow, shown in Figure 10, begins when a doctor submits a request for patient data. The system retrieves the relevant consent object and verifies the requesting participant. It then checks whether the required multi-party authorisation has been established.</w:t>
+      </w:r>
+    </w:p>
+    <w:p>
+      <w:pPr>
+        <w:pStyle w:val="CaptionedFigure"/>
+      </w:pPr>
+      <w:r>
+        <w:drawing>
+          <wp:inline>
+            <wp:extent cx="5486400" cy="6503056"/>
+            <wp:effectExtent b="0" l="0" r="0" t="0"/>
+            <wp:docPr descr="Figure 10: RO4 workflow for policy- and context-aware access control" title="" id="108" name="Picture"/>
+            <a:graphic>
+              <a:graphicData uri="http://schemas.openxmlformats.org/drawingml/2006/picture">
+                <pic:pic>
+                  <pic:nvPicPr>
+                    <pic:cNvPr descr="media_col/fig10.png" id="109" name="Picture"/>
+                    <pic:cNvPicPr>
+                      <a:picLocks noChangeArrowheads="1" noChangeAspect="1"/>
+                    </pic:cNvPicPr>
+                  </pic:nvPicPr>
+                  <pic:blipFill>
+                    <a:blip r:embed="rId107"/>
+                    <a:stretch>
+                      <a:fillRect/>
+                    </a:stretch>
+                  </pic:blipFill>
+                  <pic:spPr bwMode="auto">
+                    <a:xfrm>
+                      <a:off x="0" y="0"/>
+                      <a:ext cx="5486400" cy="6503056"/>
+                    </a:xfrm>
+                    <a:prstGeom prst="rect">
+                      <a:avLst/>
+                    </a:prstGeom>
+                    <a:noFill/>
+                    <a:ln w="9525">
+                      <a:noFill/>
+                      <a:headEnd/>
+                      <a:tailEnd/>
+                    </a:ln>
+                  </pic:spPr>
+                </pic:pic>
+              </a:graphicData>
+            </a:graphic>
+          </wp:inline>
+        </w:drawing>
+      </w:r>
+    </w:p>
+    <w:p>
+      <w:pPr>
+        <w:pStyle w:val="ImageCaption"/>
+      </w:pPr>
+      <w:r>
+        <w:t xml:space="preserve">Figure 10: RO4 workflow for policy- and context-aware access control</w:t>
       </w:r>
     </w:p>
     <w:p>
@@ -21412,61 +21467,6 @@
       </m:oMath>
       <w:r>
         <w:t xml:space="preserve">) is computed and displayed to the requester, whereas the data-release gate currently requires an ACTIVE consent state, a valid access proof and a valid scope. Routing the release decision through the full matrix is a small planned change that will make the implemented gate identical to Eq. (6).</w:t>
-      </w:r>
-    </w:p>
-    <w:p>
-      <w:pPr>
-        <w:pStyle w:val="CaptionedFigure"/>
-      </w:pPr>
-      <w:r>
-        <w:drawing>
-          <wp:inline>
-            <wp:extent cx="3072384" cy="7684849"/>
-            <wp:effectExtent b="0" l="0" r="0" t="0"/>
-            <wp:docPr descr="Figure 10: RO4 workflow for policy- and context-aware access control" title="" id="108" name="Picture"/>
-            <a:graphic>
-              <a:graphicData uri="http://schemas.openxmlformats.org/drawingml/2006/picture">
-                <pic:pic>
-                  <pic:nvPicPr>
-                    <pic:cNvPr descr="media_bw/fig10.png" id="109" name="Picture"/>
-                    <pic:cNvPicPr>
-                      <a:picLocks noChangeArrowheads="1" noChangeAspect="1"/>
-                    </pic:cNvPicPr>
-                  </pic:nvPicPr>
-                  <pic:blipFill>
-                    <a:blip r:embed="rId107"/>
-                    <a:stretch>
-                      <a:fillRect/>
-                    </a:stretch>
-                  </pic:blipFill>
-                  <pic:spPr bwMode="auto">
-                    <a:xfrm>
-                      <a:off x="0" y="0"/>
-                      <a:ext cx="3072384" cy="7684849"/>
-                    </a:xfrm>
-                    <a:prstGeom prst="rect">
-                      <a:avLst/>
-                    </a:prstGeom>
-                    <a:noFill/>
-                    <a:ln w="9525">
-                      <a:noFill/>
-                      <a:headEnd/>
-                      <a:tailEnd/>
-                    </a:ln>
-                  </pic:spPr>
-                </pic:pic>
-              </a:graphicData>
-            </a:graphic>
-          </wp:inline>
-        </w:drawing>
-      </w:r>
-    </w:p>
-    <w:p>
-      <w:pPr>
-        <w:pStyle w:val="ImageCaption"/>
-      </w:pPr>
-      <w:r>
-        <w:t xml:space="preserve">Figure 10: RO4 workflow for policy- and context-aware access control</w:t>
       </w:r>
     </w:p>
     <w:bookmarkEnd w:id="110"/>
@@ -24827,7 +24827,7 @@
         <w:t xml:space="preserve">The purpose of RO5 is not simply to add an expiry field. It is to ensure that the validity of a consent depends on both its temporal interval and its current lifecycle state. A consent that has expired or been revoked must not remain usable merely because its original approval threshold was satisfied.</w:t>
       </w:r>
     </w:p>
-    <w:bookmarkStart w:id="114" w:name="ro5-temporal-and-lifecycle-workflow"/>
+    <w:bookmarkStart w:id="117" w:name="ro5-temporal-and-lifecycle-workflow"/>
     <w:p>
       <w:pPr>
         <w:pStyle w:val="Heading3"/>
@@ -24841,7 +24841,62 @@
         <w:pStyle w:val="FirstParagraph"/>
       </w:pPr>
       <w:r>
-        <w:t xml:space="preserve">The planned workflow evaluates the consent’s temporal interval, lifecycle state, and revocation status before the system proceeds with the remaining authorisation conditions. This design ensures that a consent is not treated as permanently valid after it has expired or entered a state that no longer permits access.</w:t>
+        <w:t xml:space="preserve">The planned workflow, shown in Figure 11, evaluates the consent’s temporal interval, lifecycle state, and revocation status before the system proceeds with the remaining authorisation conditions. This design ensures that a consent is not treated as permanently valid after it has expired or entered a state that no longer permits access.</w:t>
+      </w:r>
+    </w:p>
+    <w:p>
+      <w:pPr>
+        <w:pStyle w:val="CaptionedFigure"/>
+      </w:pPr>
+      <w:r>
+        <w:drawing>
+          <wp:inline>
+            <wp:extent cx="2907792" cy="7687670"/>
+            <wp:effectExtent b="0" l="0" r="0" t="0"/>
+            <wp:docPr descr="Figure 11: RO5 planned workflow for temporal and consent lifecycle trust" title="" id="115" name="Picture"/>
+            <a:graphic>
+              <a:graphicData uri="http://schemas.openxmlformats.org/drawingml/2006/picture">
+                <pic:pic>
+                  <pic:nvPicPr>
+                    <pic:cNvPr descr="media_col/fig11.png" id="116" name="Picture"/>
+                    <pic:cNvPicPr>
+                      <a:picLocks noChangeArrowheads="1" noChangeAspect="1"/>
+                    </pic:cNvPicPr>
+                  </pic:nvPicPr>
+                  <pic:blipFill>
+                    <a:blip r:embed="rId114"/>
+                    <a:stretch>
+                      <a:fillRect/>
+                    </a:stretch>
+                  </pic:blipFill>
+                  <pic:spPr bwMode="auto">
+                    <a:xfrm>
+                      <a:off x="0" y="0"/>
+                      <a:ext cx="2907792" cy="7687670"/>
+                    </a:xfrm>
+                    <a:prstGeom prst="rect">
+                      <a:avLst/>
+                    </a:prstGeom>
+                    <a:noFill/>
+                    <a:ln w="9525">
+                      <a:noFill/>
+                      <a:headEnd/>
+                      <a:tailEnd/>
+                    </a:ln>
+                  </pic:spPr>
+                </pic:pic>
+              </a:graphicData>
+            </a:graphic>
+          </wp:inline>
+        </w:drawing>
+      </w:r>
+    </w:p>
+    <w:p>
+      <w:pPr>
+        <w:pStyle w:val="ImageCaption"/>
+      </w:pPr>
+      <w:r>
+        <w:t xml:space="preserve">Figure 11: RO5 planned workflow for temporal and consent lifecycle trust</w:t>
       </w:r>
     </w:p>
     <w:p>
@@ -25010,8 +25065,8 @@
         <w:t xml:space="preserve">is reserved for lifecycle validity as defined here.</w:t>
       </w:r>
     </w:p>
-    <w:bookmarkEnd w:id="114"/>
-    <w:bookmarkStart w:id="115" w:name="X76e1ecd5ca9116901ef2fba9faaf6fcb0ec1702"/>
+    <w:bookmarkEnd w:id="117"/>
+    <w:bookmarkStart w:id="118" w:name="X76e1ecd5ca9116901ef2fba9faaf6fcb0ec1702"/>
     <w:p>
       <w:pPr>
         <w:pStyle w:val="Heading3"/>
@@ -28023,7 +28078,7 @@
         <w:t xml:space="preserve">Rather than treating authorisation as a one-time event, this approach enables the system to determine whether authorisation remains valid at the precise time an operation is requested. This is particularly important for dynamic consent environments in which permissions may expire, be revoked, suspended, renewed, or otherwise modified during the lifecycle of a healthcare data-sharing relationship.</w:t>
       </w:r>
     </w:p>
-    <w:bookmarkEnd w:id="115"/>
+    <w:bookmarkEnd w:id="118"/>
     <w:bookmarkStart w:id="119" w:name="X43f085cbe35cf9229d124bd6c8707d40ef3f488"/>
     <w:p>
       <w:pPr>
@@ -28615,25 +28670,556 @@
     </w:p>
     <w:p>
       <w:pPr>
+        <w:pStyle w:val="BodyText"/>
+      </w:pPr>
+      <w:r>
+        <w:t xml:space="preserve">Algorithm 5 extends the current-stage decision process by ensuring that consent validity is dynamic rather than permanent. The algorithm is intended for the CA3 implementation and evaluation stage. It will be used to investigate expiration, revocation, and controlled state transitions as additional conditions of trustworthy access.</w:t>
+      </w:r>
+    </w:p>
+    <w:bookmarkEnd w:id="119"/>
+    <w:bookmarkEnd w:id="120"/>
+    <w:bookmarkStart w:id="127" w:name="X28e4c471c7af957781c5be37513d338d1f9028e"/>
+    <w:p>
+      <w:pPr>
+        <w:pStyle w:val="Heading2"/>
+      </w:pPr>
+      <w:r>
+        <w:t xml:space="preserve">6.6 Formal Security Assurance and Empirical Validation for RO6</w:t>
+      </w:r>
+    </w:p>
+    <w:p>
+      <w:pPr>
+        <w:pStyle w:val="FirstParagraph"/>
+      </w:pPr>
+      <w:r>
+        <w:t xml:space="preserve">RO6 addresses SRQ6 by formally analysing and empirically evaluating whether the proposed trust-oriented authorisation framework satisfies its defined security and authorisation properties.</w:t>
+      </w:r>
+    </w:p>
+    <w:p>
+      <w:pPr>
+        <w:pStyle w:val="BodyText"/>
+      </w:pPr>
+      <w:r>
+        <w:t xml:space="preserve">The objective combines two complementary forms of assurance. Formal security assurance specifies the conditions under which the authorisation mechanism should be considered secure and consistent. Empirical validation evaluates whether the implemented system behaves according to those conditions under representative healthcare data-sharing scenarios.</w:t>
+      </w:r>
+    </w:p>
+    <w:p>
+      <w:pPr>
+        <w:pStyle w:val="BodyText"/>
+      </w:pPr>
+      <w:r>
+        <w:t xml:space="preserve">The formal decision model is given by Eq. (24).</w:t>
+      </w:r>
+    </w:p>
+    <w:p>
+      <w:pPr>
+        <w:pStyle w:val="BodyText"/>
+      </w:pPr>
+      <w:r>
+        <w:t xml:space="preserve"> </w:t>
+      </w:r>
+    </w:p>
+    <w:p>
+      <w:pPr>
+        <w:pStyle w:val="BodyText"/>
+      </w:pPr>
+      <w:r>
+        <w:t xml:space="preserve">For the current stage, the primary validation conditions are</w:t>
+      </w:r>
+    </w:p>
+    <w:p>
+      <w:pPr>
+        <w:pStyle w:val="BodyText"/>
+      </w:pPr>
+      <m:oMathPara>
+        <m:oMathParaPr>
+          <m:jc m:val="center"/>
+        </m:oMathParaPr>
+        <m:oMath>
+          <m:r>
+            <m:t>D</m:t>
+          </m:r>
+          <m:r>
+            <m:t>e</m:t>
+          </m:r>
+          <m:r>
+            <m:t>c</m:t>
+          </m:r>
+          <m:r>
+            <m:t>i</m:t>
+          </m:r>
+          <m:r>
+            <m:t>s</m:t>
+          </m:r>
+          <m:r>
+            <m:t>i</m:t>
+          </m:r>
+          <m:r>
+            <m:t>o</m:t>
+          </m:r>
+          <m:r>
+            <m:t>n</m:t>
+          </m:r>
+          <m:r>
+            <m:rPr>
+              <m:sty m:val="p"/>
+            </m:rPr>
+            <m:t>(</m:t>
+          </m:r>
+          <m:r>
+            <m:t>C</m:t>
+          </m:r>
+          <m:r>
+            <m:rPr>
+              <m:sty m:val="p"/>
+            </m:rPr>
+            <m:t>,</m:t>
+          </m:r>
+          <m:r>
+            <m:t>R</m:t>
+          </m:r>
+          <m:r>
+            <m:rPr>
+              <m:sty m:val="p"/>
+            </m:rPr>
+            <m:t>)</m:t>
+          </m:r>
+          <m:r>
+            <m:rPr>
+              <m:sty m:val="p"/>
+            </m:rPr>
+            <m:t>=</m:t>
+          </m:r>
+          <m:r>
+            <m:t>A</m:t>
+          </m:r>
+          <m:r>
+            <m:t>L</m:t>
+          </m:r>
+          <m:r>
+            <m:t>L</m:t>
+          </m:r>
+          <m:r>
+            <m:t>O</m:t>
+          </m:r>
+          <m:r>
+            <m:t>W</m:t>
+          </m:r>
+          <m:r>
+            <m:rPr>
+              <m:sty m:val="p"/>
+            </m:rPr>
+            <m:t>⇒</m:t>
+          </m:r>
+          <m:sSub>
+            <m:e>
+              <m:r>
+                <m:t>V</m:t>
+              </m:r>
+            </m:e>
+            <m:sub>
+              <m:r>
+                <m:t>I</m:t>
+              </m:r>
+            </m:sub>
+          </m:sSub>
+          <m:r>
+            <m:rPr>
+              <m:sty m:val="p"/>
+            </m:rPr>
+            <m:t>(</m:t>
+          </m:r>
+          <m:r>
+            <m:t>u</m:t>
+          </m:r>
+          <m:r>
+            <m:rPr>
+              <m:sty m:val="p"/>
+            </m:rPr>
+            <m:t>)</m:t>
+          </m:r>
+          <m:r>
+            <m:rPr>
+              <m:sty m:val="p"/>
+            </m:rPr>
+            <m:t>∧</m:t>
+          </m:r>
+          <m:sSub>
+            <m:e>
+              <m:r>
+                <m:t>V</m:t>
+              </m:r>
+            </m:e>
+            <m:sub>
+              <m:r>
+                <m:t>A</m:t>
+              </m:r>
+            </m:sub>
+          </m:sSub>
+          <m:r>
+            <m:rPr>
+              <m:sty m:val="p"/>
+            </m:rPr>
+            <m:t>(</m:t>
+          </m:r>
+          <m:r>
+            <m:t>C</m:t>
+          </m:r>
+          <m:r>
+            <m:rPr>
+              <m:sty m:val="p"/>
+            </m:rPr>
+            <m:t>)</m:t>
+          </m:r>
+          <m:r>
+            <m:rPr>
+              <m:sty m:val="p"/>
+            </m:rPr>
+            <m:t>∧</m:t>
+          </m:r>
+          <m:sSub>
+            <m:e>
+              <m:r>
+                <m:t>V</m:t>
+              </m:r>
+            </m:e>
+            <m:sub>
+              <m:r>
+                <m:t>P</m:t>
+              </m:r>
+            </m:sub>
+          </m:sSub>
+          <m:r>
+            <m:rPr>
+              <m:sty m:val="p"/>
+            </m:rPr>
+            <m:t>(</m:t>
+          </m:r>
+          <m:r>
+            <m:t>C</m:t>
+          </m:r>
+          <m:r>
+            <m:rPr>
+              <m:sty m:val="p"/>
+            </m:rPr>
+            <m:t>,</m:t>
+          </m:r>
+          <m:r>
+            <m:t>R</m:t>
+          </m:r>
+          <m:r>
+            <m:rPr>
+              <m:sty m:val="p"/>
+            </m:rPr>
+            <m:t>)</m:t>
+          </m:r>
+          <m:r>
+            <m:rPr>
+              <m:sty m:val="p"/>
+            </m:rPr>
+            <m:t>.</m:t>
+          </m:r>
+          <m:r>
+            <m:t>  </m:t>
+          </m:r>
+          <m:r>
+            <m:t>  </m:t>
+          </m:r>
+          <m:r>
+            <m:rPr>
+              <m:sty m:val="p"/>
+            </m:rPr>
+            <m:t>(</m:t>
+          </m:r>
+          <m:r>
+            <m:t>33</m:t>
+          </m:r>
+          <m:r>
+            <m:rPr>
+              <m:sty m:val="p"/>
+            </m:rPr>
+            <m:t>)</m:t>
+          </m:r>
+        </m:oMath>
+      </m:oMathPara>
+    </w:p>
+    <w:p>
+      <w:pPr>
+        <w:pStyle w:val="FirstParagraph"/>
+      </w:pPr>
+      <w:r>
+        <w:t xml:space="preserve">This implication expresses the soundness requirement that every granted request must satisfy the identity, authorisation, and policy conditions. Conversely, if any mandatory condition is violated, the request must be denied:</w:t>
+      </w:r>
+    </w:p>
+    <w:p>
+      <w:pPr>
+        <w:pStyle w:val="BodyText"/>
+      </w:pPr>
+      <m:oMathPara>
+        <m:oMathParaPr>
+          <m:jc m:val="center"/>
+        </m:oMathParaPr>
+        <m:oMath>
+          <m:r>
+            <m:rPr>
+              <m:sty m:val="p"/>
+            </m:rPr>
+            <m:t>¬</m:t>
+          </m:r>
+          <m:sSub>
+            <m:e>
+              <m:r>
+                <m:t>V</m:t>
+              </m:r>
+            </m:e>
+            <m:sub>
+              <m:r>
+                <m:t>I</m:t>
+              </m:r>
+            </m:sub>
+          </m:sSub>
+          <m:r>
+            <m:rPr>
+              <m:sty m:val="p"/>
+            </m:rPr>
+            <m:t>(</m:t>
+          </m:r>
+          <m:r>
+            <m:t>u</m:t>
+          </m:r>
+          <m:r>
+            <m:rPr>
+              <m:sty m:val="p"/>
+            </m:rPr>
+            <m:t>)</m:t>
+          </m:r>
+          <m:r>
+            <m:rPr>
+              <m:sty m:val="p"/>
+            </m:rPr>
+            <m:t>∨</m:t>
+          </m:r>
+          <m:r>
+            <m:rPr>
+              <m:sty m:val="p"/>
+            </m:rPr>
+            <m:t>¬</m:t>
+          </m:r>
+          <m:sSub>
+            <m:e>
+              <m:r>
+                <m:t>V</m:t>
+              </m:r>
+            </m:e>
+            <m:sub>
+              <m:r>
+                <m:t>A</m:t>
+              </m:r>
+            </m:sub>
+          </m:sSub>
+          <m:r>
+            <m:rPr>
+              <m:sty m:val="p"/>
+            </m:rPr>
+            <m:t>(</m:t>
+          </m:r>
+          <m:r>
+            <m:t>C</m:t>
+          </m:r>
+          <m:r>
+            <m:rPr>
+              <m:sty m:val="p"/>
+            </m:rPr>
+            <m:t>)</m:t>
+          </m:r>
+          <m:r>
+            <m:rPr>
+              <m:sty m:val="p"/>
+            </m:rPr>
+            <m:t>∨</m:t>
+          </m:r>
+          <m:r>
+            <m:rPr>
+              <m:sty m:val="p"/>
+            </m:rPr>
+            <m:t>¬</m:t>
+          </m:r>
+          <m:sSub>
+            <m:e>
+              <m:r>
+                <m:t>V</m:t>
+              </m:r>
+            </m:e>
+            <m:sub>
+              <m:r>
+                <m:t>P</m:t>
+              </m:r>
+            </m:sub>
+          </m:sSub>
+          <m:r>
+            <m:rPr>
+              <m:sty m:val="p"/>
+            </m:rPr>
+            <m:t>(</m:t>
+          </m:r>
+          <m:r>
+            <m:t>C</m:t>
+          </m:r>
+          <m:r>
+            <m:rPr>
+              <m:sty m:val="p"/>
+            </m:rPr>
+            <m:t>,</m:t>
+          </m:r>
+          <m:r>
+            <m:t>R</m:t>
+          </m:r>
+          <m:r>
+            <m:rPr>
+              <m:sty m:val="p"/>
+            </m:rPr>
+            <m:t>)</m:t>
+          </m:r>
+          <m:r>
+            <m:rPr>
+              <m:sty m:val="p"/>
+            </m:rPr>
+            <m:t>⇒</m:t>
+          </m:r>
+          <m:r>
+            <m:t>D</m:t>
+          </m:r>
+          <m:r>
+            <m:t>e</m:t>
+          </m:r>
+          <m:r>
+            <m:t>c</m:t>
+          </m:r>
+          <m:r>
+            <m:t>i</m:t>
+          </m:r>
+          <m:r>
+            <m:t>s</m:t>
+          </m:r>
+          <m:r>
+            <m:t>i</m:t>
+          </m:r>
+          <m:r>
+            <m:t>o</m:t>
+          </m:r>
+          <m:r>
+            <m:t>n</m:t>
+          </m:r>
+          <m:r>
+            <m:rPr>
+              <m:sty m:val="p"/>
+            </m:rPr>
+            <m:t>(</m:t>
+          </m:r>
+          <m:r>
+            <m:t>C</m:t>
+          </m:r>
+          <m:r>
+            <m:rPr>
+              <m:sty m:val="p"/>
+            </m:rPr>
+            <m:t>,</m:t>
+          </m:r>
+          <m:r>
+            <m:t>R</m:t>
+          </m:r>
+          <m:r>
+            <m:rPr>
+              <m:sty m:val="p"/>
+            </m:rPr>
+            <m:t>)</m:t>
+          </m:r>
+          <m:r>
+            <m:rPr>
+              <m:sty m:val="p"/>
+            </m:rPr>
+            <m:t>=</m:t>
+          </m:r>
+          <m:r>
+            <m:t>D</m:t>
+          </m:r>
+          <m:r>
+            <m:t>E</m:t>
+          </m:r>
+          <m:r>
+            <m:t>N</m:t>
+          </m:r>
+          <m:r>
+            <m:t>Y</m:t>
+          </m:r>
+          <m:r>
+            <m:rPr>
+              <m:sty m:val="p"/>
+            </m:rPr>
+            <m:t>.</m:t>
+          </m:r>
+          <m:r>
+            <m:t>  </m:t>
+          </m:r>
+          <m:r>
+            <m:t>  </m:t>
+          </m:r>
+          <m:r>
+            <m:rPr>
+              <m:sty m:val="p"/>
+            </m:rPr>
+            <m:t>(</m:t>
+          </m:r>
+          <m:r>
+            <m:t>34</m:t>
+          </m:r>
+          <m:r>
+            <m:rPr>
+              <m:sty m:val="p"/>
+            </m:rPr>
+            <m:t>)</m:t>
+          </m:r>
+        </m:oMath>
+      </m:oMathPara>
+    </w:p>
+    <w:bookmarkStart w:id="124" w:name="ro6-assurance-and-validation-workflow"/>
+    <w:p>
+      <w:pPr>
+        <w:pStyle w:val="Heading3"/>
+      </w:pPr>
+      <w:r>
+        <w:t xml:space="preserve">6.6.1 RO6 Assurance and Validation Workflow</w:t>
+      </w:r>
+    </w:p>
+    <w:p>
+      <w:pPr>
+        <w:pStyle w:val="FirstParagraph"/>
+      </w:pPr>
+      <w:r>
+        <w:t xml:space="preserve">The validation process, shown in Figure 12, begins by defining the security and authorisation properties that the framework is expected to satisfy. These properties include identity validity, threshold correctness, policy compliance, denial of unauthorised requests, and consistency between the authorisation decision and the audit evidence.</w:t>
+      </w:r>
+    </w:p>
+    <w:p>
+      <w:pPr>
         <w:pStyle w:val="CaptionedFigure"/>
       </w:pPr>
       <w:r>
         <w:drawing>
           <wp:inline>
-            <wp:extent cx="3593592" cy="7679000"/>
+            <wp:extent cx="4572000" cy="7676734"/>
             <wp:effectExtent b="0" l="0" r="0" t="0"/>
-            <wp:docPr descr="Figure 11: RO5 planned workflow for temporal and consent lifecycle trust" title="" id="117" name="Picture"/>
+            <wp:docPr descr="Figure 12: RO6 planned workflow for formal security assurance and empirical validation" title="" id="122" name="Picture"/>
             <a:graphic>
               <a:graphicData uri="http://schemas.openxmlformats.org/drawingml/2006/picture">
                 <pic:pic>
                   <pic:nvPicPr>
-                    <pic:cNvPr descr="media_bw/fig11.png" id="118" name="Picture"/>
+                    <pic:cNvPr descr="media_col/fig12.png" id="123" name="Picture"/>
                     <pic:cNvPicPr>
                       <a:picLocks noChangeArrowheads="1" noChangeAspect="1"/>
                     </pic:cNvPicPr>
                   </pic:nvPicPr>
                   <pic:blipFill>
-                    <a:blip r:embed="rId116"/>
+                    <a:blip r:embed="rId121"/>
                     <a:stretch>
                       <a:fillRect/>
                     </a:stretch>
@@ -28641,7 +29227,7 @@
                   <pic:spPr bwMode="auto">
                     <a:xfrm>
                       <a:off x="0" y="0"/>
-                      <a:ext cx="3593592" cy="7679000"/>
+                      <a:ext cx="4572000" cy="7676734"/>
                     </a:xfrm>
                     <a:prstGeom prst="rect">
                       <a:avLst/>
@@ -28665,538 +29251,7 @@
         <w:pStyle w:val="ImageCaption"/>
       </w:pPr>
       <w:r>
-        <w:t xml:space="preserve">Figure 11: RO5 planned workflow for temporal and consent lifecycle trust</w:t>
-      </w:r>
-    </w:p>
-    <w:p>
-      <w:pPr>
-        <w:pStyle w:val="BodyText"/>
-      </w:pPr>
-      <w:r>
-        <w:t xml:space="preserve">Algorithm 5 extends the current-stage decision process by ensuring that consent validity is dynamic rather than permanent. The algorithm is intended for the CA3 implementation and evaluation stage. It will be used to investigate expiration, revocation, and controlled state transitions as additional conditions of trustworthy access.</w:t>
-      </w:r>
-    </w:p>
-    <w:bookmarkEnd w:id="119"/>
-    <w:bookmarkEnd w:id="120"/>
-    <w:bookmarkStart w:id="127" w:name="X28e4c471c7af957781c5be37513d338d1f9028e"/>
-    <w:p>
-      <w:pPr>
-        <w:pStyle w:val="Heading2"/>
-      </w:pPr>
-      <w:r>
-        <w:t xml:space="preserve">6.6 Formal Security Assurance and Empirical Validation for RO6</w:t>
-      </w:r>
-    </w:p>
-    <w:p>
-      <w:pPr>
-        <w:pStyle w:val="FirstParagraph"/>
-      </w:pPr>
-      <w:r>
-        <w:t xml:space="preserve">RO6 addresses SRQ6 by formally analysing and empirically evaluating whether the proposed trust-oriented authorisation framework satisfies its defined security and authorisation properties.</w:t>
-      </w:r>
-    </w:p>
-    <w:p>
-      <w:pPr>
-        <w:pStyle w:val="BodyText"/>
-      </w:pPr>
-      <w:r>
-        <w:t xml:space="preserve">The objective combines two complementary forms of assurance. Formal security assurance specifies the conditions under which the authorisation mechanism should be considered secure and consistent. Empirical validation evaluates whether the implemented system behaves according to those conditions under representative healthcare data-sharing scenarios.</w:t>
-      </w:r>
-    </w:p>
-    <w:p>
-      <w:pPr>
-        <w:pStyle w:val="BodyText"/>
-      </w:pPr>
-      <w:r>
-        <w:t xml:space="preserve">The formal decision model is given by Eq. (24).</w:t>
-      </w:r>
-    </w:p>
-    <w:p>
-      <w:pPr>
-        <w:pStyle w:val="BodyText"/>
-      </w:pPr>
-      <w:r>
-        <w:t xml:space="preserve"> </w:t>
-      </w:r>
-    </w:p>
-    <w:p>
-      <w:pPr>
-        <w:pStyle w:val="BodyText"/>
-      </w:pPr>
-      <w:r>
-        <w:t xml:space="preserve">For the current stage, the primary validation conditions are</w:t>
-      </w:r>
-    </w:p>
-    <w:p>
-      <w:pPr>
-        <w:pStyle w:val="BodyText"/>
-      </w:pPr>
-      <m:oMathPara>
-        <m:oMathParaPr>
-          <m:jc m:val="center"/>
-        </m:oMathParaPr>
-        <m:oMath>
-          <m:r>
-            <m:t>D</m:t>
-          </m:r>
-          <m:r>
-            <m:t>e</m:t>
-          </m:r>
-          <m:r>
-            <m:t>c</m:t>
-          </m:r>
-          <m:r>
-            <m:t>i</m:t>
-          </m:r>
-          <m:r>
-            <m:t>s</m:t>
-          </m:r>
-          <m:r>
-            <m:t>i</m:t>
-          </m:r>
-          <m:r>
-            <m:t>o</m:t>
-          </m:r>
-          <m:r>
-            <m:t>n</m:t>
-          </m:r>
-          <m:r>
-            <m:rPr>
-              <m:sty m:val="p"/>
-            </m:rPr>
-            <m:t>(</m:t>
-          </m:r>
-          <m:r>
-            <m:t>C</m:t>
-          </m:r>
-          <m:r>
-            <m:rPr>
-              <m:sty m:val="p"/>
-            </m:rPr>
-            <m:t>,</m:t>
-          </m:r>
-          <m:r>
-            <m:t>R</m:t>
-          </m:r>
-          <m:r>
-            <m:rPr>
-              <m:sty m:val="p"/>
-            </m:rPr>
-            <m:t>)</m:t>
-          </m:r>
-          <m:r>
-            <m:rPr>
-              <m:sty m:val="p"/>
-            </m:rPr>
-            <m:t>=</m:t>
-          </m:r>
-          <m:r>
-            <m:t>A</m:t>
-          </m:r>
-          <m:r>
-            <m:t>L</m:t>
-          </m:r>
-          <m:r>
-            <m:t>L</m:t>
-          </m:r>
-          <m:r>
-            <m:t>O</m:t>
-          </m:r>
-          <m:r>
-            <m:t>W</m:t>
-          </m:r>
-          <m:r>
-            <m:rPr>
-              <m:sty m:val="p"/>
-            </m:rPr>
-            <m:t>⇒</m:t>
-          </m:r>
-          <m:sSub>
-            <m:e>
-              <m:r>
-                <m:t>V</m:t>
-              </m:r>
-            </m:e>
-            <m:sub>
-              <m:r>
-                <m:t>I</m:t>
-              </m:r>
-            </m:sub>
-          </m:sSub>
-          <m:r>
-            <m:rPr>
-              <m:sty m:val="p"/>
-            </m:rPr>
-            <m:t>(</m:t>
-          </m:r>
-          <m:r>
-            <m:t>u</m:t>
-          </m:r>
-          <m:r>
-            <m:rPr>
-              <m:sty m:val="p"/>
-            </m:rPr>
-            <m:t>)</m:t>
-          </m:r>
-          <m:r>
-            <m:rPr>
-              <m:sty m:val="p"/>
-            </m:rPr>
-            <m:t>∧</m:t>
-          </m:r>
-          <m:sSub>
-            <m:e>
-              <m:r>
-                <m:t>V</m:t>
-              </m:r>
-            </m:e>
-            <m:sub>
-              <m:r>
-                <m:t>A</m:t>
-              </m:r>
-            </m:sub>
-          </m:sSub>
-          <m:r>
-            <m:rPr>
-              <m:sty m:val="p"/>
-            </m:rPr>
-            <m:t>(</m:t>
-          </m:r>
-          <m:r>
-            <m:t>C</m:t>
-          </m:r>
-          <m:r>
-            <m:rPr>
-              <m:sty m:val="p"/>
-            </m:rPr>
-            <m:t>)</m:t>
-          </m:r>
-          <m:r>
-            <m:rPr>
-              <m:sty m:val="p"/>
-            </m:rPr>
-            <m:t>∧</m:t>
-          </m:r>
-          <m:sSub>
-            <m:e>
-              <m:r>
-                <m:t>V</m:t>
-              </m:r>
-            </m:e>
-            <m:sub>
-              <m:r>
-                <m:t>P</m:t>
-              </m:r>
-            </m:sub>
-          </m:sSub>
-          <m:r>
-            <m:rPr>
-              <m:sty m:val="p"/>
-            </m:rPr>
-            <m:t>(</m:t>
-          </m:r>
-          <m:r>
-            <m:t>C</m:t>
-          </m:r>
-          <m:r>
-            <m:rPr>
-              <m:sty m:val="p"/>
-            </m:rPr>
-            <m:t>,</m:t>
-          </m:r>
-          <m:r>
-            <m:t>R</m:t>
-          </m:r>
-          <m:r>
-            <m:rPr>
-              <m:sty m:val="p"/>
-            </m:rPr>
-            <m:t>)</m:t>
-          </m:r>
-          <m:r>
-            <m:rPr>
-              <m:sty m:val="p"/>
-            </m:rPr>
-            <m:t>.</m:t>
-          </m:r>
-          <m:r>
-            <m:t>  </m:t>
-          </m:r>
-          <m:r>
-            <m:t>  </m:t>
-          </m:r>
-          <m:r>
-            <m:rPr>
-              <m:sty m:val="p"/>
-            </m:rPr>
-            <m:t>(</m:t>
-          </m:r>
-          <m:r>
-            <m:t>33</m:t>
-          </m:r>
-          <m:r>
-            <m:rPr>
-              <m:sty m:val="p"/>
-            </m:rPr>
-            <m:t>)</m:t>
-          </m:r>
-        </m:oMath>
-      </m:oMathPara>
-    </w:p>
-    <w:p>
-      <w:pPr>
-        <w:pStyle w:val="FirstParagraph"/>
-      </w:pPr>
-      <w:r>
-        <w:t xml:space="preserve">This implication expresses the soundness requirement that every granted request must satisfy the identity, authorisation, and policy conditions. Conversely, if any mandatory condition is violated, the request must be denied:</w:t>
-      </w:r>
-    </w:p>
-    <w:p>
-      <w:pPr>
-        <w:pStyle w:val="BodyText"/>
-      </w:pPr>
-      <m:oMathPara>
-        <m:oMathParaPr>
-          <m:jc m:val="center"/>
-        </m:oMathParaPr>
-        <m:oMath>
-          <m:r>
-            <m:rPr>
-              <m:sty m:val="p"/>
-            </m:rPr>
-            <m:t>¬</m:t>
-          </m:r>
-          <m:sSub>
-            <m:e>
-              <m:r>
-                <m:t>V</m:t>
-              </m:r>
-            </m:e>
-            <m:sub>
-              <m:r>
-                <m:t>I</m:t>
-              </m:r>
-            </m:sub>
-          </m:sSub>
-          <m:r>
-            <m:rPr>
-              <m:sty m:val="p"/>
-            </m:rPr>
-            <m:t>(</m:t>
-          </m:r>
-          <m:r>
-            <m:t>u</m:t>
-          </m:r>
-          <m:r>
-            <m:rPr>
-              <m:sty m:val="p"/>
-            </m:rPr>
-            <m:t>)</m:t>
-          </m:r>
-          <m:r>
-            <m:rPr>
-              <m:sty m:val="p"/>
-            </m:rPr>
-            <m:t>∨</m:t>
-          </m:r>
-          <m:r>
-            <m:rPr>
-              <m:sty m:val="p"/>
-            </m:rPr>
-            <m:t>¬</m:t>
-          </m:r>
-          <m:sSub>
-            <m:e>
-              <m:r>
-                <m:t>V</m:t>
-              </m:r>
-            </m:e>
-            <m:sub>
-              <m:r>
-                <m:t>A</m:t>
-              </m:r>
-            </m:sub>
-          </m:sSub>
-          <m:r>
-            <m:rPr>
-              <m:sty m:val="p"/>
-            </m:rPr>
-            <m:t>(</m:t>
-          </m:r>
-          <m:r>
-            <m:t>C</m:t>
-          </m:r>
-          <m:r>
-            <m:rPr>
-              <m:sty m:val="p"/>
-            </m:rPr>
-            <m:t>)</m:t>
-          </m:r>
-          <m:r>
-            <m:rPr>
-              <m:sty m:val="p"/>
-            </m:rPr>
-            <m:t>∨</m:t>
-          </m:r>
-          <m:r>
-            <m:rPr>
-              <m:sty m:val="p"/>
-            </m:rPr>
-            <m:t>¬</m:t>
-          </m:r>
-          <m:sSub>
-            <m:e>
-              <m:r>
-                <m:t>V</m:t>
-              </m:r>
-            </m:e>
-            <m:sub>
-              <m:r>
-                <m:t>P</m:t>
-              </m:r>
-            </m:sub>
-          </m:sSub>
-          <m:r>
-            <m:rPr>
-              <m:sty m:val="p"/>
-            </m:rPr>
-            <m:t>(</m:t>
-          </m:r>
-          <m:r>
-            <m:t>C</m:t>
-          </m:r>
-          <m:r>
-            <m:rPr>
-              <m:sty m:val="p"/>
-            </m:rPr>
-            <m:t>,</m:t>
-          </m:r>
-          <m:r>
-            <m:t>R</m:t>
-          </m:r>
-          <m:r>
-            <m:rPr>
-              <m:sty m:val="p"/>
-            </m:rPr>
-            <m:t>)</m:t>
-          </m:r>
-          <m:r>
-            <m:rPr>
-              <m:sty m:val="p"/>
-            </m:rPr>
-            <m:t>⇒</m:t>
-          </m:r>
-          <m:r>
-            <m:t>D</m:t>
-          </m:r>
-          <m:r>
-            <m:t>e</m:t>
-          </m:r>
-          <m:r>
-            <m:t>c</m:t>
-          </m:r>
-          <m:r>
-            <m:t>i</m:t>
-          </m:r>
-          <m:r>
-            <m:t>s</m:t>
-          </m:r>
-          <m:r>
-            <m:t>i</m:t>
-          </m:r>
-          <m:r>
-            <m:t>o</m:t>
-          </m:r>
-          <m:r>
-            <m:t>n</m:t>
-          </m:r>
-          <m:r>
-            <m:rPr>
-              <m:sty m:val="p"/>
-            </m:rPr>
-            <m:t>(</m:t>
-          </m:r>
-          <m:r>
-            <m:t>C</m:t>
-          </m:r>
-          <m:r>
-            <m:rPr>
-              <m:sty m:val="p"/>
-            </m:rPr>
-            <m:t>,</m:t>
-          </m:r>
-          <m:r>
-            <m:t>R</m:t>
-          </m:r>
-          <m:r>
-            <m:rPr>
-              <m:sty m:val="p"/>
-            </m:rPr>
-            <m:t>)</m:t>
-          </m:r>
-          <m:r>
-            <m:rPr>
-              <m:sty m:val="p"/>
-            </m:rPr>
-            <m:t>=</m:t>
-          </m:r>
-          <m:r>
-            <m:t>D</m:t>
-          </m:r>
-          <m:r>
-            <m:t>E</m:t>
-          </m:r>
-          <m:r>
-            <m:t>N</m:t>
-          </m:r>
-          <m:r>
-            <m:t>Y</m:t>
-          </m:r>
-          <m:r>
-            <m:rPr>
-              <m:sty m:val="p"/>
-            </m:rPr>
-            <m:t>.</m:t>
-          </m:r>
-          <m:r>
-            <m:t>  </m:t>
-          </m:r>
-          <m:r>
-            <m:t>  </m:t>
-          </m:r>
-          <m:r>
-            <m:rPr>
-              <m:sty m:val="p"/>
-            </m:rPr>
-            <m:t>(</m:t>
-          </m:r>
-          <m:r>
-            <m:t>34</m:t>
-          </m:r>
-          <m:r>
-            <m:rPr>
-              <m:sty m:val="p"/>
-            </m:rPr>
-            <m:t>)</m:t>
-          </m:r>
-        </m:oMath>
-      </m:oMathPara>
-    </w:p>
-    <w:bookmarkStart w:id="121" w:name="ro6-assurance-and-validation-workflow"/>
-    <w:p>
-      <w:pPr>
-        <w:pStyle w:val="Heading3"/>
-      </w:pPr>
-      <w:r>
-        <w:t xml:space="preserve">6.6.1 RO6 Assurance and Validation Workflow</w:t>
-      </w:r>
-    </w:p>
-    <w:p>
-      <w:pPr>
-        <w:pStyle w:val="FirstParagraph"/>
-      </w:pPr>
-      <w:r>
-        <w:t xml:space="preserve">The validation process begins by defining the security and authorisation properties that the framework is expected to satisfy. These properties include identity validity, threshold correctness, policy compliance, denial of unauthorised requests, and consistency between the authorisation decision and the audit evidence.</w:t>
+        <w:t xml:space="preserve">Figure 12: RO6 planned workflow for formal security assurance and empirical validation</w:t>
       </w:r>
     </w:p>
     <w:p>
@@ -29215,7 +29270,7 @@
         <w:t xml:space="preserve">The HALAH prototype provides the implementation basis for this evaluation. The current system includes separate patient, guardian, doctor, and auditor interfaces. It also records consent creation, guardian approval, token minting, state checks, and data-access events. Current evidence from the prototype is reported in Sections 7.11–7.12.</w:t>
       </w:r>
     </w:p>
-    <w:bookmarkEnd w:id="121"/>
+    <w:bookmarkEnd w:id="124"/>
     <w:bookmarkStart w:id="125" w:name="Xd260b2be908768b418291e3c2c86d2d9077224a"/>
     <w:p>
       <w:pPr>
@@ -29247,61 +29302,6 @@
       </w:r>
       <w:r>
         <w:t xml:space="preserve">correctly implements the intended authorisation model under normal, invalid, and adversarial conditions. Rather than validating the framework only through successful execution cases, the procedure systematically evaluates both positive and negative behaviours and examines whether observed authorisation decisions are consistent with the formally defined security properties. The procedure therefore combines scenario-based empirical testing with property-oriented validation of authorisation correctness, denial behaviour, threshold enforcement, policy and scope compliance, and audit consistency.</w:t>
-      </w:r>
-    </w:p>
-    <w:p>
-      <w:pPr>
-        <w:pStyle w:val="CaptionedFigure"/>
-      </w:pPr>
-      <w:r>
-        <w:drawing>
-          <wp:inline>
-            <wp:extent cx="5753100" cy="7402813"/>
-            <wp:effectExtent b="0" l="0" r="0" t="0"/>
-            <wp:docPr descr="Figure 12: RO6 planned workflow for formal security assurance and empirical validation" title="" id="123" name="Picture"/>
-            <a:graphic>
-              <a:graphicData uri="http://schemas.openxmlformats.org/drawingml/2006/picture">
-                <pic:pic>
-                  <pic:nvPicPr>
-                    <pic:cNvPr descr="media_bw/fig12.png" id="124" name="Picture"/>
-                    <pic:cNvPicPr>
-                      <a:picLocks noChangeArrowheads="1" noChangeAspect="1"/>
-                    </pic:cNvPicPr>
-                  </pic:nvPicPr>
-                  <pic:blipFill>
-                    <a:blip r:embed="rId122"/>
-                    <a:stretch>
-                      <a:fillRect/>
-                    </a:stretch>
-                  </pic:blipFill>
-                  <pic:spPr bwMode="auto">
-                    <a:xfrm>
-                      <a:off x="0" y="0"/>
-                      <a:ext cx="5753100" cy="7402813"/>
-                    </a:xfrm>
-                    <a:prstGeom prst="rect">
-                      <a:avLst/>
-                    </a:prstGeom>
-                    <a:noFill/>
-                    <a:ln w="9525">
-                      <a:noFill/>
-                      <a:headEnd/>
-                      <a:tailEnd/>
-                    </a:ln>
-                  </pic:spPr>
-                </pic:pic>
-              </a:graphicData>
-            </a:graphic>
-          </wp:inline>
-        </w:drawing>
-      </w:r>
-    </w:p>
-    <w:p>
-      <w:pPr>
-        <w:pStyle w:val="ImageCaption"/>
-      </w:pPr>
-      <w:r>
-        <w:t xml:space="preserve">Figure 12: RO6 planned workflow for formal security assurance and empirical validation</w:t>
       </w:r>
     </w:p>
     <w:p>
@@ -38251,14 +38251,14 @@
       <w:r>
         <w:drawing>
           <wp:inline>
-            <wp:extent cx="3886200" cy="7632356"/>
+            <wp:extent cx="3922776" cy="7689606"/>
             <wp:effectExtent b="0" l="0" r="0" t="0"/>
             <wp:docPr descr="Figure 18: HALAH prototype workflow from consent creation to audited access decision" title="" id="155" name="Picture"/>
             <a:graphic>
               <a:graphicData uri="http://schemas.openxmlformats.org/drawingml/2006/picture">
                 <pic:pic>
                   <pic:nvPicPr>
-                    <pic:cNvPr descr="media_bw/fig_halah.png" id="156" name="Picture"/>
+                    <pic:cNvPr descr="media_col/fig_halah.png" id="156" name="Picture"/>
                     <pic:cNvPicPr>
                       <a:picLocks noChangeArrowheads="1" noChangeAspect="1"/>
                     </pic:cNvPicPr>
@@ -38272,7 +38272,7 @@
                   <pic:spPr bwMode="auto">
                     <a:xfrm>
                       <a:off x="0" y="0"/>
-                      <a:ext cx="3886200" cy="7632356"/>
+                      <a:ext cx="3922776" cy="7689606"/>
                     </a:xfrm>
                     <a:prstGeom prst="rect">
                       <a:avLst/>

</xml_diff>